<commit_message>
Date: 08 Feb 2026
</commit_message>
<xml_diff>
--- a/Assignments.docx
+++ b/Assignments.docx
@@ -955,6 +955,67 @@
           <w:lang w:val="en-US"/>
         </w:rPr>
         <w:t>Create Client Class as well</w:t>
+      </w:r>
+    </w:p>
+    <w:p>
+      <w:pPr>
+        <w:rPr>
+          <w:sz w:val="24"/>
+          <w:szCs w:val="24"/>
+          <w:lang w:val="en-US"/>
+        </w:rPr>
+      </w:pPr>
+      <w:r>
+        <w:rPr>
+          <w:sz w:val="24"/>
+          <w:szCs w:val="24"/>
+          <w:lang w:val="en-US"/>
+        </w:rPr>
+        <w:br w:type="page"/>
+      </w:r>
+    </w:p>
+    <w:p>
+      <w:pPr>
+        <w:rPr>
+          <w:b/>
+          <w:bCs/>
+          <w:sz w:val="24"/>
+          <w:szCs w:val="24"/>
+          <w:lang w:val="en-US"/>
+        </w:rPr>
+      </w:pPr>
+      <w:r>
+        <w:rPr>
+          <w:b/>
+          <w:bCs/>
+          <w:sz w:val="24"/>
+          <w:szCs w:val="24"/>
+          <w:lang w:val="en-US"/>
+        </w:rPr>
+        <w:lastRenderedPageBreak/>
+        <w:t>WebDriver Assignments</w:t>
+      </w:r>
+    </w:p>
+    <w:p>
+      <w:pPr>
+        <w:pStyle w:val="ListParagraph"/>
+        <w:numPr>
+          <w:ilvl w:val="0"/>
+          <w:numId w:val="3"/>
+        </w:numPr>
+        <w:rPr>
+          <w:sz w:val="24"/>
+          <w:szCs w:val="24"/>
+          <w:lang w:val="en-US"/>
+        </w:rPr>
+      </w:pPr>
+      <w:r>
+        <w:rPr>
+          <w:sz w:val="24"/>
+          <w:szCs w:val="24"/>
+          <w:lang w:val="en-US"/>
+        </w:rPr>
+        <w:t>Tell the usage and return type of getPageSource()?</w:t>
       </w:r>
       <w:bookmarkStart w:id="0" w:name="_GoBack"/>
       <w:bookmarkEnd w:id="0"/>
@@ -1149,11 +1210,100 @@
       </w:pPr>
     </w:lvl>
   </w:abstractNum>
+  <w:abstractNum w:abstractNumId="2">
+    <w:nsid w:val="5E301873"/>
+    <w:multiLevelType w:val="hybridMultilevel"/>
+    <w:tmpl w:val="38B49D1E"/>
+    <w:lvl w:ilvl="0" w:tplc="4009000F">
+      <w:start w:val="1"/>
+      <w:numFmt w:val="decimal"/>
+      <w:lvlText w:val="%1."/>
+      <w:lvlJc w:val="left"/>
+      <w:pPr>
+        <w:ind w:left="720" w:hanging="360"/>
+      </w:pPr>
+    </w:lvl>
+    <w:lvl w:ilvl="1" w:tplc="40090019" w:tentative="1">
+      <w:start w:val="1"/>
+      <w:numFmt w:val="lowerLetter"/>
+      <w:lvlText w:val="%2."/>
+      <w:lvlJc w:val="left"/>
+      <w:pPr>
+        <w:ind w:left="1440" w:hanging="360"/>
+      </w:pPr>
+    </w:lvl>
+    <w:lvl w:ilvl="2" w:tplc="4009001B" w:tentative="1">
+      <w:start w:val="1"/>
+      <w:numFmt w:val="lowerRoman"/>
+      <w:lvlText w:val="%3."/>
+      <w:lvlJc w:val="right"/>
+      <w:pPr>
+        <w:ind w:left="2160" w:hanging="180"/>
+      </w:pPr>
+    </w:lvl>
+    <w:lvl w:ilvl="3" w:tplc="4009000F" w:tentative="1">
+      <w:start w:val="1"/>
+      <w:numFmt w:val="decimal"/>
+      <w:lvlText w:val="%4."/>
+      <w:lvlJc w:val="left"/>
+      <w:pPr>
+        <w:ind w:left="2880" w:hanging="360"/>
+      </w:pPr>
+    </w:lvl>
+    <w:lvl w:ilvl="4" w:tplc="40090019" w:tentative="1">
+      <w:start w:val="1"/>
+      <w:numFmt w:val="lowerLetter"/>
+      <w:lvlText w:val="%5."/>
+      <w:lvlJc w:val="left"/>
+      <w:pPr>
+        <w:ind w:left="3600" w:hanging="360"/>
+      </w:pPr>
+    </w:lvl>
+    <w:lvl w:ilvl="5" w:tplc="4009001B" w:tentative="1">
+      <w:start w:val="1"/>
+      <w:numFmt w:val="lowerRoman"/>
+      <w:lvlText w:val="%6."/>
+      <w:lvlJc w:val="right"/>
+      <w:pPr>
+        <w:ind w:left="4320" w:hanging="180"/>
+      </w:pPr>
+    </w:lvl>
+    <w:lvl w:ilvl="6" w:tplc="4009000F" w:tentative="1">
+      <w:start w:val="1"/>
+      <w:numFmt w:val="decimal"/>
+      <w:lvlText w:val="%7."/>
+      <w:lvlJc w:val="left"/>
+      <w:pPr>
+        <w:ind w:left="5040" w:hanging="360"/>
+      </w:pPr>
+    </w:lvl>
+    <w:lvl w:ilvl="7" w:tplc="40090019" w:tentative="1">
+      <w:start w:val="1"/>
+      <w:numFmt w:val="lowerLetter"/>
+      <w:lvlText w:val="%8."/>
+      <w:lvlJc w:val="left"/>
+      <w:pPr>
+        <w:ind w:left="5760" w:hanging="360"/>
+      </w:pPr>
+    </w:lvl>
+    <w:lvl w:ilvl="8" w:tplc="4009001B" w:tentative="1">
+      <w:start w:val="1"/>
+      <w:numFmt w:val="lowerRoman"/>
+      <w:lvlText w:val="%9."/>
+      <w:lvlJc w:val="right"/>
+      <w:pPr>
+        <w:ind w:left="6480" w:hanging="180"/>
+      </w:pPr>
+    </w:lvl>
+  </w:abstractNum>
   <w:num w:numId="1">
     <w:abstractNumId w:val="1"/>
   </w:num>
   <w:num w:numId="2">
     <w:abstractNumId w:val="0"/>
+  </w:num>
+  <w:num w:numId="3">
+    <w:abstractNumId w:val="2"/>
   </w:num>
 </w:numbering>
 </file>

</xml_diff>

<commit_message>
Date: 14 Feb 2026
</commit_message>
<xml_diff>
--- a/Assignments.docx
+++ b/Assignments.docx
@@ -1017,8 +1017,554 @@
         </w:rPr>
         <w:t>Tell the usage and return type of getPageSource()?</w:t>
       </w:r>
+    </w:p>
+    <w:p>
+      <w:pPr>
+        <w:pStyle w:val="ListParagraph"/>
+        <w:numPr>
+          <w:ilvl w:val="0"/>
+          <w:numId w:val="3"/>
+        </w:numPr>
+        <w:rPr>
+          <w:sz w:val="24"/>
+          <w:szCs w:val="24"/>
+          <w:lang w:val="en-US"/>
+        </w:rPr>
+      </w:pPr>
+      <w:r>
+        <w:rPr>
+          <w:sz w:val="24"/>
+          <w:szCs w:val="24"/>
+          <w:lang w:val="en-US"/>
+        </w:rPr>
+        <w:t xml:space="preserve">Launch </w:t>
+      </w:r>
+      <w:hyperlink r:id="rId5" w:history="1">
+        <w:r>
+          <w:rPr>
+            <w:rStyle w:val="Hyperlink"/>
+            <w:sz w:val="24"/>
+            <w:szCs w:val="24"/>
+            <w:lang w:val="en-US"/>
+          </w:rPr>
+          <w:t>https://www.echotrak.com/Login.aspx?ReturnUrl=%2f</w:t>
+        </w:r>
+      </w:hyperlink>
+    </w:p>
+    <w:p>
+      <w:pPr>
+        <w:pStyle w:val="ListParagraph"/>
+        <w:numPr>
+          <w:ilvl w:val="1"/>
+          <w:numId w:val="3"/>
+        </w:numPr>
+        <w:rPr>
+          <w:sz w:val="24"/>
+          <w:szCs w:val="24"/>
+          <w:lang w:val="en-US"/>
+        </w:rPr>
+      </w:pPr>
+      <w:r>
+        <w:rPr>
+          <w:sz w:val="24"/>
+          <w:szCs w:val="24"/>
+          <w:lang w:val="en-US"/>
+        </w:rPr>
+        <w:t>Enter user name as your name</w:t>
+      </w:r>
+    </w:p>
+    <w:p>
+      <w:pPr>
+        <w:pStyle w:val="ListParagraph"/>
+        <w:numPr>
+          <w:ilvl w:val="1"/>
+          <w:numId w:val="3"/>
+        </w:numPr>
+        <w:rPr>
+          <w:sz w:val="24"/>
+          <w:szCs w:val="24"/>
+          <w:lang w:val="en-US"/>
+        </w:rPr>
+      </w:pPr>
+      <w:r>
+        <w:rPr>
+          <w:sz w:val="24"/>
+          <w:szCs w:val="24"/>
+          <w:lang w:val="en-US"/>
+        </w:rPr>
+        <w:t>Enter password as yourname@123</w:t>
+      </w:r>
+    </w:p>
+    <w:p>
+      <w:pPr>
+        <w:pStyle w:val="ListParagraph"/>
+        <w:numPr>
+          <w:ilvl w:val="1"/>
+          <w:numId w:val="3"/>
+        </w:numPr>
+        <w:rPr>
+          <w:sz w:val="24"/>
+          <w:szCs w:val="24"/>
+          <w:lang w:val="en-US"/>
+        </w:rPr>
+      </w:pPr>
+      <w:r>
+        <w:rPr>
+          <w:sz w:val="24"/>
+          <w:szCs w:val="24"/>
+          <w:lang w:val="en-US"/>
+        </w:rPr>
+        <w:t>Click on Login button</w:t>
+      </w:r>
+      <w:r>
+        <w:rPr>
+          <w:sz w:val="24"/>
+          <w:szCs w:val="24"/>
+          <w:lang w:val="en-US"/>
+        </w:rPr>
+        <w:br/>
+      </w:r>
+      <w:r>
+        <w:rPr>
+          <w:b/>
+          <w:bCs/>
+          <w:sz w:val="24"/>
+          <w:szCs w:val="24"/>
+          <w:lang w:val="en-US"/>
+        </w:rPr>
+        <w:t>Use Name locator</w:t>
+      </w:r>
+    </w:p>
+    <w:p>
+      <w:pPr>
+        <w:pStyle w:val="ListParagraph"/>
+        <w:numPr>
+          <w:ilvl w:val="0"/>
+          <w:numId w:val="3"/>
+        </w:numPr>
+        <w:rPr>
+          <w:sz w:val="24"/>
+          <w:szCs w:val="24"/>
+          <w:lang w:val="en-US"/>
+        </w:rPr>
+      </w:pPr>
+      <w:r>
+        <w:rPr>
+          <w:sz w:val="24"/>
+          <w:szCs w:val="24"/>
+          <w:lang w:val="en-US"/>
+        </w:rPr>
+        <w:t xml:space="preserve">Launch </w:t>
+      </w:r>
+      <w:hyperlink r:id="rId6" w:history="1">
+        <w:r>
+          <w:rPr>
+            <w:rStyle w:val="Hyperlink"/>
+            <w:sz w:val="24"/>
+            <w:szCs w:val="24"/>
+            <w:lang w:val="en-US"/>
+          </w:rPr>
+          <w:t>https://www.echotrak.com/Login.aspx?ReturnUrl=%2f</w:t>
+        </w:r>
+      </w:hyperlink>
+    </w:p>
+    <w:p>
+      <w:pPr>
+        <w:pStyle w:val="ListParagraph"/>
+        <w:numPr>
+          <w:ilvl w:val="1"/>
+          <w:numId w:val="3"/>
+        </w:numPr>
+        <w:rPr>
+          <w:sz w:val="24"/>
+          <w:szCs w:val="24"/>
+          <w:lang w:val="en-US"/>
+        </w:rPr>
+      </w:pPr>
+      <w:r>
+        <w:rPr>
+          <w:sz w:val="24"/>
+          <w:szCs w:val="24"/>
+          <w:lang w:val="en-US"/>
+        </w:rPr>
+        <w:t>Enter user name as your name</w:t>
+      </w:r>
+    </w:p>
+    <w:p>
+      <w:pPr>
+        <w:pStyle w:val="ListParagraph"/>
+        <w:numPr>
+          <w:ilvl w:val="1"/>
+          <w:numId w:val="3"/>
+        </w:numPr>
+        <w:rPr>
+          <w:sz w:val="24"/>
+          <w:szCs w:val="24"/>
+          <w:lang w:val="en-US"/>
+        </w:rPr>
+      </w:pPr>
+      <w:r>
+        <w:rPr>
+          <w:sz w:val="24"/>
+          <w:szCs w:val="24"/>
+          <w:lang w:val="en-US"/>
+        </w:rPr>
+        <w:t>Enter password as yourname@123</w:t>
+      </w:r>
+    </w:p>
+    <w:p>
+      <w:pPr>
+        <w:pStyle w:val="ListParagraph"/>
+        <w:numPr>
+          <w:ilvl w:val="1"/>
+          <w:numId w:val="3"/>
+        </w:numPr>
+        <w:rPr>
+          <w:sz w:val="24"/>
+          <w:szCs w:val="24"/>
+          <w:lang w:val="en-US"/>
+        </w:rPr>
+      </w:pPr>
+      <w:r>
+        <w:rPr>
+          <w:sz w:val="24"/>
+          <w:szCs w:val="24"/>
+          <w:lang w:val="en-US"/>
+        </w:rPr>
+        <w:t>Click on Login button</w:t>
+      </w:r>
+      <w:r>
+        <w:rPr>
+          <w:sz w:val="24"/>
+          <w:szCs w:val="24"/>
+          <w:lang w:val="en-US"/>
+        </w:rPr>
+        <w:br/>
+      </w:r>
+      <w:r>
+        <w:rPr>
+          <w:b/>
+          <w:bCs/>
+          <w:sz w:val="24"/>
+          <w:szCs w:val="24"/>
+          <w:lang w:val="en-US"/>
+        </w:rPr>
+        <w:t xml:space="preserve">Use </w:t>
+      </w:r>
+      <w:r>
+        <w:rPr>
+          <w:b/>
+          <w:bCs/>
+          <w:sz w:val="24"/>
+          <w:szCs w:val="24"/>
+          <w:lang w:val="en-US"/>
+        </w:rPr>
+        <w:t>id</w:t>
+      </w:r>
+      <w:r>
+        <w:rPr>
+          <w:b/>
+          <w:bCs/>
+          <w:sz w:val="24"/>
+          <w:szCs w:val="24"/>
+          <w:lang w:val="en-US"/>
+        </w:rPr>
+        <w:t xml:space="preserve"> locator</w:t>
+      </w:r>
+    </w:p>
+    <w:p>
+      <w:pPr>
+        <w:pStyle w:val="ListParagraph"/>
+        <w:numPr>
+          <w:ilvl w:val="0"/>
+          <w:numId w:val="3"/>
+        </w:numPr>
+        <w:spacing w:line="256" w:lineRule="auto"/>
+        <w:rPr>
+          <w:sz w:val="24"/>
+          <w:szCs w:val="24"/>
+          <w:highlight w:val="yellow"/>
+          <w:lang w:val="en-US"/>
+        </w:rPr>
+      </w:pPr>
+      <w:r>
+        <w:rPr>
+          <w:sz w:val="24"/>
+          <w:szCs w:val="24"/>
+          <w:highlight w:val="yellow"/>
+          <w:lang w:val="en-US"/>
+        </w:rPr>
+        <w:t xml:space="preserve">Launch </w:t>
+      </w:r>
+      <w:hyperlink r:id="rId7" w:history="1">
+        <w:r>
+          <w:rPr>
+            <w:rStyle w:val="Hyperlink"/>
+            <w:sz w:val="24"/>
+            <w:szCs w:val="24"/>
+            <w:highlight w:val="yellow"/>
+            <w:lang w:val="en-US"/>
+          </w:rPr>
+          <w:t>https://www.echotrak.com/Login.aspx?ReturnUrl=%2f</w:t>
+        </w:r>
+      </w:hyperlink>
+    </w:p>
+    <w:p>
+      <w:pPr>
+        <w:pStyle w:val="ListParagraph"/>
+        <w:numPr>
+          <w:ilvl w:val="1"/>
+          <w:numId w:val="3"/>
+        </w:numPr>
+        <w:spacing w:line="256" w:lineRule="auto"/>
+        <w:rPr>
+          <w:sz w:val="24"/>
+          <w:szCs w:val="24"/>
+          <w:highlight w:val="yellow"/>
+          <w:lang w:val="en-US"/>
+        </w:rPr>
+      </w:pPr>
+      <w:r>
+        <w:rPr>
+          <w:sz w:val="24"/>
+          <w:szCs w:val="24"/>
+          <w:highlight w:val="yellow"/>
+          <w:lang w:val="en-US"/>
+        </w:rPr>
+        <w:t>Enter user name as your name</w:t>
+      </w:r>
+    </w:p>
+    <w:p>
+      <w:pPr>
+        <w:pStyle w:val="ListParagraph"/>
+        <w:numPr>
+          <w:ilvl w:val="1"/>
+          <w:numId w:val="3"/>
+        </w:numPr>
+        <w:spacing w:line="256" w:lineRule="auto"/>
+        <w:rPr>
+          <w:sz w:val="24"/>
+          <w:szCs w:val="24"/>
+          <w:highlight w:val="yellow"/>
+          <w:lang w:val="en-US"/>
+        </w:rPr>
+      </w:pPr>
+      <w:r>
+        <w:rPr>
+          <w:sz w:val="24"/>
+          <w:szCs w:val="24"/>
+          <w:highlight w:val="yellow"/>
+          <w:lang w:val="en-US"/>
+        </w:rPr>
+        <w:t>Enter password as yourname@123</w:t>
+      </w:r>
+    </w:p>
+    <w:p>
+      <w:pPr>
+        <w:pStyle w:val="ListParagraph"/>
+        <w:numPr>
+          <w:ilvl w:val="1"/>
+          <w:numId w:val="3"/>
+        </w:numPr>
+        <w:rPr>
+          <w:sz w:val="24"/>
+          <w:szCs w:val="24"/>
+          <w:lang w:val="en-US"/>
+        </w:rPr>
+      </w:pPr>
+      <w:r>
+        <w:rPr>
+          <w:sz w:val="24"/>
+          <w:szCs w:val="24"/>
+          <w:highlight w:val="yellow"/>
+          <w:lang w:val="en-US"/>
+        </w:rPr>
+        <w:t>Click on Login button</w:t>
+      </w:r>
+      <w:r>
+        <w:rPr>
+          <w:sz w:val="24"/>
+          <w:szCs w:val="24"/>
+          <w:highlight w:val="yellow"/>
+          <w:lang w:val="en-US"/>
+        </w:rPr>
+        <w:br/>
+      </w:r>
+      <w:r>
+        <w:rPr>
+          <w:b/>
+          <w:bCs/>
+          <w:sz w:val="24"/>
+          <w:szCs w:val="24"/>
+          <w:highlight w:val="yellow"/>
+          <w:lang w:val="en-US"/>
+        </w:rPr>
+        <w:t xml:space="preserve">Use </w:t>
+      </w:r>
+      <w:r>
+        <w:rPr>
+          <w:b/>
+          <w:bCs/>
+          <w:sz w:val="24"/>
+          <w:szCs w:val="24"/>
+          <w:highlight w:val="yellow"/>
+          <w:lang w:val="en-US"/>
+        </w:rPr>
+        <w:t>className</w:t>
+      </w:r>
+      <w:r>
+        <w:rPr>
+          <w:b/>
+          <w:bCs/>
+          <w:sz w:val="24"/>
+          <w:szCs w:val="24"/>
+          <w:highlight w:val="yellow"/>
+          <w:lang w:val="en-US"/>
+        </w:rPr>
+        <w:t xml:space="preserve"> locator</w:t>
+      </w:r>
+    </w:p>
+    <w:p>
+      <w:pPr>
+        <w:pStyle w:val="ListParagraph"/>
+        <w:numPr>
+          <w:ilvl w:val="0"/>
+          <w:numId w:val="3"/>
+        </w:numPr>
+        <w:spacing w:line="256" w:lineRule="auto"/>
+        <w:rPr>
+          <w:sz w:val="24"/>
+          <w:szCs w:val="24"/>
+          <w:lang w:val="en-US"/>
+        </w:rPr>
+      </w:pPr>
+      <w:r>
+        <w:rPr>
+          <w:sz w:val="24"/>
+          <w:szCs w:val="24"/>
+          <w:lang w:val="en-US"/>
+        </w:rPr>
+        <w:t xml:space="preserve">Launch </w:t>
+      </w:r>
+      <w:hyperlink r:id="rId8" w:history="1">
+        <w:r>
+          <w:rPr>
+            <w:rStyle w:val="Hyperlink"/>
+            <w:sz w:val="24"/>
+            <w:szCs w:val="24"/>
+            <w:lang w:val="en-US"/>
+          </w:rPr>
+          <w:t>https://www.echotrak.com/Login.aspx?ReturnUrl=%2f</w:t>
+        </w:r>
+      </w:hyperlink>
+    </w:p>
+    <w:p>
+      <w:pPr>
+        <w:pStyle w:val="ListParagraph"/>
+        <w:numPr>
+          <w:ilvl w:val="1"/>
+          <w:numId w:val="3"/>
+        </w:numPr>
+        <w:spacing w:line="256" w:lineRule="auto"/>
+        <w:rPr>
+          <w:sz w:val="24"/>
+          <w:szCs w:val="24"/>
+          <w:lang w:val="en-US"/>
+        </w:rPr>
+      </w:pPr>
+      <w:r>
+        <w:rPr>
+          <w:sz w:val="24"/>
+          <w:szCs w:val="24"/>
+          <w:lang w:val="en-US"/>
+        </w:rPr>
+        <w:t>Enter user name as your name</w:t>
+      </w:r>
+    </w:p>
+    <w:p>
+      <w:pPr>
+        <w:pStyle w:val="ListParagraph"/>
+        <w:numPr>
+          <w:ilvl w:val="1"/>
+          <w:numId w:val="3"/>
+        </w:numPr>
+        <w:spacing w:line="256" w:lineRule="auto"/>
+        <w:rPr>
+          <w:sz w:val="24"/>
+          <w:szCs w:val="24"/>
+          <w:lang w:val="en-US"/>
+        </w:rPr>
+      </w:pPr>
+      <w:r>
+        <w:rPr>
+          <w:sz w:val="24"/>
+          <w:szCs w:val="24"/>
+          <w:lang w:val="en-US"/>
+        </w:rPr>
+        <w:t>Enter password as yourname@123</w:t>
+      </w:r>
+    </w:p>
+    <w:p>
+      <w:pPr>
+        <w:pStyle w:val="ListParagraph"/>
+        <w:numPr>
+          <w:ilvl w:val="1"/>
+          <w:numId w:val="3"/>
+        </w:numPr>
+        <w:rPr>
+          <w:sz w:val="24"/>
+          <w:szCs w:val="24"/>
+          <w:lang w:val="en-US"/>
+        </w:rPr>
+      </w:pPr>
+      <w:r>
+        <w:rPr>
+          <w:sz w:val="24"/>
+          <w:szCs w:val="24"/>
+          <w:lang w:val="en-US"/>
+        </w:rPr>
+        <w:t>Click on Login button</w:t>
+      </w:r>
+      <w:r>
+        <w:rPr>
+          <w:sz w:val="24"/>
+          <w:szCs w:val="24"/>
+          <w:lang w:val="en-US"/>
+        </w:rPr>
+        <w:br/>
+      </w:r>
+      <w:r>
+        <w:rPr>
+          <w:b/>
+          <w:bCs/>
+          <w:sz w:val="24"/>
+          <w:szCs w:val="24"/>
+          <w:lang w:val="en-US"/>
+        </w:rPr>
+        <w:t xml:space="preserve">Use </w:t>
+      </w:r>
+      <w:r>
+        <w:rPr>
+          <w:b/>
+          <w:bCs/>
+          <w:sz w:val="24"/>
+          <w:szCs w:val="24"/>
+          <w:lang w:val="en-US"/>
+        </w:rPr>
+        <w:t>cssSelector</w:t>
+      </w:r>
       <w:bookmarkStart w:id="0" w:name="_GoBack"/>
       <w:bookmarkEnd w:id="0"/>
+      <w:r>
+        <w:rPr>
+          <w:b/>
+          <w:bCs/>
+          <w:sz w:val="24"/>
+          <w:szCs w:val="24"/>
+          <w:lang w:val="en-US"/>
+        </w:rPr>
+        <w:t xml:space="preserve"> locator</w:t>
+      </w:r>
     </w:p>
     <w:sectPr>
       <w:pgSz w:w="11906" w:h="16838"/>
@@ -1223,7 +1769,7 @@
         <w:ind w:left="720" w:hanging="360"/>
       </w:pPr>
     </w:lvl>
-    <w:lvl w:ilvl="1" w:tplc="40090019" w:tentative="1">
+    <w:lvl w:ilvl="1" w:tplc="40090019">
       <w:start w:val="1"/>
       <w:numFmt w:val="lowerLetter"/>
       <w:lvlText w:val="%2."/>
@@ -1304,6 +1850,36 @@
   </w:num>
   <w:num w:numId="3">
     <w:abstractNumId w:val="2"/>
+  </w:num>
+  <w:num w:numId="4">
+    <w:abstractNumId w:val="2"/>
+    <w:lvlOverride w:ilvl="0">
+      <w:startOverride w:val="1"/>
+    </w:lvlOverride>
+    <w:lvlOverride w:ilvl="1">
+      <w:startOverride w:val="1"/>
+    </w:lvlOverride>
+    <w:lvlOverride w:ilvl="2">
+      <w:startOverride w:val="1"/>
+    </w:lvlOverride>
+    <w:lvlOverride w:ilvl="3">
+      <w:startOverride w:val="1"/>
+    </w:lvlOverride>
+    <w:lvlOverride w:ilvl="4">
+      <w:startOverride w:val="1"/>
+    </w:lvlOverride>
+    <w:lvlOverride w:ilvl="5">
+      <w:startOverride w:val="1"/>
+    </w:lvlOverride>
+    <w:lvlOverride w:ilvl="6">
+      <w:startOverride w:val="1"/>
+    </w:lvlOverride>
+    <w:lvlOverride w:ilvl="7">
+      <w:startOverride w:val="1"/>
+    </w:lvlOverride>
+    <w:lvlOverride w:ilvl="8">
+      <w:startOverride w:val="1"/>
+    </w:lvlOverride>
   </w:num>
 </w:numbering>
 </file>
@@ -1742,6 +2318,17 @@
       <w:contextualSpacing/>
     </w:pPr>
   </w:style>
+  <w:style w:type="character" w:styleId="Hyperlink">
+    <w:name w:val="Hyperlink"/>
+    <w:basedOn w:val="DefaultParagraphFont"/>
+    <w:uiPriority w:val="99"/>
+    <w:unhideWhenUsed/>
+    <w:rsid w:val="00BE4EF3"/>
+    <w:rPr>
+      <w:color w:val="0563C1" w:themeColor="hyperlink"/>
+      <w:u w:val="single"/>
+    </w:rPr>
+  </w:style>
 </w:styles>
 </file>
 

</xml_diff>

<commit_message>
Date: 21 Feb 2026
</commit_message>
<xml_diff>
--- a/Assignments.docx
+++ b/Assignments.docx
@@ -1249,27 +1249,7 @@
           <w:szCs w:val="24"/>
           <w:lang w:val="en-US"/>
         </w:rPr>
-        <w:t xml:space="preserve">Use </w:t>
-      </w:r>
-      <w:r>
-        <w:rPr>
-          <w:b/>
-          <w:bCs/>
-          <w:sz w:val="24"/>
-          <w:szCs w:val="24"/>
-          <w:lang w:val="en-US"/>
-        </w:rPr>
-        <w:t>id</w:t>
-      </w:r>
-      <w:r>
-        <w:rPr>
-          <w:b/>
-          <w:bCs/>
-          <w:sz w:val="24"/>
-          <w:szCs w:val="24"/>
-          <w:lang w:val="en-US"/>
-        </w:rPr>
-        <w:t xml:space="preserve"> locator</w:t>
+        <w:t>Use id locator</w:t>
       </w:r>
     </w:p>
     <w:p>
@@ -1399,29 +1379,7 @@
           <w:highlight w:val="yellow"/>
           <w:lang w:val="en-US"/>
         </w:rPr>
-        <w:t xml:space="preserve">Use </w:t>
-      </w:r>
-      <w:r>
-        <w:rPr>
-          <w:b/>
-          <w:bCs/>
-          <w:sz w:val="24"/>
-          <w:szCs w:val="24"/>
-          <w:highlight w:val="yellow"/>
-          <w:lang w:val="en-US"/>
-        </w:rPr>
-        <w:t>className</w:t>
-      </w:r>
-      <w:r>
-        <w:rPr>
-          <w:b/>
-          <w:bCs/>
-          <w:sz w:val="24"/>
-          <w:szCs w:val="24"/>
-          <w:highlight w:val="yellow"/>
-          <w:lang w:val="en-US"/>
-        </w:rPr>
-        <w:t xml:space="preserve"> locator</w:t>
+        <w:t>Use className locator</w:t>
       </w:r>
     </w:p>
     <w:p>
@@ -1541,30 +1499,24 @@
           <w:szCs w:val="24"/>
           <w:lang w:val="en-US"/>
         </w:rPr>
-        <w:t xml:space="preserve">Use </w:t>
-      </w:r>
-      <w:r>
-        <w:rPr>
-          <w:b/>
-          <w:bCs/>
-          <w:sz w:val="24"/>
-          <w:szCs w:val="24"/>
-          <w:lang w:val="en-US"/>
-        </w:rPr>
-        <w:t>cssSelector</w:t>
-      </w:r>
+        <w:t>Use cssSelector locator</w:t>
+      </w:r>
+    </w:p>
+    <w:p>
+      <w:pPr>
+        <w:pStyle w:val="ListParagraph"/>
+        <w:numPr>
+          <w:ilvl w:val="0"/>
+          <w:numId w:val="3"/>
+        </w:numPr>
+        <w:rPr>
+          <w:sz w:val="24"/>
+          <w:szCs w:val="24"/>
+          <w:lang w:val="en-US"/>
+        </w:rPr>
+      </w:pPr>
       <w:bookmarkStart w:id="0" w:name="_GoBack"/>
       <w:bookmarkEnd w:id="0"/>
-      <w:r>
-        <w:rPr>
-          <w:b/>
-          <w:bCs/>
-          <w:sz w:val="24"/>
-          <w:szCs w:val="24"/>
-          <w:lang w:val="en-US"/>
-        </w:rPr>
-        <w:t xml:space="preserve"> locator</w:t>
-      </w:r>
     </w:p>
     <w:sectPr>
       <w:pgSz w:w="11906" w:h="16838"/>

</xml_diff>

<commit_message>
Date: 22 Feb 2026
</commit_message>
<xml_diff>
--- a/Assignments.docx
+++ b/Assignments.docx
@@ -174,13 +174,23 @@
           <w:lang w:val="en-US"/>
         </w:rPr>
       </w:pPr>
-      <w:r>
-        <w:rPr>
-          <w:sz w:val="24"/>
-          <w:szCs w:val="24"/>
-          <w:lang w:val="en-US"/>
-        </w:rPr>
-        <w:t xml:space="preserve">hra </w:t>
+      <w:proofErr w:type="spellStart"/>
+      <w:r>
+        <w:rPr>
+          <w:sz w:val="24"/>
+          <w:szCs w:val="24"/>
+          <w:lang w:val="en-US"/>
+        </w:rPr>
+        <w:t>hra</w:t>
+      </w:r>
+      <w:proofErr w:type="spellEnd"/>
+      <w:r>
+        <w:rPr>
+          <w:sz w:val="24"/>
+          <w:szCs w:val="24"/>
+          <w:lang w:val="en-US"/>
+        </w:rPr>
+        <w:t xml:space="preserve"> </w:t>
       </w:r>
       <w:r>
         <w:rPr>
@@ -212,13 +222,23 @@
           <w:lang w:val="en-US"/>
         </w:rPr>
       </w:pPr>
-      <w:r>
-        <w:rPr>
-          <w:sz w:val="24"/>
-          <w:szCs w:val="24"/>
-          <w:lang w:val="en-US"/>
-        </w:rPr>
-        <w:t xml:space="preserve">pf </w:t>
+      <w:proofErr w:type="spellStart"/>
+      <w:r>
+        <w:rPr>
+          <w:sz w:val="24"/>
+          <w:szCs w:val="24"/>
+          <w:lang w:val="en-US"/>
+        </w:rPr>
+        <w:t>pf</w:t>
+      </w:r>
+      <w:proofErr w:type="spellEnd"/>
+      <w:r>
+        <w:rPr>
+          <w:sz w:val="24"/>
+          <w:szCs w:val="24"/>
+          <w:lang w:val="en-US"/>
+        </w:rPr>
+        <w:t xml:space="preserve"> </w:t>
       </w:r>
       <w:r>
         <w:rPr>
@@ -256,8 +276,18 @@
           <w:szCs w:val="24"/>
           <w:lang w:val="en-US"/>
         </w:rPr>
-        <w:t>gross = basic salary + da + hra</w:t>
-      </w:r>
+        <w:t xml:space="preserve">gross = basic salary + da + </w:t>
+      </w:r>
+      <w:proofErr w:type="spellStart"/>
+      <w:r>
+        <w:rPr>
+          <w:sz w:val="24"/>
+          <w:szCs w:val="24"/>
+          <w:lang w:val="en-US"/>
+        </w:rPr>
+        <w:t>hra</w:t>
+      </w:r>
+      <w:proofErr w:type="spellEnd"/>
     </w:p>
     <w:p>
       <w:pPr>
@@ -278,8 +308,18 @@
           <w:szCs w:val="24"/>
           <w:lang w:val="en-US"/>
         </w:rPr>
-        <w:t>net = gross – pf</w:t>
-      </w:r>
+        <w:t xml:space="preserve">net = gross – </w:t>
+      </w:r>
+      <w:proofErr w:type="spellStart"/>
+      <w:r>
+        <w:rPr>
+          <w:sz w:val="24"/>
+          <w:szCs w:val="24"/>
+          <w:lang w:val="en-US"/>
+        </w:rPr>
+        <w:t>pf</w:t>
+      </w:r>
+      <w:proofErr w:type="spellEnd"/>
     </w:p>
     <w:p>
       <w:pPr>
@@ -412,7 +452,25 @@
           <w:szCs w:val="24"/>
           <w:lang w:val="en-US"/>
         </w:rPr>
-        <w:t>Accept age from user and show the message as "You are valid for voting" if age is grater than or equal to 18 otherwise display the message as "You are not valid for voting"</w:t>
+        <w:t xml:space="preserve">Accept age from user and show the message as "You are valid for voting" if age is </w:t>
+      </w:r>
+      <w:proofErr w:type="spellStart"/>
+      <w:r>
+        <w:rPr>
+          <w:sz w:val="24"/>
+          <w:szCs w:val="24"/>
+          <w:lang w:val="en-US"/>
+        </w:rPr>
+        <w:t>grater</w:t>
+      </w:r>
+      <w:proofErr w:type="spellEnd"/>
+      <w:r>
+        <w:rPr>
+          <w:sz w:val="24"/>
+          <w:szCs w:val="24"/>
+          <w:lang w:val="en-US"/>
+        </w:rPr>
+        <w:t xml:space="preserve"> than or equal to 18 otherwise display the message as "You are not valid for voting"</w:t>
       </w:r>
     </w:p>
     <w:p>
@@ -516,8 +574,17 @@
           <w:lang w:val="en-US"/>
         </w:rPr>
         <w:tab/>
+      </w:r>
+      <w:proofErr w:type="spellStart"/>
+      <w:r>
+        <w:rPr>
+          <w:sz w:val="24"/>
+          <w:szCs w:val="24"/>
+          <w:lang w:val="en-US"/>
+        </w:rPr>
         <w:t>Dist</w:t>
       </w:r>
+      <w:proofErr w:type="spellEnd"/>
       <w:r>
         <w:rPr>
           <w:sz w:val="24"/>
@@ -772,6 +839,7 @@
           <w:lang w:val="en-US"/>
         </w:rPr>
       </w:pPr>
+      <w:proofErr w:type="spellStart"/>
       <w:r>
         <w:rPr>
           <w:sz w:val="24"/>
@@ -780,6 +848,7 @@
         </w:rPr>
         <w:t>empId</w:t>
       </w:r>
+      <w:proofErr w:type="spellEnd"/>
     </w:p>
     <w:p>
       <w:pPr>
@@ -794,6 +863,7 @@
           <w:lang w:val="en-US"/>
         </w:rPr>
       </w:pPr>
+      <w:proofErr w:type="spellStart"/>
       <w:r>
         <w:rPr>
           <w:sz w:val="24"/>
@@ -802,6 +872,7 @@
         </w:rPr>
         <w:t>empName</w:t>
       </w:r>
+      <w:proofErr w:type="spellEnd"/>
     </w:p>
     <w:p>
       <w:pPr>
@@ -816,6 +887,7 @@
           <w:lang w:val="en-US"/>
         </w:rPr>
       </w:pPr>
+      <w:proofErr w:type="spellStart"/>
       <w:r>
         <w:rPr>
           <w:sz w:val="24"/>
@@ -824,6 +896,7 @@
         </w:rPr>
         <w:t>basicSalary</w:t>
       </w:r>
+      <w:proofErr w:type="spellEnd"/>
     </w:p>
     <w:p>
       <w:pPr>
@@ -860,6 +933,7 @@
           <w:lang w:val="en-US"/>
         </w:rPr>
       </w:pPr>
+      <w:proofErr w:type="spellStart"/>
       <w:r>
         <w:rPr>
           <w:sz w:val="24"/>
@@ -868,6 +942,7 @@
         </w:rPr>
         <w:t>dept</w:t>
       </w:r>
+      <w:proofErr w:type="spellEnd"/>
     </w:p>
     <w:p>
       <w:pPr>
@@ -904,13 +979,23 @@
           <w:lang w:val="en-US"/>
         </w:rPr>
       </w:pPr>
-      <w:r>
-        <w:rPr>
-          <w:sz w:val="24"/>
-          <w:szCs w:val="24"/>
-          <w:lang w:val="en-US"/>
-        </w:rPr>
-        <w:t>displayData()</w:t>
+      <w:proofErr w:type="spellStart"/>
+      <w:r>
+        <w:rPr>
+          <w:sz w:val="24"/>
+          <w:szCs w:val="24"/>
+          <w:lang w:val="en-US"/>
+        </w:rPr>
+        <w:t>displayData</w:t>
+      </w:r>
+      <w:proofErr w:type="spellEnd"/>
+      <w:r>
+        <w:rPr>
+          <w:sz w:val="24"/>
+          <w:szCs w:val="24"/>
+          <w:lang w:val="en-US"/>
+        </w:rPr>
+        <w:t>()</w:t>
       </w:r>
     </w:p>
     <w:p>
@@ -926,13 +1011,23 @@
           <w:lang w:val="en-US"/>
         </w:rPr>
       </w:pPr>
-      <w:r>
-        <w:rPr>
-          <w:sz w:val="24"/>
-          <w:szCs w:val="24"/>
-          <w:lang w:val="en-US"/>
-        </w:rPr>
-        <w:t>calculateSalary() (Should return the Net salary using technique used in assignment no 4)</w:t>
+      <w:proofErr w:type="spellStart"/>
+      <w:r>
+        <w:rPr>
+          <w:sz w:val="24"/>
+          <w:szCs w:val="24"/>
+          <w:lang w:val="en-US"/>
+        </w:rPr>
+        <w:t>calculateSalary</w:t>
+      </w:r>
+      <w:proofErr w:type="spellEnd"/>
+      <w:r>
+        <w:rPr>
+          <w:sz w:val="24"/>
+          <w:szCs w:val="24"/>
+          <w:lang w:val="en-US"/>
+        </w:rPr>
+        <w:t>() (Should return the Net salary using technique used in assignment no 4)</w:t>
       </w:r>
     </w:p>
     <w:p>
@@ -1015,7 +1110,25 @@
           <w:szCs w:val="24"/>
           <w:lang w:val="en-US"/>
         </w:rPr>
-        <w:t>Tell the usage and return type of getPageSource()?</w:t>
+        <w:t xml:space="preserve">Tell the usage and return type of </w:t>
+      </w:r>
+      <w:proofErr w:type="gramStart"/>
+      <w:r>
+        <w:rPr>
+          <w:sz w:val="24"/>
+          <w:szCs w:val="24"/>
+          <w:lang w:val="en-US"/>
+        </w:rPr>
+        <w:t>getPageSource(</w:t>
+      </w:r>
+      <w:proofErr w:type="gramEnd"/>
+      <w:r>
+        <w:rPr>
+          <w:sz w:val="24"/>
+          <w:szCs w:val="24"/>
+          <w:lang w:val="en-US"/>
+        </w:rPr>
+        <w:t>)?</w:t>
       </w:r>
     </w:p>
     <w:p>
@@ -1500,6 +1613,519 @@
           <w:lang w:val="en-US"/>
         </w:rPr>
         <w:t>Use cssSelector locator</w:t>
+      </w:r>
+    </w:p>
+    <w:p>
+      <w:pPr>
+        <w:pStyle w:val="ListParagraph"/>
+        <w:numPr>
+          <w:ilvl w:val="0"/>
+          <w:numId w:val="3"/>
+        </w:numPr>
+        <w:rPr>
+          <w:sz w:val="24"/>
+          <w:szCs w:val="24"/>
+          <w:lang w:val="en-US"/>
+        </w:rPr>
+      </w:pPr>
+      <w:r>
+        <w:rPr>
+          <w:sz w:val="24"/>
+          <w:szCs w:val="24"/>
+          <w:lang w:val="en-US"/>
+        </w:rPr>
+        <w:t xml:space="preserve">Launch </w:t>
+      </w:r>
+      <w:hyperlink r:id="rId9" w:history="1">
+        <w:r>
+          <w:rPr>
+            <w:rStyle w:val="Hyperlink"/>
+            <w:sz w:val="24"/>
+            <w:szCs w:val="24"/>
+            <w:lang w:val="en-US"/>
+          </w:rPr>
+          <w:t>https://register.rediff.com/register/register.php?FormName=user_details</w:t>
+        </w:r>
+      </w:hyperlink>
+    </w:p>
+    <w:p>
+      <w:pPr>
+        <w:pStyle w:val="ListParagraph"/>
+        <w:numPr>
+          <w:ilvl w:val="1"/>
+          <w:numId w:val="3"/>
+        </w:numPr>
+        <w:rPr>
+          <w:sz w:val="24"/>
+          <w:szCs w:val="24"/>
+          <w:lang w:val="en-US"/>
+        </w:rPr>
+      </w:pPr>
+      <w:r>
+        <w:rPr>
+          <w:sz w:val="24"/>
+          <w:szCs w:val="24"/>
+          <w:lang w:val="en-US"/>
+        </w:rPr>
+        <w:t>Enter full name</w:t>
+      </w:r>
+    </w:p>
+    <w:p>
+      <w:pPr>
+        <w:pStyle w:val="ListParagraph"/>
+        <w:numPr>
+          <w:ilvl w:val="1"/>
+          <w:numId w:val="3"/>
+        </w:numPr>
+        <w:rPr>
+          <w:sz w:val="24"/>
+          <w:szCs w:val="24"/>
+          <w:lang w:val="en-US"/>
+        </w:rPr>
+      </w:pPr>
+      <w:r>
+        <w:rPr>
+          <w:sz w:val="24"/>
+          <w:szCs w:val="24"/>
+          <w:lang w:val="en-US"/>
+        </w:rPr>
+        <w:t>Enter Rediff id</w:t>
+      </w:r>
+    </w:p>
+    <w:p>
+      <w:pPr>
+        <w:pStyle w:val="ListParagraph"/>
+        <w:numPr>
+          <w:ilvl w:val="1"/>
+          <w:numId w:val="3"/>
+        </w:numPr>
+        <w:rPr>
+          <w:sz w:val="24"/>
+          <w:szCs w:val="24"/>
+          <w:lang w:val="en-US"/>
+        </w:rPr>
+      </w:pPr>
+      <w:r>
+        <w:rPr>
+          <w:sz w:val="24"/>
+          <w:szCs w:val="24"/>
+          <w:lang w:val="en-US"/>
+        </w:rPr>
+        <w:t>Enter password</w:t>
+      </w:r>
+    </w:p>
+    <w:p>
+      <w:pPr>
+        <w:pStyle w:val="ListParagraph"/>
+        <w:numPr>
+          <w:ilvl w:val="1"/>
+          <w:numId w:val="3"/>
+        </w:numPr>
+        <w:rPr>
+          <w:sz w:val="24"/>
+          <w:szCs w:val="24"/>
+          <w:lang w:val="en-US"/>
+        </w:rPr>
+      </w:pPr>
+      <w:r>
+        <w:rPr>
+          <w:sz w:val="24"/>
+          <w:szCs w:val="24"/>
+          <w:lang w:val="en-US"/>
+        </w:rPr>
+        <w:t>Enter retype password</w:t>
+      </w:r>
+    </w:p>
+    <w:p>
+      <w:pPr>
+        <w:pStyle w:val="ListParagraph"/>
+        <w:numPr>
+          <w:ilvl w:val="1"/>
+          <w:numId w:val="3"/>
+        </w:numPr>
+        <w:rPr>
+          <w:sz w:val="24"/>
+          <w:szCs w:val="24"/>
+          <w:lang w:val="en-US"/>
+        </w:rPr>
+      </w:pPr>
+      <w:r>
+        <w:rPr>
+          <w:sz w:val="24"/>
+          <w:szCs w:val="24"/>
+          <w:lang w:val="en-US"/>
+        </w:rPr>
+        <w:t>Enter recovery email id</w:t>
+      </w:r>
+    </w:p>
+    <w:p>
+      <w:pPr>
+        <w:pStyle w:val="ListParagraph"/>
+        <w:numPr>
+          <w:ilvl w:val="1"/>
+          <w:numId w:val="3"/>
+        </w:numPr>
+        <w:rPr>
+          <w:sz w:val="24"/>
+          <w:szCs w:val="24"/>
+          <w:lang w:val="en-US"/>
+        </w:rPr>
+      </w:pPr>
+      <w:r>
+        <w:rPr>
+          <w:sz w:val="24"/>
+          <w:szCs w:val="24"/>
+          <w:lang w:val="en-US"/>
+        </w:rPr>
+        <w:t>Enter mobile number</w:t>
+      </w:r>
+      <w:r>
+        <w:rPr>
+          <w:sz w:val="24"/>
+          <w:szCs w:val="24"/>
+          <w:lang w:val="en-US"/>
+        </w:rPr>
+        <w:br/>
+      </w:r>
+      <w:r>
+        <w:rPr>
+          <w:b/>
+          <w:bCs/>
+          <w:sz w:val="24"/>
+          <w:szCs w:val="24"/>
+          <w:lang w:val="en-US"/>
+        </w:rPr>
+        <w:t>use Absolute XPath</w:t>
+      </w:r>
+    </w:p>
+    <w:p>
+      <w:pPr>
+        <w:pStyle w:val="ListParagraph"/>
+        <w:numPr>
+          <w:ilvl w:val="0"/>
+          <w:numId w:val="3"/>
+        </w:numPr>
+        <w:rPr>
+          <w:sz w:val="24"/>
+          <w:szCs w:val="24"/>
+          <w:lang w:val="en-US"/>
+        </w:rPr>
+      </w:pPr>
+      <w:r>
+        <w:rPr>
+          <w:sz w:val="24"/>
+          <w:szCs w:val="24"/>
+          <w:lang w:val="en-US"/>
+        </w:rPr>
+        <w:t xml:space="preserve">Launch </w:t>
+      </w:r>
+      <w:hyperlink r:id="rId10" w:history="1">
+        <w:r>
+          <w:rPr>
+            <w:rStyle w:val="Hyperlink"/>
+            <w:sz w:val="24"/>
+            <w:szCs w:val="24"/>
+            <w:lang w:val="en-US"/>
+          </w:rPr>
+          <w:t>https://register.rediff.com/register/register.php?FormName=user_details</w:t>
+        </w:r>
+      </w:hyperlink>
+    </w:p>
+    <w:p>
+      <w:pPr>
+        <w:pStyle w:val="ListParagraph"/>
+        <w:numPr>
+          <w:ilvl w:val="1"/>
+          <w:numId w:val="3"/>
+        </w:numPr>
+        <w:rPr>
+          <w:sz w:val="24"/>
+          <w:szCs w:val="24"/>
+          <w:lang w:val="en-US"/>
+        </w:rPr>
+      </w:pPr>
+      <w:r>
+        <w:rPr>
+          <w:sz w:val="24"/>
+          <w:szCs w:val="24"/>
+          <w:lang w:val="en-US"/>
+        </w:rPr>
+        <w:t>Enter full name</w:t>
+      </w:r>
+    </w:p>
+    <w:p>
+      <w:pPr>
+        <w:pStyle w:val="ListParagraph"/>
+        <w:numPr>
+          <w:ilvl w:val="1"/>
+          <w:numId w:val="3"/>
+        </w:numPr>
+        <w:rPr>
+          <w:sz w:val="24"/>
+          <w:szCs w:val="24"/>
+          <w:lang w:val="en-US"/>
+        </w:rPr>
+      </w:pPr>
+      <w:r>
+        <w:rPr>
+          <w:sz w:val="24"/>
+          <w:szCs w:val="24"/>
+          <w:lang w:val="en-US"/>
+        </w:rPr>
+        <w:t>Enter Rediff id</w:t>
+      </w:r>
+    </w:p>
+    <w:p>
+      <w:pPr>
+        <w:pStyle w:val="ListParagraph"/>
+        <w:numPr>
+          <w:ilvl w:val="1"/>
+          <w:numId w:val="3"/>
+        </w:numPr>
+        <w:rPr>
+          <w:sz w:val="24"/>
+          <w:szCs w:val="24"/>
+          <w:lang w:val="en-US"/>
+        </w:rPr>
+      </w:pPr>
+      <w:r>
+        <w:rPr>
+          <w:sz w:val="24"/>
+          <w:szCs w:val="24"/>
+          <w:lang w:val="en-US"/>
+        </w:rPr>
+        <w:t>Enter password</w:t>
+      </w:r>
+    </w:p>
+    <w:p>
+      <w:pPr>
+        <w:pStyle w:val="ListParagraph"/>
+        <w:numPr>
+          <w:ilvl w:val="1"/>
+          <w:numId w:val="3"/>
+        </w:numPr>
+        <w:rPr>
+          <w:sz w:val="24"/>
+          <w:szCs w:val="24"/>
+          <w:lang w:val="en-US"/>
+        </w:rPr>
+      </w:pPr>
+      <w:r>
+        <w:rPr>
+          <w:sz w:val="24"/>
+          <w:szCs w:val="24"/>
+          <w:lang w:val="en-US"/>
+        </w:rPr>
+        <w:t>Enter retype password</w:t>
+      </w:r>
+    </w:p>
+    <w:p>
+      <w:pPr>
+        <w:pStyle w:val="ListParagraph"/>
+        <w:numPr>
+          <w:ilvl w:val="1"/>
+          <w:numId w:val="3"/>
+        </w:numPr>
+        <w:rPr>
+          <w:sz w:val="24"/>
+          <w:szCs w:val="24"/>
+          <w:lang w:val="en-US"/>
+        </w:rPr>
+      </w:pPr>
+      <w:r>
+        <w:rPr>
+          <w:sz w:val="24"/>
+          <w:szCs w:val="24"/>
+          <w:lang w:val="en-US"/>
+        </w:rPr>
+        <w:t>Enter recovery email id</w:t>
+      </w:r>
+    </w:p>
+    <w:p>
+      <w:pPr>
+        <w:pStyle w:val="ListParagraph"/>
+        <w:numPr>
+          <w:ilvl w:val="1"/>
+          <w:numId w:val="3"/>
+        </w:numPr>
+        <w:rPr>
+          <w:sz w:val="24"/>
+          <w:szCs w:val="24"/>
+          <w:lang w:val="en-US"/>
+        </w:rPr>
+      </w:pPr>
+      <w:r>
+        <w:rPr>
+          <w:sz w:val="24"/>
+          <w:szCs w:val="24"/>
+          <w:lang w:val="en-US"/>
+        </w:rPr>
+        <w:t>Enter mobile number</w:t>
+      </w:r>
+      <w:r>
+        <w:rPr>
+          <w:sz w:val="24"/>
+          <w:szCs w:val="24"/>
+          <w:lang w:val="en-US"/>
+        </w:rPr>
+        <w:br/>
+      </w:r>
+      <w:r>
+        <w:rPr>
+          <w:b/>
+          <w:bCs/>
+          <w:sz w:val="24"/>
+          <w:szCs w:val="24"/>
+          <w:lang w:val="en-US"/>
+        </w:rPr>
+        <w:t xml:space="preserve">use </w:t>
+      </w:r>
+      <w:r>
+        <w:rPr>
+          <w:b/>
+          <w:bCs/>
+          <w:sz w:val="24"/>
+          <w:szCs w:val="24"/>
+          <w:lang w:val="en-US"/>
+        </w:rPr>
+        <w:t>CssSelector Special characters</w:t>
+      </w:r>
+    </w:p>
+    <w:p>
+      <w:pPr>
+        <w:pStyle w:val="ListParagraph"/>
+        <w:numPr>
+          <w:ilvl w:val="0"/>
+          <w:numId w:val="3"/>
+        </w:numPr>
+        <w:rPr>
+          <w:sz w:val="24"/>
+          <w:szCs w:val="24"/>
+          <w:lang w:val="en-US"/>
+        </w:rPr>
+      </w:pPr>
+      <w:r>
+        <w:rPr>
+          <w:sz w:val="24"/>
+          <w:szCs w:val="24"/>
+          <w:lang w:val="en-US"/>
+        </w:rPr>
+        <w:t xml:space="preserve">Launch </w:t>
+      </w:r>
+      <w:hyperlink r:id="rId11" w:history="1">
+        <w:r>
+          <w:rPr>
+            <w:rStyle w:val="Hyperlink"/>
+            <w:sz w:val="24"/>
+            <w:szCs w:val="24"/>
+            <w:lang w:val="en-US"/>
+          </w:rPr>
+          <w:t>https://www.echotrak.com/Login.aspx?ReturnUrl=%2f</w:t>
+        </w:r>
+      </w:hyperlink>
+    </w:p>
+    <w:p>
+      <w:pPr>
+        <w:pStyle w:val="ListParagraph"/>
+        <w:numPr>
+          <w:ilvl w:val="1"/>
+          <w:numId w:val="3"/>
+        </w:numPr>
+        <w:rPr>
+          <w:sz w:val="24"/>
+          <w:szCs w:val="24"/>
+          <w:lang w:val="en-US"/>
+        </w:rPr>
+      </w:pPr>
+      <w:r>
+        <w:rPr>
+          <w:sz w:val="24"/>
+          <w:szCs w:val="24"/>
+          <w:lang w:val="en-US"/>
+        </w:rPr>
+        <w:t>Enter user name as your name</w:t>
+      </w:r>
+    </w:p>
+    <w:p>
+      <w:pPr>
+        <w:pStyle w:val="ListParagraph"/>
+        <w:numPr>
+          <w:ilvl w:val="1"/>
+          <w:numId w:val="3"/>
+        </w:numPr>
+        <w:rPr>
+          <w:sz w:val="24"/>
+          <w:szCs w:val="24"/>
+          <w:lang w:val="en-US"/>
+        </w:rPr>
+      </w:pPr>
+      <w:r>
+        <w:rPr>
+          <w:sz w:val="24"/>
+          <w:szCs w:val="24"/>
+          <w:lang w:val="en-US"/>
+        </w:rPr>
+        <w:t>Enter password as yourname@123</w:t>
+      </w:r>
+    </w:p>
+    <w:p>
+      <w:pPr>
+        <w:pStyle w:val="ListParagraph"/>
+        <w:numPr>
+          <w:ilvl w:val="1"/>
+          <w:numId w:val="3"/>
+        </w:numPr>
+        <w:rPr>
+          <w:sz w:val="24"/>
+          <w:szCs w:val="24"/>
+          <w:lang w:val="en-US"/>
+        </w:rPr>
+      </w:pPr>
+      <w:r>
+        <w:rPr>
+          <w:sz w:val="24"/>
+          <w:szCs w:val="24"/>
+          <w:lang w:val="en-US"/>
+        </w:rPr>
+        <w:t>Click on Login button</w:t>
+      </w:r>
+      <w:r>
+        <w:rPr>
+          <w:sz w:val="24"/>
+          <w:szCs w:val="24"/>
+          <w:lang w:val="en-US"/>
+        </w:rPr>
+        <w:br/>
+      </w:r>
+      <w:r>
+        <w:rPr>
+          <w:b/>
+          <w:bCs/>
+          <w:sz w:val="24"/>
+          <w:szCs w:val="24"/>
+          <w:lang w:val="en-US"/>
+        </w:rPr>
+        <w:t xml:space="preserve">Use </w:t>
+      </w:r>
+      <w:r>
+        <w:rPr>
+          <w:b/>
+          <w:bCs/>
+          <w:sz w:val="24"/>
+          <w:szCs w:val="24"/>
+          <w:lang w:val="en-US"/>
+        </w:rPr>
+        <w:t>Relative XPath</w:t>
+      </w:r>
+      <w:r>
+        <w:rPr>
+          <w:b/>
+          <w:bCs/>
+          <w:sz w:val="24"/>
+          <w:szCs w:val="24"/>
+          <w:lang w:val="en-US"/>
+        </w:rPr>
+        <w:t xml:space="preserve"> locator</w:t>
       </w:r>
     </w:p>
     <w:p>

</xml_diff>

<commit_message>
Date: 28 Feb 2026
</commit_message>
<xml_diff>
--- a/Assignments.docx
+++ b/Assignments.docx
@@ -1978,17 +1978,7 @@
           <w:szCs w:val="24"/>
           <w:lang w:val="en-US"/>
         </w:rPr>
-        <w:t xml:space="preserve">use </w:t>
-      </w:r>
-      <w:r>
-        <w:rPr>
-          <w:b/>
-          <w:bCs/>
-          <w:sz w:val="24"/>
-          <w:szCs w:val="24"/>
-          <w:lang w:val="en-US"/>
-        </w:rPr>
-        <w:t>CssSelector Special characters</w:t>
+        <w:t>use CssSelector Special characters</w:t>
       </w:r>
     </w:p>
     <w:p>
@@ -2105,27 +2095,566 @@
           <w:szCs w:val="24"/>
           <w:lang w:val="en-US"/>
         </w:rPr>
-        <w:t xml:space="preserve">Use </w:t>
-      </w:r>
-      <w:r>
-        <w:rPr>
-          <w:b/>
-          <w:bCs/>
-          <w:sz w:val="24"/>
-          <w:szCs w:val="24"/>
-          <w:lang w:val="en-US"/>
-        </w:rPr>
-        <w:t>Relative XPath</w:t>
-      </w:r>
-      <w:r>
-        <w:rPr>
-          <w:b/>
-          <w:bCs/>
-          <w:sz w:val="24"/>
-          <w:szCs w:val="24"/>
-          <w:lang w:val="en-US"/>
-        </w:rPr>
-        <w:t xml:space="preserve"> locator</w:t>
+        <w:t>Use Relative XPath locator</w:t>
+      </w:r>
+    </w:p>
+    <w:p>
+      <w:pPr>
+        <w:pStyle w:val="ListParagraph"/>
+        <w:numPr>
+          <w:ilvl w:val="0"/>
+          <w:numId w:val="3"/>
+        </w:numPr>
+        <w:rPr>
+          <w:sz w:val="24"/>
+          <w:szCs w:val="24"/>
+          <w:highlight w:val="yellow"/>
+          <w:lang w:val="en-US"/>
+        </w:rPr>
+      </w:pPr>
+      <w:r>
+        <w:rPr>
+          <w:sz w:val="24"/>
+          <w:szCs w:val="24"/>
+          <w:highlight w:val="yellow"/>
+          <w:lang w:val="en-US"/>
+        </w:rPr>
+        <w:lastRenderedPageBreak/>
+        <w:t xml:space="preserve">Open </w:t>
+      </w:r>
+      <w:hyperlink r:id="rId12" w:history="1">
+        <w:r>
+          <w:rPr>
+            <w:rStyle w:val="Hyperlink"/>
+            <w:sz w:val="24"/>
+            <w:szCs w:val="24"/>
+            <w:highlight w:val="yellow"/>
+            <w:lang w:val="en-US"/>
+          </w:rPr>
+          <w:t>https://echoecho.com/htmlforms09.htm</w:t>
+        </w:r>
+      </w:hyperlink>
+    </w:p>
+    <w:p>
+      <w:pPr>
+        <w:pStyle w:val="ListParagraph"/>
+        <w:numPr>
+          <w:ilvl w:val="1"/>
+          <w:numId w:val="3"/>
+        </w:numPr>
+        <w:rPr>
+          <w:sz w:val="24"/>
+          <w:szCs w:val="24"/>
+          <w:highlight w:val="yellow"/>
+          <w:lang w:val="en-US"/>
+        </w:rPr>
+      </w:pPr>
+      <w:r>
+        <w:rPr>
+          <w:sz w:val="24"/>
+          <w:szCs w:val="24"/>
+          <w:highlight w:val="yellow"/>
+          <w:lang w:val="en-US"/>
+        </w:rPr>
+        <w:t>Display status of all 3 check boxes (selected, enabled and visible)</w:t>
+      </w:r>
+    </w:p>
+    <w:p>
+      <w:pPr>
+        <w:pStyle w:val="ListParagraph"/>
+        <w:numPr>
+          <w:ilvl w:val="1"/>
+          <w:numId w:val="3"/>
+        </w:numPr>
+        <w:rPr>
+          <w:sz w:val="24"/>
+          <w:szCs w:val="24"/>
+          <w:highlight w:val="yellow"/>
+          <w:lang w:val="en-US"/>
+        </w:rPr>
+      </w:pPr>
+      <w:r>
+        <w:rPr>
+          <w:sz w:val="24"/>
+          <w:szCs w:val="24"/>
+          <w:highlight w:val="yellow"/>
+          <w:lang w:val="en-US"/>
+        </w:rPr>
+        <w:t>Select those check boxes those are not selected</w:t>
+      </w:r>
+    </w:p>
+    <w:p>
+      <w:pPr>
+        <w:pStyle w:val="ListParagraph"/>
+        <w:numPr>
+          <w:ilvl w:val="1"/>
+          <w:numId w:val="3"/>
+        </w:numPr>
+        <w:rPr>
+          <w:sz w:val="24"/>
+          <w:szCs w:val="24"/>
+          <w:highlight w:val="yellow"/>
+          <w:lang w:val="en-US"/>
+        </w:rPr>
+      </w:pPr>
+      <w:r>
+        <w:rPr>
+          <w:sz w:val="24"/>
+          <w:szCs w:val="24"/>
+          <w:highlight w:val="yellow"/>
+          <w:lang w:val="en-US"/>
+        </w:rPr>
+        <w:t>Display status of all 3 check boxes (selected, enabled and visible)</w:t>
+      </w:r>
+    </w:p>
+    <w:p>
+      <w:pPr>
+        <w:pStyle w:val="ListParagraph"/>
+        <w:numPr>
+          <w:ilvl w:val="0"/>
+          <w:numId w:val="3"/>
+        </w:numPr>
+        <w:rPr>
+          <w:sz w:val="24"/>
+          <w:szCs w:val="24"/>
+          <w:highlight w:val="yellow"/>
+          <w:lang w:val="en-US"/>
+        </w:rPr>
+      </w:pPr>
+      <w:r>
+        <w:rPr>
+          <w:sz w:val="24"/>
+          <w:szCs w:val="24"/>
+          <w:highlight w:val="yellow"/>
+          <w:lang w:val="en-US"/>
+        </w:rPr>
+        <w:t xml:space="preserve">Open </w:t>
+      </w:r>
+      <w:hyperlink r:id="rId13" w:history="1">
+        <w:r>
+          <w:rPr>
+            <w:rStyle w:val="Hyperlink"/>
+            <w:sz w:val="24"/>
+            <w:szCs w:val="24"/>
+            <w:highlight w:val="yellow"/>
+            <w:lang w:val="en-US"/>
+          </w:rPr>
+          <w:t>https://echoecho.com/htmlforms10.htm</w:t>
+        </w:r>
+      </w:hyperlink>
+    </w:p>
+    <w:p>
+      <w:pPr>
+        <w:pStyle w:val="ListParagraph"/>
+        <w:numPr>
+          <w:ilvl w:val="1"/>
+          <w:numId w:val="3"/>
+        </w:numPr>
+        <w:rPr>
+          <w:sz w:val="24"/>
+          <w:szCs w:val="24"/>
+          <w:highlight w:val="yellow"/>
+          <w:lang w:val="en-US"/>
+        </w:rPr>
+      </w:pPr>
+      <w:r>
+        <w:rPr>
+          <w:sz w:val="24"/>
+          <w:szCs w:val="24"/>
+          <w:highlight w:val="yellow"/>
+          <w:lang w:val="en-US"/>
+        </w:rPr>
+        <w:t>Display status of all 6 radio buttons</w:t>
+      </w:r>
+    </w:p>
+    <w:p>
+      <w:pPr>
+        <w:pStyle w:val="ListParagraph"/>
+        <w:numPr>
+          <w:ilvl w:val="1"/>
+          <w:numId w:val="3"/>
+        </w:numPr>
+        <w:rPr>
+          <w:sz w:val="24"/>
+          <w:szCs w:val="24"/>
+          <w:highlight w:val="yellow"/>
+          <w:lang w:val="en-US"/>
+        </w:rPr>
+      </w:pPr>
+      <w:r>
+        <w:rPr>
+          <w:sz w:val="24"/>
+          <w:szCs w:val="24"/>
+          <w:highlight w:val="yellow"/>
+          <w:lang w:val="en-US"/>
+        </w:rPr>
+        <w:t>Click on each radio button</w:t>
+      </w:r>
+    </w:p>
+    <w:p>
+      <w:pPr>
+        <w:pStyle w:val="ListParagraph"/>
+        <w:numPr>
+          <w:ilvl w:val="1"/>
+          <w:numId w:val="3"/>
+        </w:numPr>
+        <w:rPr>
+          <w:sz w:val="24"/>
+          <w:szCs w:val="24"/>
+          <w:highlight w:val="yellow"/>
+          <w:lang w:val="en-US"/>
+        </w:rPr>
+      </w:pPr>
+      <w:r>
+        <w:rPr>
+          <w:sz w:val="24"/>
+          <w:szCs w:val="24"/>
+          <w:highlight w:val="yellow"/>
+          <w:lang w:val="en-US"/>
+        </w:rPr>
+        <w:t>Display the status</w:t>
+      </w:r>
+      <w:r>
+        <w:rPr>
+          <w:sz w:val="24"/>
+          <w:szCs w:val="24"/>
+          <w:highlight w:val="yellow"/>
+          <w:lang w:val="en-US"/>
+        </w:rPr>
+        <w:br/>
+      </w:r>
+      <w:proofErr w:type="spellStart"/>
+      <w:r>
+        <w:rPr>
+          <w:sz w:val="24"/>
+          <w:szCs w:val="24"/>
+          <w:highlight w:val="yellow"/>
+          <w:lang w:val="en-US"/>
+        </w:rPr>
+        <w:t>Status</w:t>
+      </w:r>
+      <w:proofErr w:type="spellEnd"/>
+      <w:r>
+        <w:rPr>
+          <w:sz w:val="24"/>
+          <w:szCs w:val="24"/>
+          <w:highlight w:val="yellow"/>
+          <w:lang w:val="en-US"/>
+        </w:rPr>
+        <w:t xml:space="preserve"> </w:t>
+      </w:r>
+      <w:r>
+        <w:rPr>
+          <w:sz w:val="24"/>
+          <w:szCs w:val="24"/>
+          <w:highlight w:val="yellow"/>
+          <w:lang w:val="en-US"/>
+        </w:rPr>
+        <w:sym w:font="Wingdings" w:char="F0E0"/>
+      </w:r>
+      <w:r>
+        <w:rPr>
+          <w:sz w:val="24"/>
+          <w:szCs w:val="24"/>
+          <w:highlight w:val="yellow"/>
+          <w:lang w:val="en-US"/>
+        </w:rPr>
+        <w:t xml:space="preserve"> Click </w:t>
+      </w:r>
+      <w:r>
+        <w:rPr>
+          <w:sz w:val="24"/>
+          <w:szCs w:val="24"/>
+          <w:highlight w:val="yellow"/>
+          <w:lang w:val="en-US"/>
+        </w:rPr>
+        <w:sym w:font="Wingdings" w:char="F0E0"/>
+      </w:r>
+      <w:r>
+        <w:rPr>
+          <w:sz w:val="24"/>
+          <w:szCs w:val="24"/>
+          <w:highlight w:val="yellow"/>
+          <w:lang w:val="en-US"/>
+        </w:rPr>
+        <w:t xml:space="preserve"> Status</w:t>
+      </w:r>
+    </w:p>
+    <w:p>
+      <w:pPr>
+        <w:pStyle w:val="ListParagraph"/>
+        <w:numPr>
+          <w:ilvl w:val="0"/>
+          <w:numId w:val="3"/>
+        </w:numPr>
+        <w:spacing w:line="256" w:lineRule="auto"/>
+        <w:rPr>
+          <w:sz w:val="24"/>
+          <w:szCs w:val="24"/>
+          <w:lang w:val="en-US"/>
+        </w:rPr>
+      </w:pPr>
+      <w:r>
+        <w:rPr>
+          <w:sz w:val="24"/>
+          <w:szCs w:val="24"/>
+          <w:lang w:val="en-US"/>
+        </w:rPr>
+        <w:t xml:space="preserve">Open </w:t>
+      </w:r>
+      <w:hyperlink r:id="rId14" w:history="1">
+        <w:r>
+          <w:rPr>
+            <w:rStyle w:val="Hyperlink"/>
+            <w:sz w:val="24"/>
+            <w:szCs w:val="24"/>
+            <w:lang w:val="en-US"/>
+          </w:rPr>
+          <w:t>https://register.rediff.com/register/register.php?FormName=user_details</w:t>
+        </w:r>
+      </w:hyperlink>
+    </w:p>
+    <w:p>
+      <w:pPr>
+        <w:pStyle w:val="ListParagraph"/>
+        <w:numPr>
+          <w:ilvl w:val="1"/>
+          <w:numId w:val="3"/>
+        </w:numPr>
+        <w:spacing w:line="256" w:lineRule="auto"/>
+        <w:rPr>
+          <w:sz w:val="24"/>
+          <w:szCs w:val="24"/>
+          <w:lang w:val="en-US"/>
+        </w:rPr>
+      </w:pPr>
+      <w:r>
+        <w:rPr>
+          <w:sz w:val="24"/>
+          <w:szCs w:val="24"/>
+          <w:lang w:val="en-US"/>
+        </w:rPr>
+        <w:t>Select your birth date</w:t>
+      </w:r>
+    </w:p>
+    <w:p>
+      <w:pPr>
+        <w:pStyle w:val="ListParagraph"/>
+        <w:numPr>
+          <w:ilvl w:val="1"/>
+          <w:numId w:val="3"/>
+        </w:numPr>
+        <w:spacing w:line="256" w:lineRule="auto"/>
+        <w:rPr>
+          <w:sz w:val="24"/>
+          <w:szCs w:val="24"/>
+          <w:lang w:val="en-US"/>
+        </w:rPr>
+      </w:pPr>
+      <w:r>
+        <w:rPr>
+          <w:sz w:val="24"/>
+          <w:szCs w:val="24"/>
+          <w:lang w:val="en-US"/>
+        </w:rPr>
+        <w:t>Display your birth date in following format</w:t>
+      </w:r>
+      <w:r>
+        <w:rPr>
+          <w:sz w:val="24"/>
+          <w:szCs w:val="24"/>
+          <w:lang w:val="en-US"/>
+        </w:rPr>
+        <w:br/>
+        <w:t>My Birth Date is: 29 JAN 1979</w:t>
+      </w:r>
+    </w:p>
+    <w:p>
+      <w:pPr>
+        <w:pStyle w:val="ListParagraph"/>
+        <w:numPr>
+          <w:ilvl w:val="0"/>
+          <w:numId w:val="3"/>
+        </w:numPr>
+        <w:spacing w:line="256" w:lineRule="auto"/>
+        <w:rPr>
+          <w:sz w:val="24"/>
+          <w:szCs w:val="24"/>
+          <w:lang w:val="en-US"/>
+        </w:rPr>
+      </w:pPr>
+      <w:r>
+        <w:rPr>
+          <w:sz w:val="24"/>
+          <w:szCs w:val="24"/>
+          <w:lang w:val="en-US"/>
+        </w:rPr>
+        <w:t xml:space="preserve">Launch </w:t>
+      </w:r>
+      <w:hyperlink r:id="rId15" w:history="1">
+        <w:r>
+          <w:rPr>
+            <w:rStyle w:val="Hyperlink"/>
+            <w:sz w:val="24"/>
+            <w:szCs w:val="24"/>
+            <w:lang w:val="en-US"/>
+          </w:rPr>
+          <w:t>https://omayo.blogspot.com/</w:t>
+        </w:r>
+      </w:hyperlink>
+    </w:p>
+    <w:p>
+      <w:pPr>
+        <w:pStyle w:val="ListParagraph"/>
+        <w:numPr>
+          <w:ilvl w:val="1"/>
+          <w:numId w:val="3"/>
+        </w:numPr>
+        <w:spacing w:line="256" w:lineRule="auto"/>
+        <w:rPr>
+          <w:sz w:val="24"/>
+          <w:szCs w:val="24"/>
+          <w:lang w:val="en-US"/>
+        </w:rPr>
+      </w:pPr>
+      <w:r>
+        <w:rPr>
+          <w:sz w:val="24"/>
+          <w:szCs w:val="24"/>
+          <w:lang w:val="en-US"/>
+        </w:rPr>
+        <w:t>Select doc2 from Older newsletter dropdown list</w:t>
+      </w:r>
+    </w:p>
+    <w:p>
+      <w:pPr>
+        <w:pStyle w:val="ListParagraph"/>
+        <w:numPr>
+          <w:ilvl w:val="1"/>
+          <w:numId w:val="3"/>
+        </w:numPr>
+        <w:spacing w:line="256" w:lineRule="auto"/>
+        <w:rPr>
+          <w:sz w:val="24"/>
+          <w:szCs w:val="24"/>
+          <w:lang w:val="en-US"/>
+        </w:rPr>
+      </w:pPr>
+      <w:r>
+        <w:rPr>
+          <w:sz w:val="24"/>
+          <w:szCs w:val="24"/>
+          <w:lang w:val="en-US"/>
+        </w:rPr>
+        <w:t>Display the selected option</w:t>
+      </w:r>
+    </w:p>
+    <w:p>
+      <w:pPr>
+        <w:pStyle w:val="ListParagraph"/>
+        <w:numPr>
+          <w:ilvl w:val="0"/>
+          <w:numId w:val="3"/>
+        </w:numPr>
+        <w:rPr>
+          <w:sz w:val="24"/>
+          <w:szCs w:val="24"/>
+          <w:highlight w:val="yellow"/>
+          <w:lang w:val="en-US"/>
+        </w:rPr>
+      </w:pPr>
+      <w:r>
+        <w:rPr>
+          <w:sz w:val="24"/>
+          <w:szCs w:val="24"/>
+          <w:highlight w:val="yellow"/>
+          <w:lang w:val="en-US"/>
+        </w:rPr>
+        <w:t xml:space="preserve">Launch </w:t>
+      </w:r>
+      <w:hyperlink r:id="rId16" w:history="1">
+        <w:r>
+          <w:rPr>
+            <w:rStyle w:val="Hyperlink"/>
+            <w:sz w:val="24"/>
+            <w:szCs w:val="24"/>
+            <w:highlight w:val="yellow"/>
+            <w:lang w:val="en-US"/>
+          </w:rPr>
+          <w:t>https://opensource-demo.orangehrmlive.com/web/index.php/auth/login</w:t>
+        </w:r>
+      </w:hyperlink>
+    </w:p>
+    <w:p>
+      <w:pPr>
+        <w:pStyle w:val="ListParagraph"/>
+        <w:numPr>
+          <w:ilvl w:val="1"/>
+          <w:numId w:val="3"/>
+        </w:numPr>
+        <w:rPr>
+          <w:sz w:val="24"/>
+          <w:szCs w:val="24"/>
+          <w:highlight w:val="yellow"/>
+          <w:lang w:val="en-US"/>
+        </w:rPr>
+      </w:pPr>
+      <w:r>
+        <w:rPr>
+          <w:sz w:val="24"/>
+          <w:szCs w:val="24"/>
+          <w:highlight w:val="yellow"/>
+          <w:lang w:val="en-US"/>
+        </w:rPr>
+        <w:t>Enter user name as admin</w:t>
+      </w:r>
+    </w:p>
+    <w:p>
+      <w:pPr>
+        <w:pStyle w:val="ListParagraph"/>
+        <w:numPr>
+          <w:ilvl w:val="1"/>
+          <w:numId w:val="3"/>
+        </w:numPr>
+        <w:rPr>
+          <w:sz w:val="24"/>
+          <w:szCs w:val="24"/>
+          <w:highlight w:val="yellow"/>
+          <w:lang w:val="en-US"/>
+        </w:rPr>
+      </w:pPr>
+      <w:r>
+        <w:rPr>
+          <w:sz w:val="24"/>
+          <w:szCs w:val="24"/>
+          <w:highlight w:val="yellow"/>
+          <w:lang w:val="en-US"/>
+        </w:rPr>
+        <w:t>Enter password as admin123</w:t>
+      </w:r>
+    </w:p>
+    <w:p>
+      <w:pPr>
+        <w:pStyle w:val="ListParagraph"/>
+        <w:numPr>
+          <w:ilvl w:val="1"/>
+          <w:numId w:val="3"/>
+        </w:numPr>
+        <w:rPr>
+          <w:sz w:val="24"/>
+          <w:szCs w:val="24"/>
+          <w:highlight w:val="yellow"/>
+          <w:lang w:val="en-US"/>
+        </w:rPr>
+      </w:pPr>
+      <w:r>
+        <w:rPr>
+          <w:sz w:val="24"/>
+          <w:szCs w:val="24"/>
+          <w:highlight w:val="yellow"/>
+          <w:lang w:val="en-US"/>
+        </w:rPr>
+        <w:t>Click on login button</w:t>
       </w:r>
     </w:p>
     <w:p>
@@ -2246,6 +2775,95 @@
     </w:lvl>
   </w:abstractNum>
   <w:abstractNum w:abstractNumId="1">
+    <w:nsid w:val="4E5B4A02"/>
+    <w:multiLevelType w:val="hybridMultilevel"/>
+    <w:tmpl w:val="E8BC0844"/>
+    <w:lvl w:ilvl="0" w:tplc="4009000F">
+      <w:start w:val="1"/>
+      <w:numFmt w:val="decimal"/>
+      <w:lvlText w:val="%1."/>
+      <w:lvlJc w:val="left"/>
+      <w:pPr>
+        <w:ind w:left="720" w:hanging="360"/>
+      </w:pPr>
+      <w:rPr>
+        <w:rFonts w:hint="default"/>
+      </w:rPr>
+    </w:lvl>
+    <w:lvl w:ilvl="1" w:tplc="40090019">
+      <w:start w:val="1"/>
+      <w:numFmt w:val="lowerLetter"/>
+      <w:lvlText w:val="%2."/>
+      <w:lvlJc w:val="left"/>
+      <w:pPr>
+        <w:ind w:left="1440" w:hanging="360"/>
+      </w:pPr>
+    </w:lvl>
+    <w:lvl w:ilvl="2" w:tplc="4009001B" w:tentative="1">
+      <w:start w:val="1"/>
+      <w:numFmt w:val="lowerRoman"/>
+      <w:lvlText w:val="%3."/>
+      <w:lvlJc w:val="right"/>
+      <w:pPr>
+        <w:ind w:left="2160" w:hanging="180"/>
+      </w:pPr>
+    </w:lvl>
+    <w:lvl w:ilvl="3" w:tplc="4009000F" w:tentative="1">
+      <w:start w:val="1"/>
+      <w:numFmt w:val="decimal"/>
+      <w:lvlText w:val="%4."/>
+      <w:lvlJc w:val="left"/>
+      <w:pPr>
+        <w:ind w:left="2880" w:hanging="360"/>
+      </w:pPr>
+    </w:lvl>
+    <w:lvl w:ilvl="4" w:tplc="40090019" w:tentative="1">
+      <w:start w:val="1"/>
+      <w:numFmt w:val="lowerLetter"/>
+      <w:lvlText w:val="%5."/>
+      <w:lvlJc w:val="left"/>
+      <w:pPr>
+        <w:ind w:left="3600" w:hanging="360"/>
+      </w:pPr>
+    </w:lvl>
+    <w:lvl w:ilvl="5" w:tplc="4009001B" w:tentative="1">
+      <w:start w:val="1"/>
+      <w:numFmt w:val="lowerRoman"/>
+      <w:lvlText w:val="%6."/>
+      <w:lvlJc w:val="right"/>
+      <w:pPr>
+        <w:ind w:left="4320" w:hanging="180"/>
+      </w:pPr>
+    </w:lvl>
+    <w:lvl w:ilvl="6" w:tplc="4009000F" w:tentative="1">
+      <w:start w:val="1"/>
+      <w:numFmt w:val="decimal"/>
+      <w:lvlText w:val="%7."/>
+      <w:lvlJc w:val="left"/>
+      <w:pPr>
+        <w:ind w:left="5040" w:hanging="360"/>
+      </w:pPr>
+    </w:lvl>
+    <w:lvl w:ilvl="7" w:tplc="40090019" w:tentative="1">
+      <w:start w:val="1"/>
+      <w:numFmt w:val="lowerLetter"/>
+      <w:lvlText w:val="%8."/>
+      <w:lvlJc w:val="left"/>
+      <w:pPr>
+        <w:ind w:left="5760" w:hanging="360"/>
+      </w:pPr>
+    </w:lvl>
+    <w:lvl w:ilvl="8" w:tplc="4009001B" w:tentative="1">
+      <w:start w:val="1"/>
+      <w:numFmt w:val="lowerRoman"/>
+      <w:lvlText w:val="%9."/>
+      <w:lvlJc w:val="right"/>
+      <w:pPr>
+        <w:ind w:left="6480" w:hanging="180"/>
+      </w:pPr>
+    </w:lvl>
+  </w:abstractNum>
+  <w:abstractNum w:abstractNumId="2">
     <w:nsid w:val="587E28FC"/>
     <w:multiLevelType w:val="hybridMultilevel"/>
     <w:tmpl w:val="9CD88518"/>
@@ -2334,7 +2952,7 @@
       </w:pPr>
     </w:lvl>
   </w:abstractNum>
-  <w:abstractNum w:abstractNumId="2">
+  <w:abstractNum w:abstractNumId="3">
     <w:nsid w:val="5E301873"/>
     <w:multiLevelType w:val="hybridMultilevel"/>
     <w:tmpl w:val="38B49D1E"/>
@@ -2421,16 +3039,16 @@
     </w:lvl>
   </w:abstractNum>
   <w:num w:numId="1">
-    <w:abstractNumId w:val="1"/>
+    <w:abstractNumId w:val="2"/>
   </w:num>
   <w:num w:numId="2">
     <w:abstractNumId w:val="0"/>
   </w:num>
   <w:num w:numId="3">
-    <w:abstractNumId w:val="2"/>
+    <w:abstractNumId w:val="3"/>
   </w:num>
   <w:num w:numId="4">
-    <w:abstractNumId w:val="2"/>
+    <w:abstractNumId w:val="3"/>
     <w:lvlOverride w:ilvl="0">
       <w:startOverride w:val="1"/>
     </w:lvlOverride>
@@ -2458,6 +3076,9 @@
     <w:lvlOverride w:ilvl="8">
       <w:startOverride w:val="1"/>
     </w:lvlOverride>
+  </w:num>
+  <w:num w:numId="5">
+    <w:abstractNumId w:val="1"/>
   </w:num>
 </w:numbering>
 </file>

</xml_diff>

<commit_message>
Date: 01 Mar 2026
</commit_message>
<xml_diff>
--- a/Assignments.docx
+++ b/Assignments.docx
@@ -2664,14 +2664,491 @@
           <w:ilvl w:val="0"/>
           <w:numId w:val="3"/>
         </w:numPr>
-        <w:rPr>
-          <w:sz w:val="24"/>
-          <w:szCs w:val="24"/>
+        <w:spacing w:line="256" w:lineRule="auto"/>
+        <w:rPr>
+          <w:sz w:val="24"/>
+          <w:szCs w:val="24"/>
+          <w:highlight w:val="yellow"/>
+          <w:lang w:val="en-US"/>
+        </w:rPr>
+      </w:pPr>
+      <w:r>
+        <w:rPr>
+          <w:sz w:val="24"/>
+          <w:szCs w:val="24"/>
+          <w:highlight w:val="yellow"/>
+          <w:lang w:val="en-US"/>
+        </w:rPr>
+        <w:t xml:space="preserve">Open </w:t>
+      </w:r>
+      <w:hyperlink r:id="rId17" w:history="1">
+        <w:r>
+          <w:rPr>
+            <w:rStyle w:val="Hyperlink"/>
+            <w:sz w:val="24"/>
+            <w:szCs w:val="24"/>
+            <w:highlight w:val="yellow"/>
+            <w:lang w:val="en-US"/>
+          </w:rPr>
+          <w:t>https://www.redbus.in/</w:t>
+        </w:r>
+      </w:hyperlink>
+    </w:p>
+    <w:p>
+      <w:pPr>
+        <w:pStyle w:val="ListParagraph"/>
+        <w:numPr>
+          <w:ilvl w:val="1"/>
+          <w:numId w:val="3"/>
+        </w:numPr>
+        <w:spacing w:line="256" w:lineRule="auto"/>
+        <w:rPr>
+          <w:sz w:val="24"/>
+          <w:szCs w:val="24"/>
+          <w:highlight w:val="yellow"/>
+          <w:lang w:val="en-US"/>
+        </w:rPr>
+      </w:pPr>
+      <w:r>
+        <w:rPr>
+          <w:sz w:val="24"/>
+          <w:szCs w:val="24"/>
+          <w:highlight w:val="yellow"/>
+          <w:lang w:val="en-US"/>
+        </w:rPr>
+        <w:t xml:space="preserve">Click on From </w:t>
+      </w:r>
+    </w:p>
+    <w:p>
+      <w:pPr>
+        <w:pStyle w:val="ListParagraph"/>
+        <w:numPr>
+          <w:ilvl w:val="1"/>
+          <w:numId w:val="3"/>
+        </w:numPr>
+        <w:spacing w:line="256" w:lineRule="auto"/>
+        <w:rPr>
+          <w:sz w:val="24"/>
+          <w:szCs w:val="24"/>
+          <w:highlight w:val="yellow"/>
+          <w:lang w:val="en-US"/>
+        </w:rPr>
+      </w:pPr>
+      <w:r>
+        <w:rPr>
+          <w:sz w:val="24"/>
+          <w:szCs w:val="24"/>
+          <w:highlight w:val="yellow"/>
+          <w:lang w:val="en-US"/>
+        </w:rPr>
+        <w:t xml:space="preserve">Enter first 4 characters from your city (Kolhapur – </w:t>
+      </w:r>
+      <w:proofErr w:type="spellStart"/>
+      <w:r>
+        <w:rPr>
+          <w:sz w:val="24"/>
+          <w:szCs w:val="24"/>
+          <w:highlight w:val="yellow"/>
+          <w:lang w:val="en-US"/>
+        </w:rPr>
+        <w:t>kolh</w:t>
+      </w:r>
+      <w:proofErr w:type="spellEnd"/>
+      <w:r>
+        <w:rPr>
+          <w:sz w:val="24"/>
+          <w:szCs w:val="24"/>
+          <w:highlight w:val="yellow"/>
+          <w:lang w:val="en-US"/>
+        </w:rPr>
+        <w:t>)</w:t>
+      </w:r>
+    </w:p>
+    <w:p>
+      <w:pPr>
+        <w:pStyle w:val="ListParagraph"/>
+        <w:numPr>
+          <w:ilvl w:val="1"/>
+          <w:numId w:val="3"/>
+        </w:numPr>
+        <w:spacing w:line="256" w:lineRule="auto"/>
+        <w:rPr>
+          <w:sz w:val="24"/>
+          <w:szCs w:val="24"/>
+          <w:highlight w:val="yellow"/>
+          <w:lang w:val="en-US"/>
+        </w:rPr>
+      </w:pPr>
+      <w:r>
+        <w:rPr>
+          <w:sz w:val="24"/>
+          <w:szCs w:val="24"/>
+          <w:highlight w:val="yellow"/>
+          <w:lang w:val="en-US"/>
+        </w:rPr>
+        <w:t>Click on the 1</w:t>
+      </w:r>
+      <w:r>
+        <w:rPr>
+          <w:sz w:val="24"/>
+          <w:szCs w:val="24"/>
+          <w:highlight w:val="yellow"/>
+          <w:vertAlign w:val="superscript"/>
+          <w:lang w:val="en-US"/>
+        </w:rPr>
+        <w:t>st</w:t>
+      </w:r>
+      <w:r>
+        <w:rPr>
+          <w:sz w:val="24"/>
+          <w:szCs w:val="24"/>
+          <w:highlight w:val="yellow"/>
+          <w:lang w:val="en-US"/>
+        </w:rPr>
+        <w:t xml:space="preserve"> option (City)</w:t>
+      </w:r>
+    </w:p>
+    <w:p>
+      <w:pPr>
+        <w:pStyle w:val="ListParagraph"/>
+        <w:numPr>
+          <w:ilvl w:val="1"/>
+          <w:numId w:val="3"/>
+        </w:numPr>
+        <w:spacing w:line="256" w:lineRule="auto"/>
+        <w:rPr>
+          <w:sz w:val="24"/>
+          <w:szCs w:val="24"/>
+          <w:highlight w:val="yellow"/>
           <w:lang w:val="en-US"/>
         </w:rPr>
       </w:pPr>
       <w:bookmarkStart w:id="0" w:name="_GoBack"/>
+      <w:r>
+        <w:rPr>
+          <w:sz w:val="24"/>
+          <w:szCs w:val="24"/>
+          <w:highlight w:val="yellow"/>
+          <w:lang w:val="en-US"/>
+        </w:rPr>
+        <w:t>Click on To</w:t>
+      </w:r>
       <w:bookmarkEnd w:id="0"/>
+    </w:p>
+    <w:p>
+      <w:pPr>
+        <w:pStyle w:val="ListParagraph"/>
+        <w:numPr>
+          <w:ilvl w:val="1"/>
+          <w:numId w:val="3"/>
+        </w:numPr>
+        <w:spacing w:line="256" w:lineRule="auto"/>
+        <w:rPr>
+          <w:sz w:val="24"/>
+          <w:szCs w:val="24"/>
+          <w:highlight w:val="yellow"/>
+          <w:lang w:val="en-US"/>
+        </w:rPr>
+      </w:pPr>
+      <w:r>
+        <w:rPr>
+          <w:sz w:val="24"/>
+          <w:szCs w:val="24"/>
+          <w:highlight w:val="yellow"/>
+          <w:lang w:val="en-US"/>
+        </w:rPr>
+        <w:t>Enter Bang (Bangalore)</w:t>
+      </w:r>
+    </w:p>
+    <w:p>
+      <w:pPr>
+        <w:pStyle w:val="ListParagraph"/>
+        <w:numPr>
+          <w:ilvl w:val="1"/>
+          <w:numId w:val="3"/>
+        </w:numPr>
+        <w:spacing w:line="256" w:lineRule="auto"/>
+        <w:rPr>
+          <w:sz w:val="24"/>
+          <w:szCs w:val="24"/>
+          <w:highlight w:val="yellow"/>
+          <w:lang w:val="en-US"/>
+        </w:rPr>
+      </w:pPr>
+      <w:r>
+        <w:rPr>
+          <w:sz w:val="24"/>
+          <w:szCs w:val="24"/>
+          <w:highlight w:val="yellow"/>
+          <w:lang w:val="en-US"/>
+        </w:rPr>
+        <w:t>Click on Bangalore from the list</w:t>
+      </w:r>
+    </w:p>
+    <w:p>
+      <w:pPr>
+        <w:pStyle w:val="ListParagraph"/>
+        <w:numPr>
+          <w:ilvl w:val="1"/>
+          <w:numId w:val="3"/>
+        </w:numPr>
+        <w:spacing w:line="256" w:lineRule="auto"/>
+        <w:rPr>
+          <w:sz w:val="24"/>
+          <w:szCs w:val="24"/>
+          <w:highlight w:val="yellow"/>
+          <w:lang w:val="en-US"/>
+        </w:rPr>
+      </w:pPr>
+      <w:r>
+        <w:rPr>
+          <w:sz w:val="24"/>
+          <w:szCs w:val="24"/>
+          <w:highlight w:val="yellow"/>
+          <w:lang w:val="en-US"/>
+        </w:rPr>
+        <w:t>Click on Calendar icon</w:t>
+      </w:r>
+    </w:p>
+    <w:p>
+      <w:pPr>
+        <w:pStyle w:val="ListParagraph"/>
+        <w:numPr>
+          <w:ilvl w:val="1"/>
+          <w:numId w:val="3"/>
+        </w:numPr>
+        <w:spacing w:line="256" w:lineRule="auto"/>
+        <w:rPr>
+          <w:sz w:val="24"/>
+          <w:szCs w:val="24"/>
+          <w:highlight w:val="yellow"/>
+          <w:lang w:val="en-US"/>
+        </w:rPr>
+      </w:pPr>
+      <w:r>
+        <w:rPr>
+          <w:sz w:val="24"/>
+          <w:szCs w:val="24"/>
+          <w:highlight w:val="yellow"/>
+          <w:lang w:val="en-US"/>
+        </w:rPr>
+        <w:t>Click on 31</w:t>
+      </w:r>
+    </w:p>
+    <w:p>
+      <w:pPr>
+        <w:pStyle w:val="ListParagraph"/>
+        <w:numPr>
+          <w:ilvl w:val="1"/>
+          <w:numId w:val="3"/>
+        </w:numPr>
+        <w:spacing w:line="256" w:lineRule="auto"/>
+        <w:rPr>
+          <w:sz w:val="24"/>
+          <w:szCs w:val="24"/>
+          <w:highlight w:val="yellow"/>
+          <w:lang w:val="en-US"/>
+        </w:rPr>
+      </w:pPr>
+      <w:r>
+        <w:rPr>
+          <w:sz w:val="24"/>
+          <w:szCs w:val="24"/>
+          <w:highlight w:val="yellow"/>
+          <w:lang w:val="en-US"/>
+        </w:rPr>
+        <w:t>Click on Search buses button</w:t>
+      </w:r>
+    </w:p>
+    <w:p>
+      <w:pPr>
+        <w:pStyle w:val="ListParagraph"/>
+        <w:numPr>
+          <w:ilvl w:val="1"/>
+          <w:numId w:val="3"/>
+        </w:numPr>
+        <w:spacing w:line="256" w:lineRule="auto"/>
+        <w:rPr>
+          <w:sz w:val="24"/>
+          <w:szCs w:val="24"/>
+          <w:highlight w:val="yellow"/>
+          <w:lang w:val="en-US"/>
+        </w:rPr>
+      </w:pPr>
+      <w:r>
+        <w:rPr>
+          <w:sz w:val="24"/>
+          <w:szCs w:val="24"/>
+          <w:highlight w:val="yellow"/>
+          <w:lang w:val="en-US"/>
+        </w:rPr>
+        <w:t>Display the 1</w:t>
+      </w:r>
+      <w:r>
+        <w:rPr>
+          <w:sz w:val="24"/>
+          <w:szCs w:val="24"/>
+          <w:highlight w:val="yellow"/>
+          <w:vertAlign w:val="superscript"/>
+          <w:lang w:val="en-US"/>
+        </w:rPr>
+        <w:t>st</w:t>
+      </w:r>
+      <w:r>
+        <w:rPr>
+          <w:sz w:val="24"/>
+          <w:szCs w:val="24"/>
+          <w:highlight w:val="yellow"/>
+          <w:lang w:val="en-US"/>
+        </w:rPr>
+        <w:t xml:space="preserve"> bus from list</w:t>
+      </w:r>
+    </w:p>
+    <w:p>
+      <w:pPr>
+        <w:pStyle w:val="ListParagraph"/>
+        <w:numPr>
+          <w:ilvl w:val="0"/>
+          <w:numId w:val="3"/>
+        </w:numPr>
+        <w:rPr>
+          <w:sz w:val="24"/>
+          <w:szCs w:val="24"/>
+          <w:highlight w:val="yellow"/>
+          <w:lang w:val="en-US"/>
+        </w:rPr>
+      </w:pPr>
+      <w:r>
+        <w:rPr>
+          <w:sz w:val="24"/>
+          <w:szCs w:val="24"/>
+          <w:highlight w:val="yellow"/>
+          <w:lang w:val="en-US"/>
+        </w:rPr>
+        <w:t xml:space="preserve">Open </w:t>
+      </w:r>
+      <w:hyperlink r:id="rId18" w:history="1">
+        <w:r>
+          <w:rPr>
+            <w:rStyle w:val="Hyperlink"/>
+            <w:sz w:val="24"/>
+            <w:szCs w:val="24"/>
+            <w:highlight w:val="yellow"/>
+            <w:lang w:val="en-US"/>
+          </w:rPr>
+          <w:t>https://dash.bling-center.com/platform/signIn.html</w:t>
+        </w:r>
+      </w:hyperlink>
+    </w:p>
+    <w:p>
+      <w:pPr>
+        <w:pStyle w:val="ListParagraph"/>
+        <w:numPr>
+          <w:ilvl w:val="1"/>
+          <w:numId w:val="3"/>
+        </w:numPr>
+        <w:rPr>
+          <w:sz w:val="24"/>
+          <w:szCs w:val="24"/>
+          <w:highlight w:val="yellow"/>
+          <w:lang w:val="en-US"/>
+        </w:rPr>
+      </w:pPr>
+      <w:r>
+        <w:rPr>
+          <w:sz w:val="24"/>
+          <w:szCs w:val="24"/>
+          <w:highlight w:val="yellow"/>
+          <w:lang w:val="en-US"/>
+        </w:rPr>
+        <w:t>Click on forgot password</w:t>
+      </w:r>
+    </w:p>
+    <w:p>
+      <w:pPr>
+        <w:pStyle w:val="ListParagraph"/>
+        <w:numPr>
+          <w:ilvl w:val="1"/>
+          <w:numId w:val="3"/>
+        </w:numPr>
+        <w:rPr>
+          <w:sz w:val="24"/>
+          <w:szCs w:val="24"/>
+          <w:highlight w:val="yellow"/>
+          <w:lang w:val="en-US"/>
+        </w:rPr>
+      </w:pPr>
+      <w:r>
+        <w:rPr>
+          <w:sz w:val="24"/>
+          <w:szCs w:val="24"/>
+          <w:highlight w:val="yellow"/>
+          <w:lang w:val="en-US"/>
+        </w:rPr>
+        <w:t>Enter your email id</w:t>
+      </w:r>
+    </w:p>
+    <w:p>
+      <w:pPr>
+        <w:pStyle w:val="ListParagraph"/>
+        <w:numPr>
+          <w:ilvl w:val="1"/>
+          <w:numId w:val="3"/>
+        </w:numPr>
+        <w:rPr>
+          <w:sz w:val="24"/>
+          <w:szCs w:val="24"/>
+          <w:highlight w:val="yellow"/>
+          <w:lang w:val="en-US"/>
+        </w:rPr>
+      </w:pPr>
+      <w:r>
+        <w:rPr>
+          <w:sz w:val="24"/>
+          <w:szCs w:val="24"/>
+          <w:highlight w:val="yellow"/>
+          <w:lang w:val="en-US"/>
+        </w:rPr>
+        <w:t>Click on reset password button</w:t>
+      </w:r>
+    </w:p>
+    <w:p>
+      <w:pPr>
+        <w:pStyle w:val="ListParagraph"/>
+        <w:numPr>
+          <w:ilvl w:val="1"/>
+          <w:numId w:val="3"/>
+        </w:numPr>
+        <w:rPr>
+          <w:sz w:val="24"/>
+          <w:szCs w:val="24"/>
+          <w:highlight w:val="yellow"/>
+          <w:lang w:val="en-US"/>
+        </w:rPr>
+      </w:pPr>
+      <w:r>
+        <w:rPr>
+          <w:sz w:val="24"/>
+          <w:szCs w:val="24"/>
+          <w:highlight w:val="yellow"/>
+          <w:lang w:val="en-US"/>
+        </w:rPr>
+        <w:t>Display the text (message) in green color.</w:t>
+      </w:r>
+    </w:p>
+    <w:p>
+      <w:pPr>
+        <w:pStyle w:val="ListParagraph"/>
+        <w:numPr>
+          <w:ilvl w:val="0"/>
+          <w:numId w:val="3"/>
+        </w:numPr>
+        <w:rPr>
+          <w:sz w:val="24"/>
+          <w:szCs w:val="24"/>
+          <w:lang w:val="en-US"/>
+        </w:rPr>
+      </w:pPr>
     </w:p>
     <w:sectPr>
       <w:pgSz w:w="11906" w:h="16838"/>

</xml_diff>

<commit_message>
Date: 07 Mar 2026
</commit_message>
<xml_diff>
--- a/Assignments.docx
+++ b/Assignments.docx
@@ -2823,7 +2823,6 @@
           <w:lang w:val="en-US"/>
         </w:rPr>
       </w:pPr>
-      <w:bookmarkStart w:id="0" w:name="_GoBack"/>
       <w:r>
         <w:rPr>
           <w:sz w:val="24"/>
@@ -2833,7 +2832,6 @@
         </w:rPr>
         <w:t>Click on To</w:t>
       </w:r>
-      <w:bookmarkEnd w:id="0"/>
     </w:p>
     <w:p>
       <w:pPr>
@@ -3149,6 +3147,410 @@
           <w:lang w:val="en-US"/>
         </w:rPr>
       </w:pPr>
+      <w:r>
+        <w:rPr>
+          <w:sz w:val="24"/>
+          <w:szCs w:val="24"/>
+          <w:lang w:val="en-US"/>
+        </w:rPr>
+        <w:t>Complete assignment no 14 (redbus) using ExplicitWait</w:t>
+      </w:r>
+    </w:p>
+    <w:p>
+      <w:pPr>
+        <w:pStyle w:val="ListParagraph"/>
+        <w:shd w:val="clear" w:color="auto" w:fill="1E1F22"/>
+        <w:tabs>
+          <w:tab w:val="left" w:pos="916"/>
+          <w:tab w:val="left" w:pos="1832"/>
+          <w:tab w:val="left" w:pos="2748"/>
+          <w:tab w:val="left" w:pos="3664"/>
+          <w:tab w:val="left" w:pos="4580"/>
+          <w:tab w:val="left" w:pos="5496"/>
+          <w:tab w:val="left" w:pos="6412"/>
+          <w:tab w:val="left" w:pos="7328"/>
+          <w:tab w:val="left" w:pos="8244"/>
+          <w:tab w:val="left" w:pos="9160"/>
+          <w:tab w:val="left" w:pos="10076"/>
+          <w:tab w:val="left" w:pos="10992"/>
+          <w:tab w:val="left" w:pos="11908"/>
+          <w:tab w:val="left" w:pos="12824"/>
+          <w:tab w:val="left" w:pos="13740"/>
+          <w:tab w:val="left" w:pos="14656"/>
+        </w:tabs>
+        <w:spacing w:after="0" w:line="240" w:lineRule="auto"/>
+        <w:rPr>
+          <w:rFonts w:ascii="Courier New" w:eastAsia="Times New Roman" w:hAnsi="Courier New" w:cs="Courier New"/>
+          <w:color w:val="BCBEC4"/>
+          <w:sz w:val="23"/>
+          <w:szCs w:val="23"/>
+          <w:lang w:eastAsia="en-IN"/>
+        </w:rPr>
+      </w:pPr>
+      <w:proofErr w:type="gramStart"/>
+      <w:r>
+        <w:rPr>
+          <w:rFonts w:ascii="Courier New" w:eastAsia="Times New Roman" w:hAnsi="Courier New" w:cs="Courier New"/>
+          <w:color w:val="BCBEC4"/>
+          <w:sz w:val="23"/>
+          <w:szCs w:val="23"/>
+          <w:lang w:eastAsia="en-IN"/>
+        </w:rPr>
+        <w:t>wait.until(</w:t>
+      </w:r>
+      <w:proofErr w:type="gramEnd"/>
+      <w:r>
+        <w:rPr>
+          <w:rFonts w:ascii="Courier New" w:eastAsia="Times New Roman" w:hAnsi="Courier New" w:cs="Courier New"/>
+          <w:color w:val="BCBEC4"/>
+          <w:sz w:val="23"/>
+          <w:szCs w:val="23"/>
+          <w:lang w:eastAsia="en-IN"/>
+        </w:rPr>
+        <w:t>ExpectedConditions.</w:t>
+      </w:r>
+      <w:r>
+        <w:rPr>
+          <w:rFonts w:ascii="Courier New" w:eastAsia="Times New Roman" w:hAnsi="Courier New" w:cs="Courier New"/>
+          <w:i/>
+          <w:iCs/>
+          <w:color w:val="BCBEC4"/>
+          <w:sz w:val="23"/>
+          <w:szCs w:val="23"/>
+          <w:lang w:eastAsia="en-IN"/>
+        </w:rPr>
+        <w:t>visibilityOfElementLocated</w:t>
+      </w:r>
+      <w:r>
+        <w:rPr>
+          <w:rFonts w:ascii="Courier New" w:eastAsia="Times New Roman" w:hAnsi="Courier New" w:cs="Courier New"/>
+          <w:color w:val="BCBEC4"/>
+          <w:sz w:val="23"/>
+          <w:szCs w:val="23"/>
+          <w:lang w:eastAsia="en-IN"/>
+        </w:rPr>
+        <w:t>(By.</w:t>
+      </w:r>
+      <w:r>
+        <w:rPr>
+          <w:rFonts w:ascii="Courier New" w:eastAsia="Times New Roman" w:hAnsi="Courier New" w:cs="Courier New"/>
+          <w:i/>
+          <w:iCs/>
+          <w:color w:val="BCBEC4"/>
+          <w:sz w:val="23"/>
+          <w:szCs w:val="23"/>
+          <w:lang w:eastAsia="en-IN"/>
+        </w:rPr>
+        <w:t>xpath</w:t>
+      </w:r>
+      <w:r>
+        <w:rPr>
+          <w:rFonts w:ascii="Courier New" w:eastAsia="Times New Roman" w:hAnsi="Courier New" w:cs="Courier New"/>
+          <w:color w:val="BCBEC4"/>
+          <w:sz w:val="23"/>
+          <w:szCs w:val="23"/>
+          <w:lang w:eastAsia="en-IN"/>
+        </w:rPr>
+        <w:t>(</w:t>
+      </w:r>
+      <w:r>
+        <w:rPr>
+          <w:rFonts w:ascii="Courier New" w:eastAsia="Times New Roman" w:hAnsi="Courier New" w:cs="Courier New"/>
+          <w:color w:val="6AAB73"/>
+          <w:sz w:val="23"/>
+          <w:szCs w:val="23"/>
+          <w:lang w:eastAsia="en-IN"/>
+        </w:rPr>
+        <w:t>""</w:t>
+      </w:r>
+      <w:r>
+        <w:rPr>
+          <w:rFonts w:ascii="Courier New" w:eastAsia="Times New Roman" w:hAnsi="Courier New" w:cs="Courier New"/>
+          <w:color w:val="BCBEC4"/>
+          <w:sz w:val="23"/>
+          <w:szCs w:val="23"/>
+          <w:lang w:eastAsia="en-IN"/>
+        </w:rPr>
+        <w:t>))).click();</w:t>
+      </w:r>
+    </w:p>
+    <w:p>
+      <w:pPr>
+        <w:pStyle w:val="ListParagraph"/>
+        <w:rPr>
+          <w:sz w:val="24"/>
+          <w:szCs w:val="24"/>
+          <w:lang w:val="en-US"/>
+        </w:rPr>
+      </w:pPr>
+    </w:p>
+    <w:p>
+      <w:pPr>
+        <w:pStyle w:val="ListParagraph"/>
+        <w:numPr>
+          <w:ilvl w:val="0"/>
+          <w:numId w:val="3"/>
+        </w:numPr>
+        <w:rPr>
+          <w:sz w:val="24"/>
+          <w:szCs w:val="24"/>
+          <w:lang w:val="en-US"/>
+        </w:rPr>
+      </w:pPr>
+      <w:r>
+        <w:rPr>
+          <w:sz w:val="24"/>
+          <w:szCs w:val="24"/>
+          <w:lang w:val="en-US"/>
+        </w:rPr>
+        <w:t xml:space="preserve">Complete </w:t>
+      </w:r>
+      <w:proofErr w:type="spellStart"/>
+      <w:r>
+        <w:rPr>
+          <w:sz w:val="24"/>
+          <w:szCs w:val="24"/>
+          <w:lang w:val="en-US"/>
+        </w:rPr>
+        <w:t>orangehrm</w:t>
+      </w:r>
+      <w:proofErr w:type="spellEnd"/>
+      <w:r>
+        <w:rPr>
+          <w:sz w:val="24"/>
+          <w:szCs w:val="24"/>
+          <w:lang w:val="en-US"/>
+        </w:rPr>
+        <w:t xml:space="preserve"> login and logout using FluentWait</w:t>
+      </w:r>
+    </w:p>
+    <w:p>
+      <w:pPr>
+        <w:pStyle w:val="ListParagraph"/>
+        <w:numPr>
+          <w:ilvl w:val="0"/>
+          <w:numId w:val="3"/>
+        </w:numPr>
+        <w:spacing w:line="254" w:lineRule="auto"/>
+        <w:rPr>
+          <w:sz w:val="24"/>
+          <w:szCs w:val="24"/>
+          <w:lang w:val="en-US"/>
+        </w:rPr>
+      </w:pPr>
+      <w:r>
+        <w:rPr>
+          <w:sz w:val="24"/>
+          <w:szCs w:val="24"/>
+          <w:lang w:val="en-US"/>
+        </w:rPr>
+        <w:t xml:space="preserve">Open </w:t>
+      </w:r>
+      <w:hyperlink r:id="rId19" w:history="1">
+        <w:r>
+          <w:rPr>
+            <w:rStyle w:val="Hyperlink"/>
+            <w:sz w:val="24"/>
+            <w:szCs w:val="24"/>
+            <w:lang w:val="en-US"/>
+          </w:rPr>
+          <w:t>https://www.rediff.com/</w:t>
+        </w:r>
+      </w:hyperlink>
+      <w:r>
+        <w:rPr>
+          <w:sz w:val="24"/>
+          <w:szCs w:val="24"/>
+          <w:lang w:val="en-US"/>
+        </w:rPr>
+        <w:t xml:space="preserve"> </w:t>
+      </w:r>
+    </w:p>
+    <w:p>
+      <w:pPr>
+        <w:pStyle w:val="ListParagraph"/>
+        <w:numPr>
+          <w:ilvl w:val="1"/>
+          <w:numId w:val="3"/>
+        </w:numPr>
+        <w:spacing w:line="254" w:lineRule="auto"/>
+        <w:rPr>
+          <w:sz w:val="24"/>
+          <w:szCs w:val="24"/>
+          <w:lang w:val="en-US"/>
+        </w:rPr>
+      </w:pPr>
+      <w:r>
+        <w:rPr>
+          <w:sz w:val="24"/>
+          <w:szCs w:val="24"/>
+          <w:lang w:val="en-US"/>
+        </w:rPr>
+        <w:t>Click on Money</w:t>
+      </w:r>
+    </w:p>
+    <w:p>
+      <w:pPr>
+        <w:pStyle w:val="ListParagraph"/>
+        <w:numPr>
+          <w:ilvl w:val="1"/>
+          <w:numId w:val="3"/>
+        </w:numPr>
+        <w:spacing w:line="254" w:lineRule="auto"/>
+        <w:rPr>
+          <w:sz w:val="24"/>
+          <w:szCs w:val="24"/>
+          <w:lang w:val="en-US"/>
+        </w:rPr>
+      </w:pPr>
+      <w:r>
+        <w:rPr>
+          <w:sz w:val="24"/>
+          <w:szCs w:val="24"/>
+          <w:lang w:val="en-US"/>
+        </w:rPr>
+        <w:t>Click on More Gainers</w:t>
+      </w:r>
+    </w:p>
+    <w:p>
+      <w:pPr>
+        <w:pStyle w:val="ListParagraph"/>
+        <w:numPr>
+          <w:ilvl w:val="1"/>
+          <w:numId w:val="3"/>
+        </w:numPr>
+        <w:spacing w:line="254" w:lineRule="auto"/>
+        <w:rPr>
+          <w:sz w:val="24"/>
+          <w:szCs w:val="24"/>
+          <w:lang w:val="en-US"/>
+        </w:rPr>
+      </w:pPr>
+      <w:r>
+        <w:rPr>
+          <w:sz w:val="24"/>
+          <w:szCs w:val="24"/>
+          <w:lang w:val="en-US"/>
+        </w:rPr>
+        <w:lastRenderedPageBreak/>
+        <w:t>Display title of all the headers</w:t>
+      </w:r>
+    </w:p>
+    <w:p>
+      <w:pPr>
+        <w:pStyle w:val="ListParagraph"/>
+        <w:numPr>
+          <w:ilvl w:val="1"/>
+          <w:numId w:val="3"/>
+        </w:numPr>
+        <w:spacing w:line="254" w:lineRule="auto"/>
+        <w:rPr>
+          <w:sz w:val="24"/>
+          <w:szCs w:val="24"/>
+          <w:lang w:val="en-US"/>
+        </w:rPr>
+      </w:pPr>
+      <w:r>
+        <w:rPr>
+          <w:sz w:val="24"/>
+          <w:szCs w:val="24"/>
+          <w:lang w:val="en-US"/>
+        </w:rPr>
+        <w:t>Display total no of rows</w:t>
+      </w:r>
+    </w:p>
+    <w:p>
+      <w:pPr>
+        <w:pStyle w:val="ListParagraph"/>
+        <w:numPr>
+          <w:ilvl w:val="1"/>
+          <w:numId w:val="3"/>
+        </w:numPr>
+        <w:spacing w:line="254" w:lineRule="auto"/>
+        <w:rPr>
+          <w:sz w:val="24"/>
+          <w:szCs w:val="24"/>
+          <w:lang w:val="en-US"/>
+        </w:rPr>
+      </w:pPr>
+      <w:r>
+        <w:rPr>
+          <w:sz w:val="24"/>
+          <w:szCs w:val="24"/>
+          <w:lang w:val="en-US"/>
+        </w:rPr>
+        <w:t>Display any row randomly</w:t>
+      </w:r>
+    </w:p>
+    <w:p>
+      <w:pPr>
+        <w:pStyle w:val="ListParagraph"/>
+        <w:numPr>
+          <w:ilvl w:val="1"/>
+          <w:numId w:val="3"/>
+        </w:numPr>
+        <w:spacing w:line="254" w:lineRule="auto"/>
+        <w:rPr>
+          <w:sz w:val="24"/>
+          <w:szCs w:val="24"/>
+          <w:lang w:val="en-US"/>
+        </w:rPr>
+      </w:pPr>
+      <w:r>
+        <w:rPr>
+          <w:sz w:val="24"/>
+          <w:szCs w:val="24"/>
+          <w:lang w:val="en-US"/>
+        </w:rPr>
+        <w:t>Display list of all the companies (Company name only)</w:t>
+      </w:r>
+    </w:p>
+    <w:p>
+      <w:pPr>
+        <w:pStyle w:val="ListParagraph"/>
+        <w:numPr>
+          <w:ilvl w:val="1"/>
+          <w:numId w:val="3"/>
+        </w:numPr>
+        <w:rPr>
+          <w:sz w:val="24"/>
+          <w:szCs w:val="24"/>
+          <w:lang w:val="en-US"/>
+        </w:rPr>
+      </w:pPr>
+      <w:r>
+        <w:rPr>
+          <w:sz w:val="24"/>
+          <w:szCs w:val="24"/>
+          <w:lang w:val="en-US"/>
+        </w:rPr>
+        <w:t>Read all current price and display the highest price.</w:t>
+      </w:r>
+      <w:r>
+        <w:rPr>
+          <w:sz w:val="24"/>
+          <w:szCs w:val="24"/>
+          <w:lang w:val="en-US"/>
+        </w:rPr>
+        <w:br/>
+        <w:t>(Read all the current price, store in array and then sort an array so you will get highest price)</w:t>
+      </w:r>
+    </w:p>
+    <w:p>
+      <w:pPr>
+        <w:pStyle w:val="ListParagraph"/>
+        <w:numPr>
+          <w:ilvl w:val="0"/>
+          <w:numId w:val="3"/>
+        </w:numPr>
+        <w:rPr>
+          <w:sz w:val="24"/>
+          <w:szCs w:val="24"/>
+          <w:lang w:val="en-US"/>
+        </w:rPr>
+      </w:pPr>
+      <w:bookmarkStart w:id="0" w:name="_GoBack"/>
+      <w:bookmarkEnd w:id="0"/>
     </w:p>
     <w:sectPr>
       <w:pgSz w:w="11906" w:h="16838"/>
@@ -4005,6 +4407,54 @@
       <w:u w:val="single"/>
     </w:rPr>
   </w:style>
+  <w:style w:type="paragraph" w:styleId="HTMLPreformatted">
+    <w:name w:val="HTML Preformatted"/>
+    <w:basedOn w:val="Normal"/>
+    <w:link w:val="HTMLPreformattedChar"/>
+    <w:uiPriority w:val="99"/>
+    <w:semiHidden/>
+    <w:unhideWhenUsed/>
+    <w:rsid w:val="00405905"/>
+    <w:pPr>
+      <w:tabs>
+        <w:tab w:val="left" w:pos="916"/>
+        <w:tab w:val="left" w:pos="1832"/>
+        <w:tab w:val="left" w:pos="2748"/>
+        <w:tab w:val="left" w:pos="3664"/>
+        <w:tab w:val="left" w:pos="4580"/>
+        <w:tab w:val="left" w:pos="5496"/>
+        <w:tab w:val="left" w:pos="6412"/>
+        <w:tab w:val="left" w:pos="7328"/>
+        <w:tab w:val="left" w:pos="8244"/>
+        <w:tab w:val="left" w:pos="9160"/>
+        <w:tab w:val="left" w:pos="10076"/>
+        <w:tab w:val="left" w:pos="10992"/>
+        <w:tab w:val="left" w:pos="11908"/>
+        <w:tab w:val="left" w:pos="12824"/>
+        <w:tab w:val="left" w:pos="13740"/>
+        <w:tab w:val="left" w:pos="14656"/>
+      </w:tabs>
+      <w:spacing w:after="0" w:line="240" w:lineRule="auto"/>
+    </w:pPr>
+    <w:rPr>
+      <w:rFonts w:ascii="Courier New" w:eastAsia="Times New Roman" w:hAnsi="Courier New" w:cs="Courier New"/>
+      <w:sz w:val="20"/>
+      <w:lang w:eastAsia="en-IN"/>
+    </w:rPr>
+  </w:style>
+  <w:style w:type="character" w:customStyle="1" w:styleId="HTMLPreformattedChar">
+    <w:name w:val="HTML Preformatted Char"/>
+    <w:basedOn w:val="DefaultParagraphFont"/>
+    <w:link w:val="HTMLPreformatted"/>
+    <w:uiPriority w:val="99"/>
+    <w:semiHidden/>
+    <w:rsid w:val="00405905"/>
+    <w:rPr>
+      <w:rFonts w:ascii="Courier New" w:eastAsia="Times New Roman" w:hAnsi="Courier New" w:cs="Courier New"/>
+      <w:sz w:val="20"/>
+      <w:lang w:eastAsia="en-IN"/>
+    </w:rPr>
+  </w:style>
 </w:styles>
 </file>
 

</xml_diff>

<commit_message>
Date: 08 Mar 2026
</commit_message>
<xml_diff>
--- a/Assignments.docx
+++ b/Assignments.docx
@@ -3350,17 +3350,227 @@
         <w:r>
           <w:rPr>
             <w:rStyle w:val="Hyperlink"/>
+          </w:rPr>
+          <w:t>https://demo.guru99.com/test/web-table-element.php</w:t>
+        </w:r>
+      </w:hyperlink>
+      <w:r>
+        <w:t xml:space="preserve"> </w:t>
+      </w:r>
+    </w:p>
+    <w:p>
+      <w:pPr>
+        <w:pStyle w:val="ListParagraph"/>
+        <w:numPr>
+          <w:ilvl w:val="1"/>
+          <w:numId w:val="3"/>
+        </w:numPr>
+        <w:spacing w:line="254" w:lineRule="auto"/>
+        <w:rPr>
+          <w:sz w:val="24"/>
+          <w:szCs w:val="24"/>
+          <w:lang w:val="en-US"/>
+        </w:rPr>
+      </w:pPr>
+      <w:r>
+        <w:rPr>
+          <w:sz w:val="24"/>
+          <w:szCs w:val="24"/>
+          <w:lang w:val="en-US"/>
+        </w:rPr>
+        <w:t>Display title of all the headers</w:t>
+      </w:r>
+    </w:p>
+    <w:p>
+      <w:pPr>
+        <w:pStyle w:val="ListParagraph"/>
+        <w:numPr>
+          <w:ilvl w:val="1"/>
+          <w:numId w:val="3"/>
+        </w:numPr>
+        <w:spacing w:line="254" w:lineRule="auto"/>
+        <w:rPr>
+          <w:sz w:val="24"/>
+          <w:szCs w:val="24"/>
+          <w:lang w:val="en-US"/>
+        </w:rPr>
+      </w:pPr>
+      <w:r>
+        <w:rPr>
+          <w:sz w:val="24"/>
+          <w:szCs w:val="24"/>
+          <w:lang w:val="en-US"/>
+        </w:rPr>
+        <w:t>Display total no of rows</w:t>
+      </w:r>
+    </w:p>
+    <w:p>
+      <w:pPr>
+        <w:pStyle w:val="ListParagraph"/>
+        <w:numPr>
+          <w:ilvl w:val="1"/>
+          <w:numId w:val="3"/>
+        </w:numPr>
+        <w:spacing w:line="254" w:lineRule="auto"/>
+        <w:rPr>
+          <w:sz w:val="24"/>
+          <w:szCs w:val="24"/>
+          <w:lang w:val="en-US"/>
+        </w:rPr>
+      </w:pPr>
+      <w:r>
+        <w:rPr>
+          <w:sz w:val="24"/>
+          <w:szCs w:val="24"/>
+          <w:lang w:val="en-US"/>
+        </w:rPr>
+        <w:lastRenderedPageBreak/>
+        <w:t>Display any row randomly</w:t>
+      </w:r>
+    </w:p>
+    <w:p>
+      <w:pPr>
+        <w:pStyle w:val="ListParagraph"/>
+        <w:numPr>
+          <w:ilvl w:val="1"/>
+          <w:numId w:val="3"/>
+        </w:numPr>
+        <w:spacing w:line="254" w:lineRule="auto"/>
+        <w:rPr>
+          <w:sz w:val="24"/>
+          <w:szCs w:val="24"/>
+          <w:lang w:val="en-US"/>
+        </w:rPr>
+      </w:pPr>
+      <w:r>
+        <w:rPr>
+          <w:sz w:val="24"/>
+          <w:szCs w:val="24"/>
+          <w:lang w:val="en-US"/>
+        </w:rPr>
+        <w:t>Display list of all the companies (Company name only)</w:t>
+      </w:r>
+    </w:p>
+    <w:p>
+      <w:pPr>
+        <w:pStyle w:val="ListParagraph"/>
+        <w:numPr>
+          <w:ilvl w:val="1"/>
+          <w:numId w:val="3"/>
+        </w:numPr>
+        <w:rPr>
+          <w:sz w:val="24"/>
+          <w:szCs w:val="24"/>
+          <w:lang w:val="en-US"/>
+        </w:rPr>
+      </w:pPr>
+      <w:r>
+        <w:rPr>
+          <w:sz w:val="24"/>
+          <w:szCs w:val="24"/>
+          <w:lang w:val="en-US"/>
+        </w:rPr>
+        <w:t>Read all current price and display the highest price.</w:t>
+      </w:r>
+      <w:r>
+        <w:rPr>
+          <w:sz w:val="24"/>
+          <w:szCs w:val="24"/>
+          <w:lang w:val="en-US"/>
+        </w:rPr>
+        <w:br/>
+        <w:t>(Read all the current price, store</w:t>
+      </w:r>
+      <w:r>
+        <w:rPr>
+          <w:sz w:val="24"/>
+          <w:szCs w:val="24"/>
+          <w:lang w:val="en-US"/>
+        </w:rPr>
+        <w:t xml:space="preserve"> all</w:t>
+      </w:r>
+      <w:r>
+        <w:rPr>
+          <w:sz w:val="24"/>
+          <w:szCs w:val="24"/>
+          <w:lang w:val="en-US"/>
+        </w:rPr>
+        <w:t xml:space="preserve"> </w:t>
+      </w:r>
+      <w:r>
+        <w:rPr>
+          <w:sz w:val="24"/>
+          <w:szCs w:val="24"/>
+          <w:lang w:val="en-US"/>
+        </w:rPr>
+        <w:t xml:space="preserve">the values </w:t>
+      </w:r>
+      <w:r>
+        <w:rPr>
+          <w:sz w:val="24"/>
+          <w:szCs w:val="24"/>
+          <w:lang w:val="en-US"/>
+        </w:rPr>
+        <w:t>in</w:t>
+      </w:r>
+      <w:r>
+        <w:rPr>
+          <w:sz w:val="24"/>
+          <w:szCs w:val="24"/>
+          <w:lang w:val="en-US"/>
+        </w:rPr>
+        <w:t xml:space="preserve"> an</w:t>
+      </w:r>
+      <w:r>
+        <w:rPr>
+          <w:sz w:val="24"/>
+          <w:szCs w:val="24"/>
+          <w:lang w:val="en-US"/>
+        </w:rPr>
+        <w:t xml:space="preserve"> array and then sort an array so you will get highest price)</w:t>
+      </w:r>
+    </w:p>
+    <w:p>
+      <w:pPr>
+        <w:pStyle w:val="ListParagraph"/>
+        <w:numPr>
+          <w:ilvl w:val="0"/>
+          <w:numId w:val="3"/>
+        </w:numPr>
+        <w:spacing w:line="254" w:lineRule="auto"/>
+        <w:rPr>
+          <w:sz w:val="24"/>
+          <w:szCs w:val="24"/>
+          <w:highlight w:val="red"/>
+          <w:lang w:val="en-US"/>
+        </w:rPr>
+      </w:pPr>
+      <w:r>
+        <w:rPr>
+          <w:sz w:val="24"/>
+          <w:szCs w:val="24"/>
+          <w:highlight w:val="red"/>
+          <w:lang w:val="en-US"/>
+        </w:rPr>
+        <w:t xml:space="preserve">Open </w:t>
+      </w:r>
+      <w:hyperlink r:id="rId20" w:history="1">
+        <w:r>
+          <w:rPr>
+            <w:rStyle w:val="Hyperlink"/>
             <w:sz w:val="24"/>
             <w:szCs w:val="24"/>
+            <w:highlight w:val="red"/>
             <w:lang w:val="en-US"/>
           </w:rPr>
-          <w:t>https://www.rediff.com/</w:t>
+          <w:t>https://demoqa.com/webtables</w:t>
         </w:r>
       </w:hyperlink>
       <w:r>
         <w:rPr>
           <w:sz w:val="24"/>
           <w:szCs w:val="24"/>
+          <w:highlight w:val="red"/>
           <w:lang w:val="en-US"/>
         </w:rPr>
         <w:t xml:space="preserve"> </w:t>
@@ -3377,16 +3587,18 @@
         <w:rPr>
           <w:sz w:val="24"/>
           <w:szCs w:val="24"/>
-          <w:lang w:val="en-US"/>
-        </w:rPr>
-      </w:pPr>
-      <w:r>
-        <w:rPr>
-          <w:sz w:val="24"/>
-          <w:szCs w:val="24"/>
-          <w:lang w:val="en-US"/>
-        </w:rPr>
-        <w:t>Click on Money</w:t>
+          <w:highlight w:val="red"/>
+          <w:lang w:val="en-US"/>
+        </w:rPr>
+      </w:pPr>
+      <w:r>
+        <w:rPr>
+          <w:sz w:val="24"/>
+          <w:szCs w:val="24"/>
+          <w:highlight w:val="red"/>
+          <w:lang w:val="en-US"/>
+        </w:rPr>
+        <w:t>Try to display all header columns</w:t>
       </w:r>
     </w:p>
     <w:p>
@@ -3400,16 +3612,18 @@
         <w:rPr>
           <w:sz w:val="24"/>
           <w:szCs w:val="24"/>
-          <w:lang w:val="en-US"/>
-        </w:rPr>
-      </w:pPr>
-      <w:r>
-        <w:rPr>
-          <w:sz w:val="24"/>
-          <w:szCs w:val="24"/>
-          <w:lang w:val="en-US"/>
-        </w:rPr>
-        <w:t>Click on More Gainers</w:t>
+          <w:highlight w:val="red"/>
+          <w:lang w:val="en-US"/>
+        </w:rPr>
+      </w:pPr>
+      <w:r>
+        <w:rPr>
+          <w:sz w:val="24"/>
+          <w:szCs w:val="24"/>
+          <w:highlight w:val="red"/>
+          <w:lang w:val="en-US"/>
+        </w:rPr>
+        <w:t>Click on Add button</w:t>
       </w:r>
     </w:p>
     <w:p>
@@ -3423,17 +3637,18 @@
         <w:rPr>
           <w:sz w:val="24"/>
           <w:szCs w:val="24"/>
-          <w:lang w:val="en-US"/>
-        </w:rPr>
-      </w:pPr>
-      <w:r>
-        <w:rPr>
-          <w:sz w:val="24"/>
-          <w:szCs w:val="24"/>
-          <w:lang w:val="en-US"/>
-        </w:rPr>
-        <w:lastRenderedPageBreak/>
-        <w:t>Display title of all the headers</w:t>
+          <w:highlight w:val="red"/>
+          <w:lang w:val="en-US"/>
+        </w:rPr>
+      </w:pPr>
+      <w:r>
+        <w:rPr>
+          <w:sz w:val="24"/>
+          <w:szCs w:val="24"/>
+          <w:highlight w:val="red"/>
+          <w:lang w:val="en-US"/>
+        </w:rPr>
+        <w:t>Enter all the data</w:t>
       </w:r>
     </w:p>
     <w:p>
@@ -3447,16 +3662,18 @@
         <w:rPr>
           <w:sz w:val="24"/>
           <w:szCs w:val="24"/>
-          <w:lang w:val="en-US"/>
-        </w:rPr>
-      </w:pPr>
-      <w:r>
-        <w:rPr>
-          <w:sz w:val="24"/>
-          <w:szCs w:val="24"/>
-          <w:lang w:val="en-US"/>
-        </w:rPr>
-        <w:t>Display total no of rows</w:t>
+          <w:highlight w:val="red"/>
+          <w:lang w:val="en-US"/>
+        </w:rPr>
+      </w:pPr>
+      <w:r>
+        <w:rPr>
+          <w:sz w:val="24"/>
+          <w:szCs w:val="24"/>
+          <w:highlight w:val="red"/>
+          <w:lang w:val="en-US"/>
+        </w:rPr>
+        <w:t>Search the first name in First Name column</w:t>
       </w:r>
     </w:p>
     <w:p>
@@ -3470,70 +3687,194 @@
         <w:rPr>
           <w:sz w:val="24"/>
           <w:szCs w:val="24"/>
-          <w:lang w:val="en-US"/>
-        </w:rPr>
-      </w:pPr>
-      <w:r>
-        <w:rPr>
-          <w:sz w:val="24"/>
-          <w:szCs w:val="24"/>
-          <w:lang w:val="en-US"/>
-        </w:rPr>
-        <w:t>Display any row randomly</w:t>
-      </w:r>
-    </w:p>
-    <w:p>
-      <w:pPr>
-        <w:pStyle w:val="ListParagraph"/>
-        <w:numPr>
-          <w:ilvl w:val="1"/>
+          <w:highlight w:val="red"/>
+          <w:lang w:val="en-US"/>
+        </w:rPr>
+      </w:pPr>
+      <w:r>
+        <w:rPr>
+          <w:sz w:val="24"/>
+          <w:szCs w:val="24"/>
+          <w:highlight w:val="red"/>
+          <w:lang w:val="en-US"/>
+        </w:rPr>
+        <w:t>Click on delete button in the same row (Don’t copy the xpath of delete button from last row)</w:t>
+      </w:r>
+    </w:p>
+    <w:p>
+      <w:pPr>
+        <w:pStyle w:val="ListParagraph"/>
+        <w:numPr>
+          <w:ilvl w:val="0"/>
           <w:numId w:val="3"/>
         </w:numPr>
         <w:spacing w:line="254" w:lineRule="auto"/>
         <w:rPr>
           <w:sz w:val="24"/>
           <w:szCs w:val="24"/>
-          <w:lang w:val="en-US"/>
-        </w:rPr>
-      </w:pPr>
-      <w:r>
-        <w:rPr>
-          <w:sz w:val="24"/>
-          <w:szCs w:val="24"/>
-          <w:lang w:val="en-US"/>
-        </w:rPr>
-        <w:t>Display list of all the companies (Company name only)</w:t>
-      </w:r>
-    </w:p>
-    <w:p>
-      <w:pPr>
-        <w:pStyle w:val="ListParagraph"/>
-        <w:numPr>
-          <w:ilvl w:val="1"/>
-          <w:numId w:val="3"/>
-        </w:numPr>
-        <w:rPr>
-          <w:sz w:val="24"/>
-          <w:szCs w:val="24"/>
-          <w:lang w:val="en-US"/>
-        </w:rPr>
-      </w:pPr>
-      <w:r>
-        <w:rPr>
-          <w:sz w:val="24"/>
-          <w:szCs w:val="24"/>
-          <w:lang w:val="en-US"/>
-        </w:rPr>
-        <w:t>Read all current price and display the highest price.</w:t>
-      </w:r>
-      <w:r>
-        <w:rPr>
-          <w:sz w:val="24"/>
-          <w:szCs w:val="24"/>
+          <w:highlight w:val="red"/>
+          <w:lang w:val="en-US"/>
+        </w:rPr>
+      </w:pPr>
+      <w:r>
+        <w:rPr>
+          <w:sz w:val="24"/>
+          <w:szCs w:val="24"/>
+          <w:highlight w:val="red"/>
+          <w:lang w:val="en-US"/>
+        </w:rPr>
+        <w:t xml:space="preserve">Open </w:t>
+      </w:r>
+      <w:hyperlink r:id="rId21" w:history="1">
+        <w:r>
+          <w:rPr>
+            <w:rStyle w:val="Hyperlink"/>
+            <w:sz w:val="24"/>
+            <w:szCs w:val="24"/>
+            <w:highlight w:val="red"/>
+            <w:lang w:val="en-US"/>
+          </w:rPr>
+          <w:t>https://www.iplt20.com/points-table/men/2024</w:t>
+        </w:r>
+      </w:hyperlink>
+      <w:r>
+        <w:rPr>
+          <w:sz w:val="24"/>
+          <w:szCs w:val="24"/>
+          <w:highlight w:val="red"/>
+          <w:lang w:val="en-US"/>
+        </w:rPr>
+        <w:t xml:space="preserve"> </w:t>
+      </w:r>
+    </w:p>
+    <w:p>
+      <w:pPr>
+        <w:pStyle w:val="ListParagraph"/>
+        <w:numPr>
+          <w:ilvl w:val="1"/>
+          <w:numId w:val="3"/>
+        </w:numPr>
+        <w:spacing w:line="254" w:lineRule="auto"/>
+        <w:rPr>
+          <w:sz w:val="24"/>
+          <w:szCs w:val="24"/>
+          <w:highlight w:val="red"/>
+          <w:lang w:val="en-US"/>
+        </w:rPr>
+      </w:pPr>
+      <w:r>
+        <w:rPr>
+          <w:sz w:val="24"/>
+          <w:szCs w:val="24"/>
+          <w:highlight w:val="red"/>
+          <w:lang w:val="en-US"/>
+        </w:rPr>
+        <w:t>Display list of all the Teams</w:t>
+      </w:r>
+    </w:p>
+    <w:p>
+      <w:pPr>
+        <w:pStyle w:val="ListParagraph"/>
+        <w:numPr>
+          <w:ilvl w:val="1"/>
+          <w:numId w:val="3"/>
+        </w:numPr>
+        <w:spacing w:line="254" w:lineRule="auto"/>
+        <w:rPr>
+          <w:sz w:val="24"/>
+          <w:szCs w:val="24"/>
+          <w:highlight w:val="red"/>
+          <w:lang w:val="en-US"/>
+        </w:rPr>
+      </w:pPr>
+      <w:r>
+        <w:rPr>
+          <w:sz w:val="24"/>
+          <w:szCs w:val="24"/>
+          <w:highlight w:val="red"/>
+          <w:lang w:val="en-US"/>
+        </w:rPr>
+        <w:t>Display all result of each team about N W L</w:t>
+      </w:r>
+    </w:p>
+    <w:p>
+      <w:pPr>
+        <w:pStyle w:val="ListParagraph"/>
+        <w:numPr>
+          <w:ilvl w:val="1"/>
+          <w:numId w:val="3"/>
+        </w:numPr>
+        <w:spacing w:line="254" w:lineRule="auto"/>
+        <w:rPr>
+          <w:sz w:val="24"/>
+          <w:szCs w:val="24"/>
+          <w:highlight w:val="red"/>
+          <w:lang w:val="en-US"/>
+        </w:rPr>
+      </w:pPr>
+      <w:r>
+        <w:rPr>
+          <w:sz w:val="24"/>
+          <w:szCs w:val="24"/>
+          <w:highlight w:val="red"/>
+          <w:lang w:val="en-US"/>
+        </w:rPr>
+        <w:t>Display count of N, W &amp; L</w:t>
+      </w:r>
+    </w:p>
+    <w:p>
+      <w:pPr>
+        <w:pStyle w:val="ListParagraph"/>
+        <w:numPr>
+          <w:ilvl w:val="1"/>
+          <w:numId w:val="3"/>
+        </w:numPr>
+        <w:spacing w:line="254" w:lineRule="auto"/>
+        <w:rPr>
+          <w:sz w:val="24"/>
+          <w:szCs w:val="24"/>
+          <w:highlight w:val="red"/>
+          <w:lang w:val="en-US"/>
+        </w:rPr>
+      </w:pPr>
+      <w:r>
+        <w:rPr>
+          <w:sz w:val="24"/>
+          <w:szCs w:val="24"/>
+          <w:highlight w:val="red"/>
+          <w:lang w:val="en-US"/>
+        </w:rPr>
+        <w:t>Display the result as follow</w:t>
+      </w:r>
+      <w:r>
+        <w:rPr>
+          <w:sz w:val="24"/>
+          <w:szCs w:val="24"/>
+          <w:highlight w:val="red"/>
           <w:lang w:val="en-US"/>
         </w:rPr>
         <w:br/>
-        <w:t>(Read all the current price, store in array and then sort an array so you will get highest price)</w:t>
+        <w:t>KKR</w:t>
+      </w:r>
+      <w:r>
+        <w:rPr>
+          <w:sz w:val="24"/>
+          <w:szCs w:val="24"/>
+          <w:highlight w:val="red"/>
+          <w:lang w:val="en-US"/>
+        </w:rPr>
+        <w:tab/>
+        <w:t>NNWWW</w:t>
+      </w:r>
+      <w:r>
+        <w:rPr>
+          <w:sz w:val="24"/>
+          <w:szCs w:val="24"/>
+          <w:highlight w:val="red"/>
+          <w:lang w:val="en-US"/>
+        </w:rPr>
+        <w:tab/>
+        <w:t>N-2, W-3, L-0</w:t>
       </w:r>
     </w:p>
     <w:p>
@@ -3545,12 +3886,163 @@
         </w:numPr>
         <w:rPr>
           <w:sz w:val="24"/>
-          <w:szCs w:val="24"/>
-          <w:lang w:val="en-US"/>
-        </w:rPr>
-      </w:pPr>
+          <w:szCs w:val="22"/>
+          <w:highlight w:val="red"/>
+          <w:lang w:val="en-US"/>
+        </w:rPr>
+      </w:pPr>
+      <w:r>
+        <w:rPr>
+          <w:sz w:val="24"/>
+          <w:szCs w:val="22"/>
+          <w:highlight w:val="red"/>
+          <w:lang w:val="en-US"/>
+        </w:rPr>
+        <w:t xml:space="preserve">Launch </w:t>
+      </w:r>
+      <w:hyperlink r:id="rId22" w:history="1">
+        <w:r>
+          <w:rPr>
+            <w:rStyle w:val="Hyperlink"/>
+            <w:sz w:val="24"/>
+            <w:szCs w:val="22"/>
+            <w:highlight w:val="red"/>
+            <w:lang w:val="en-US"/>
+          </w:rPr>
+          <w:t>https://testautomationpractice.blogspot.com/?m=1</w:t>
+        </w:r>
+      </w:hyperlink>
+    </w:p>
+    <w:p>
+      <w:pPr>
+        <w:pStyle w:val="ListParagraph"/>
+        <w:numPr>
+          <w:ilvl w:val="1"/>
+          <w:numId w:val="3"/>
+        </w:numPr>
+        <w:rPr>
+          <w:sz w:val="24"/>
+          <w:szCs w:val="22"/>
+          <w:highlight w:val="red"/>
+          <w:lang w:val="en-US"/>
+        </w:rPr>
+      </w:pPr>
+      <w:r>
+        <w:rPr>
+          <w:sz w:val="24"/>
+          <w:szCs w:val="22"/>
+          <w:highlight w:val="red"/>
+          <w:lang w:val="en-US"/>
+        </w:rPr>
+        <w:t>On Pagination Web Table get total no of Pages</w:t>
+      </w:r>
+    </w:p>
+    <w:p>
+      <w:pPr>
+        <w:pStyle w:val="ListParagraph"/>
+        <w:numPr>
+          <w:ilvl w:val="1"/>
+          <w:numId w:val="3"/>
+        </w:numPr>
+        <w:rPr>
+          <w:sz w:val="24"/>
+          <w:szCs w:val="22"/>
+          <w:highlight w:val="red"/>
+          <w:lang w:val="en-US"/>
+        </w:rPr>
+      </w:pPr>
+      <w:r>
+        <w:rPr>
+          <w:sz w:val="24"/>
+          <w:szCs w:val="22"/>
+          <w:highlight w:val="red"/>
+          <w:lang w:val="en-US"/>
+        </w:rPr>
+        <w:t>Open each page (Click on each page number)</w:t>
+      </w:r>
+    </w:p>
+    <w:p>
+      <w:pPr>
+        <w:pStyle w:val="ListParagraph"/>
+        <w:numPr>
+          <w:ilvl w:val="1"/>
+          <w:numId w:val="3"/>
+        </w:numPr>
+        <w:rPr>
+          <w:sz w:val="24"/>
+          <w:szCs w:val="22"/>
+          <w:highlight w:val="red"/>
+          <w:lang w:val="en-US"/>
+        </w:rPr>
+      </w:pPr>
+      <w:r>
+        <w:rPr>
+          <w:sz w:val="24"/>
+          <w:szCs w:val="22"/>
+          <w:highlight w:val="red"/>
+          <w:lang w:val="en-US"/>
+        </w:rPr>
+        <w:t>Display no of rows on each page</w:t>
+      </w:r>
+    </w:p>
+    <w:p>
+      <w:pPr>
+        <w:pStyle w:val="ListParagraph"/>
+        <w:numPr>
+          <w:ilvl w:val="1"/>
+          <w:numId w:val="3"/>
+        </w:numPr>
+        <w:rPr>
+          <w:sz w:val="24"/>
+          <w:szCs w:val="22"/>
+          <w:highlight w:val="red"/>
+          <w:lang w:val="en-US"/>
+        </w:rPr>
+      </w:pPr>
+      <w:r>
+        <w:rPr>
+          <w:sz w:val="24"/>
+          <w:szCs w:val="22"/>
+          <w:highlight w:val="red"/>
+          <w:lang w:val="en-US"/>
+        </w:rPr>
+        <w:t>Also calculate total no of rows on all pages</w:t>
+      </w:r>
+    </w:p>
+    <w:p>
+      <w:pPr>
+        <w:pStyle w:val="ListParagraph"/>
+        <w:numPr>
+          <w:ilvl w:val="1"/>
+          <w:numId w:val="3"/>
+        </w:numPr>
+        <w:rPr>
+          <w:sz w:val="24"/>
+          <w:szCs w:val="24"/>
+          <w:highlight w:val="red"/>
+          <w:lang w:val="en-US"/>
+        </w:rPr>
+      </w:pPr>
+      <w:r>
+        <w:rPr>
+          <w:sz w:val="24"/>
+          <w:szCs w:val="22"/>
+          <w:highlight w:val="red"/>
+          <w:lang w:val="en-US"/>
+        </w:rPr>
+        <w:t>Select every</w:t>
+      </w:r>
       <w:bookmarkStart w:id="0" w:name="_GoBack"/>
       <w:bookmarkEnd w:id="0"/>
+      <w:r>
+        <w:rPr>
+          <w:sz w:val="24"/>
+          <w:szCs w:val="22"/>
+          <w:highlight w:val="red"/>
+          <w:lang w:val="en-US"/>
+        </w:rPr>
+        <w:t xml:space="preserve"> check box on each page from every row.</w:t>
+      </w:r>
     </w:p>
     <w:sectPr>
       <w:pgSz w:w="11906" w:h="16838"/>
@@ -3843,6 +4335,95 @@
       <w:pPr>
         <w:ind w:left="720" w:hanging="360"/>
       </w:pPr>
+    </w:lvl>
+    <w:lvl w:ilvl="1" w:tplc="40090019">
+      <w:start w:val="1"/>
+      <w:numFmt w:val="lowerLetter"/>
+      <w:lvlText w:val="%2."/>
+      <w:lvlJc w:val="left"/>
+      <w:pPr>
+        <w:ind w:left="1440" w:hanging="360"/>
+      </w:pPr>
+    </w:lvl>
+    <w:lvl w:ilvl="2" w:tplc="4009001B" w:tentative="1">
+      <w:start w:val="1"/>
+      <w:numFmt w:val="lowerRoman"/>
+      <w:lvlText w:val="%3."/>
+      <w:lvlJc w:val="right"/>
+      <w:pPr>
+        <w:ind w:left="2160" w:hanging="180"/>
+      </w:pPr>
+    </w:lvl>
+    <w:lvl w:ilvl="3" w:tplc="4009000F" w:tentative="1">
+      <w:start w:val="1"/>
+      <w:numFmt w:val="decimal"/>
+      <w:lvlText w:val="%4."/>
+      <w:lvlJc w:val="left"/>
+      <w:pPr>
+        <w:ind w:left="2880" w:hanging="360"/>
+      </w:pPr>
+    </w:lvl>
+    <w:lvl w:ilvl="4" w:tplc="40090019" w:tentative="1">
+      <w:start w:val="1"/>
+      <w:numFmt w:val="lowerLetter"/>
+      <w:lvlText w:val="%5."/>
+      <w:lvlJc w:val="left"/>
+      <w:pPr>
+        <w:ind w:left="3600" w:hanging="360"/>
+      </w:pPr>
+    </w:lvl>
+    <w:lvl w:ilvl="5" w:tplc="4009001B" w:tentative="1">
+      <w:start w:val="1"/>
+      <w:numFmt w:val="lowerRoman"/>
+      <w:lvlText w:val="%6."/>
+      <w:lvlJc w:val="right"/>
+      <w:pPr>
+        <w:ind w:left="4320" w:hanging="180"/>
+      </w:pPr>
+    </w:lvl>
+    <w:lvl w:ilvl="6" w:tplc="4009000F" w:tentative="1">
+      <w:start w:val="1"/>
+      <w:numFmt w:val="decimal"/>
+      <w:lvlText w:val="%7."/>
+      <w:lvlJc w:val="left"/>
+      <w:pPr>
+        <w:ind w:left="5040" w:hanging="360"/>
+      </w:pPr>
+    </w:lvl>
+    <w:lvl w:ilvl="7" w:tplc="40090019" w:tentative="1">
+      <w:start w:val="1"/>
+      <w:numFmt w:val="lowerLetter"/>
+      <w:lvlText w:val="%8."/>
+      <w:lvlJc w:val="left"/>
+      <w:pPr>
+        <w:ind w:left="5760" w:hanging="360"/>
+      </w:pPr>
+    </w:lvl>
+    <w:lvl w:ilvl="8" w:tplc="4009001B" w:tentative="1">
+      <w:start w:val="1"/>
+      <w:numFmt w:val="lowerRoman"/>
+      <w:lvlText w:val="%9."/>
+      <w:lvlJc w:val="right"/>
+      <w:pPr>
+        <w:ind w:left="6480" w:hanging="180"/>
+      </w:pPr>
+    </w:lvl>
+  </w:abstractNum>
+  <w:abstractNum w:abstractNumId="4">
+    <w:nsid w:val="79C1442D"/>
+    <w:multiLevelType w:val="hybridMultilevel"/>
+    <w:tmpl w:val="5E50A9F0"/>
+    <w:lvl w:ilvl="0" w:tplc="4009000F">
+      <w:start w:val="1"/>
+      <w:numFmt w:val="decimal"/>
+      <w:lvlText w:val="%1."/>
+      <w:lvlJc w:val="left"/>
+      <w:pPr>
+        <w:ind w:left="720" w:hanging="360"/>
+      </w:pPr>
+      <w:rPr>
+        <w:rFonts w:hint="default"/>
+      </w:rPr>
     </w:lvl>
     <w:lvl w:ilvl="1" w:tplc="40090019">
       <w:start w:val="1"/>
@@ -3958,6 +4539,9 @@
   </w:num>
   <w:num w:numId="5">
     <w:abstractNumId w:val="1"/>
+  </w:num>
+  <w:num w:numId="6">
+    <w:abstractNumId w:val="4"/>
   </w:num>
 </w:numbering>
 </file>
@@ -4455,6 +5039,18 @@
       <w:lang w:eastAsia="en-IN"/>
     </w:rPr>
   </w:style>
+  <w:style w:type="character" w:styleId="FollowedHyperlink">
+    <w:name w:val="FollowedHyperlink"/>
+    <w:basedOn w:val="DefaultParagraphFont"/>
+    <w:uiPriority w:val="99"/>
+    <w:semiHidden/>
+    <w:unhideWhenUsed/>
+    <w:rsid w:val="00470104"/>
+    <w:rPr>
+      <w:color w:val="954F72" w:themeColor="followedHyperlink"/>
+      <w:u w:val="single"/>
+    </w:rPr>
+  </w:style>
 </w:styles>
 </file>
 

</xml_diff>

<commit_message>
Date: 15 Mar 2026
</commit_message>
<xml_diff>
--- a/Assignments.docx
+++ b/Assignments.docx
@@ -4030,19 +4030,178 @@
           <w:highlight w:val="red"/>
           <w:lang w:val="en-US"/>
         </w:rPr>
-        <w:t>Select every</w:t>
-      </w:r>
+        <w:t>Select every check box on each page from every row.</w:t>
+      </w:r>
+    </w:p>
+    <w:p>
+      <w:pPr>
+        <w:pStyle w:val="ListParagraph"/>
+        <w:numPr>
+          <w:ilvl w:val="0"/>
+          <w:numId w:val="3"/>
+        </w:numPr>
+        <w:rPr>
+          <w:sz w:val="24"/>
+          <w:szCs w:val="24"/>
+          <w:lang w:val="en-US"/>
+        </w:rPr>
+      </w:pPr>
+      <w:r>
+        <w:rPr>
+          <w:sz w:val="24"/>
+          <w:szCs w:val="24"/>
+          <w:lang w:val="en-US"/>
+        </w:rPr>
+        <w:t xml:space="preserve">Launch </w:t>
+      </w:r>
+      <w:hyperlink r:id="rId23" w:history="1">
+        <w:r>
+          <w:rPr>
+            <w:rStyle w:val="Hyperlink"/>
+            <w:sz w:val="24"/>
+            <w:szCs w:val="24"/>
+            <w:lang w:val="en-US"/>
+          </w:rPr>
+          <w:t>https://demoqa.com/automation-practice-form</w:t>
+        </w:r>
+      </w:hyperlink>
+    </w:p>
+    <w:p>
+      <w:pPr>
+        <w:pStyle w:val="ListParagraph"/>
+        <w:numPr>
+          <w:ilvl w:val="1"/>
+          <w:numId w:val="3"/>
+        </w:numPr>
+        <w:rPr>
+          <w:sz w:val="24"/>
+          <w:szCs w:val="24"/>
+          <w:lang w:val="en-US"/>
+        </w:rPr>
+      </w:pPr>
+      <w:r>
+        <w:rPr>
+          <w:sz w:val="24"/>
+          <w:szCs w:val="24"/>
+          <w:lang w:val="en-US"/>
+        </w:rPr>
+        <w:t>Complete the registration process</w:t>
+      </w:r>
+    </w:p>
+    <w:p>
+      <w:pPr>
+        <w:pStyle w:val="ListParagraph"/>
+        <w:numPr>
+          <w:ilvl w:val="1"/>
+          <w:numId w:val="3"/>
+        </w:numPr>
+        <w:rPr>
+          <w:sz w:val="24"/>
+          <w:szCs w:val="24"/>
+          <w:lang w:val="en-US"/>
+        </w:rPr>
+      </w:pPr>
+      <w:r>
+        <w:rPr>
+          <w:sz w:val="24"/>
+          <w:szCs w:val="24"/>
+          <w:lang w:val="en-US"/>
+        </w:rPr>
+        <w:t>Click on Submit button</w:t>
+      </w:r>
+    </w:p>
+    <w:p>
+      <w:pPr>
+        <w:pStyle w:val="ListParagraph"/>
+        <w:numPr>
+          <w:ilvl w:val="1"/>
+          <w:numId w:val="3"/>
+        </w:numPr>
+        <w:rPr>
+          <w:sz w:val="24"/>
+          <w:szCs w:val="24"/>
+          <w:lang w:val="en-US"/>
+        </w:rPr>
+      </w:pPr>
+      <w:r>
+        <w:rPr>
+          <w:sz w:val="24"/>
+          <w:szCs w:val="24"/>
+          <w:lang w:val="en-US"/>
+        </w:rPr>
+        <w:t>Display the table which will be displayed after submitting this page</w:t>
+      </w:r>
+    </w:p>
+    <w:p>
+      <w:pPr>
+        <w:pStyle w:val="ListParagraph"/>
+        <w:numPr>
+          <w:ilvl w:val="0"/>
+          <w:numId w:val="3"/>
+        </w:numPr>
+        <w:rPr>
+          <w:sz w:val="24"/>
+          <w:szCs w:val="24"/>
+          <w:lang w:val="en-US"/>
+        </w:rPr>
+      </w:pPr>
+      <w:r>
+        <w:rPr>
+          <w:sz w:val="24"/>
+          <w:szCs w:val="24"/>
+          <w:lang w:val="en-US"/>
+        </w:rPr>
+        <w:t xml:space="preserve">Launch </w:t>
+      </w:r>
+      <w:hyperlink r:id="rId24" w:history="1">
+        <w:r>
+          <w:rPr>
+            <w:rStyle w:val="Hyperlink"/>
+            <w:sz w:val="24"/>
+            <w:szCs w:val="24"/>
+            <w:lang w:val="en-US"/>
+          </w:rPr>
+          <w:t>https://istqb.in/</w:t>
+        </w:r>
+      </w:hyperlink>
+    </w:p>
+    <w:p>
+      <w:pPr>
+        <w:pStyle w:val="ListParagraph"/>
+        <w:numPr>
+          <w:ilvl w:val="1"/>
+          <w:numId w:val="3"/>
+        </w:numPr>
+        <w:rPr>
+          <w:sz w:val="24"/>
+          <w:szCs w:val="24"/>
+          <w:lang w:val="en-US"/>
+        </w:rPr>
+      </w:pPr>
+      <w:r>
+        <w:rPr>
+          <w:sz w:val="24"/>
+          <w:szCs w:val="24"/>
+          <w:lang w:val="en-US"/>
+        </w:rPr>
+        <w:t>Display all 8 menus</w:t>
+      </w:r>
+    </w:p>
+    <w:p>
+      <w:pPr>
+        <w:pStyle w:val="ListParagraph"/>
+        <w:numPr>
+          <w:ilvl w:val="0"/>
+          <w:numId w:val="3"/>
+        </w:numPr>
+        <w:rPr>
+          <w:sz w:val="24"/>
+          <w:szCs w:val="24"/>
+          <w:lang w:val="en-US"/>
+        </w:rPr>
+      </w:pPr>
       <w:bookmarkStart w:id="0" w:name="_GoBack"/>
       <w:bookmarkEnd w:id="0"/>
-      <w:r>
-        <w:rPr>
-          <w:sz w:val="24"/>
-          <w:szCs w:val="22"/>
-          <w:highlight w:val="red"/>
-          <w:lang w:val="en-US"/>
-        </w:rPr>
-        <w:t xml:space="preserve"> check box on each page from every row.</w:t>
-      </w:r>
     </w:p>
     <w:sectPr>
       <w:pgSz w:w="11906" w:h="16838"/>

</xml_diff>

<commit_message>
Date: 22 Mar 2026
</commit_message>
<xml_diff>
--- a/Assignments.docx
+++ b/Assignments.docx
@@ -4189,17 +4189,591 @@
     </w:p>
     <w:p>
       <w:pPr>
-        <w:pStyle w:val="ListParagraph"/>
-        <w:numPr>
-          <w:ilvl w:val="0"/>
-          <w:numId w:val="3"/>
-        </w:numPr>
-        <w:rPr>
-          <w:sz w:val="24"/>
-          <w:szCs w:val="24"/>
-          <w:lang w:val="en-US"/>
-        </w:rPr>
-      </w:pPr>
+        <w:rPr>
+          <w:sz w:val="24"/>
+          <w:szCs w:val="24"/>
+          <w:lang w:val="en-US"/>
+        </w:rPr>
+      </w:pPr>
+    </w:p>
+    <w:p>
+      <w:pPr>
+        <w:rPr>
+          <w:sz w:val="24"/>
+          <w:szCs w:val="24"/>
+          <w:lang w:val="en-US"/>
+        </w:rPr>
+      </w:pPr>
+    </w:p>
+    <w:p>
+      <w:pPr>
+        <w:rPr>
+          <w:sz w:val="24"/>
+          <w:szCs w:val="24"/>
+          <w:lang w:val="en-US"/>
+        </w:rPr>
+      </w:pPr>
+      <w:r>
+        <w:rPr>
+          <w:sz w:val="24"/>
+          <w:szCs w:val="24"/>
+          <w:lang w:val="en-US"/>
+        </w:rPr>
+        <w:br w:type="page"/>
+      </w:r>
+    </w:p>
+    <w:p>
+      <w:pPr>
+        <w:rPr>
+          <w:sz w:val="24"/>
+          <w:szCs w:val="24"/>
+          <w:lang w:val="en-US"/>
+        </w:rPr>
+      </w:pPr>
+      <w:r>
+        <w:rPr>
+          <w:sz w:val="24"/>
+          <w:szCs w:val="24"/>
+          <w:lang w:val="en-US"/>
+        </w:rPr>
+        <w:lastRenderedPageBreak/>
+        <w:t>TestNG Assignment</w:t>
+      </w:r>
+    </w:p>
+    <w:p>
+      <w:pPr>
+        <w:pStyle w:val="ListParagraph"/>
+        <w:numPr>
+          <w:ilvl w:val="3"/>
+          <w:numId w:val="2"/>
+        </w:numPr>
+        <w:ind w:left="426"/>
+        <w:rPr>
+          <w:sz w:val="24"/>
+          <w:szCs w:val="24"/>
+          <w:lang w:val="en-US"/>
+        </w:rPr>
+      </w:pPr>
+      <w:r>
+        <w:rPr>
+          <w:sz w:val="24"/>
+          <w:szCs w:val="24"/>
+          <w:lang w:val="en-US"/>
+        </w:rPr>
+        <w:t>Selenium Site Assignment</w:t>
+      </w:r>
+    </w:p>
+    <w:p>
+      <w:pPr>
+        <w:pStyle w:val="ListParagraph"/>
+        <w:numPr>
+          <w:ilvl w:val="4"/>
+          <w:numId w:val="2"/>
+        </w:numPr>
+        <w:ind w:left="1134"/>
+        <w:rPr>
+          <w:sz w:val="24"/>
+          <w:szCs w:val="24"/>
+          <w:lang w:val="en-US"/>
+        </w:rPr>
+      </w:pPr>
+      <w:r>
+        <w:rPr>
+          <w:sz w:val="24"/>
+          <w:szCs w:val="24"/>
+          <w:lang w:val="en-US"/>
+        </w:rPr>
+        <w:t xml:space="preserve">Open </w:t>
+      </w:r>
+      <w:hyperlink r:id="rId25" w:history="1">
+        <w:r>
+          <w:rPr>
+            <w:rStyle w:val="Hyperlink"/>
+            <w:sz w:val="24"/>
+            <w:szCs w:val="24"/>
+            <w:lang w:val="en-US"/>
+          </w:rPr>
+          <w:t>https://www.selenium.dev/</w:t>
+        </w:r>
+      </w:hyperlink>
+    </w:p>
+    <w:p>
+      <w:pPr>
+        <w:pStyle w:val="ListParagraph"/>
+        <w:numPr>
+          <w:ilvl w:val="4"/>
+          <w:numId w:val="2"/>
+        </w:numPr>
+        <w:ind w:left="1134"/>
+        <w:rPr>
+          <w:sz w:val="24"/>
+          <w:szCs w:val="24"/>
+          <w:lang w:val="en-US"/>
+        </w:rPr>
+      </w:pPr>
+      <w:r>
+        <w:rPr>
+          <w:sz w:val="24"/>
+          <w:szCs w:val="24"/>
+          <w:lang w:val="en-US"/>
+        </w:rPr>
+        <w:t>Print title</w:t>
+      </w:r>
+    </w:p>
+    <w:p>
+      <w:pPr>
+        <w:pStyle w:val="ListParagraph"/>
+        <w:numPr>
+          <w:ilvl w:val="4"/>
+          <w:numId w:val="2"/>
+        </w:numPr>
+        <w:ind w:left="1134"/>
+        <w:rPr>
+          <w:b/>
+          <w:bCs/>
+          <w:sz w:val="24"/>
+          <w:szCs w:val="24"/>
+          <w:lang w:val="en-US"/>
+        </w:rPr>
+      </w:pPr>
+      <w:r>
+        <w:rPr>
+          <w:b/>
+          <w:bCs/>
+          <w:sz w:val="24"/>
+          <w:szCs w:val="24"/>
+          <w:lang w:val="en-US"/>
+        </w:rPr>
+        <w:t>Click on Downloads link</w:t>
+      </w:r>
+    </w:p>
+    <w:p>
+      <w:pPr>
+        <w:pStyle w:val="ListParagraph"/>
+        <w:numPr>
+          <w:ilvl w:val="4"/>
+          <w:numId w:val="2"/>
+        </w:numPr>
+        <w:ind w:left="1134"/>
+        <w:rPr>
+          <w:sz w:val="24"/>
+          <w:szCs w:val="24"/>
+          <w:lang w:val="en-US"/>
+        </w:rPr>
+      </w:pPr>
+      <w:r>
+        <w:rPr>
+          <w:sz w:val="24"/>
+          <w:szCs w:val="24"/>
+          <w:lang w:val="en-US"/>
+        </w:rPr>
+        <w:t>Print title</w:t>
+      </w:r>
+      <w:r>
+        <w:rPr>
+          <w:sz w:val="24"/>
+          <w:szCs w:val="24"/>
+          <w:lang w:val="en-US"/>
+        </w:rPr>
+        <w:br/>
+      </w:r>
+    </w:p>
+    <w:p>
+      <w:pPr>
+        <w:pStyle w:val="ListParagraph"/>
+        <w:numPr>
+          <w:ilvl w:val="4"/>
+          <w:numId w:val="2"/>
+        </w:numPr>
+        <w:ind w:left="1134"/>
+        <w:rPr>
+          <w:sz w:val="24"/>
+          <w:szCs w:val="24"/>
+          <w:lang w:val="en-US"/>
+        </w:rPr>
+      </w:pPr>
+      <w:r>
+        <w:rPr>
+          <w:sz w:val="24"/>
+          <w:szCs w:val="24"/>
+          <w:lang w:val="en-US"/>
+        </w:rPr>
+        <w:t xml:space="preserve">Open </w:t>
+      </w:r>
+      <w:hyperlink r:id="rId26" w:history="1">
+        <w:r>
+          <w:rPr>
+            <w:rStyle w:val="Hyperlink"/>
+            <w:sz w:val="24"/>
+            <w:szCs w:val="24"/>
+            <w:lang w:val="en-US"/>
+          </w:rPr>
+          <w:t>https://www.selenium.dev/</w:t>
+        </w:r>
+      </w:hyperlink>
+    </w:p>
+    <w:p>
+      <w:pPr>
+        <w:pStyle w:val="ListParagraph"/>
+        <w:numPr>
+          <w:ilvl w:val="4"/>
+          <w:numId w:val="2"/>
+        </w:numPr>
+        <w:ind w:left="1134"/>
+        <w:rPr>
+          <w:sz w:val="24"/>
+          <w:szCs w:val="24"/>
+          <w:lang w:val="en-US"/>
+        </w:rPr>
+      </w:pPr>
+      <w:r>
+        <w:rPr>
+          <w:sz w:val="24"/>
+          <w:szCs w:val="24"/>
+          <w:lang w:val="en-US"/>
+        </w:rPr>
+        <w:t>Print title</w:t>
+      </w:r>
+    </w:p>
+    <w:p>
+      <w:pPr>
+        <w:pStyle w:val="ListParagraph"/>
+        <w:numPr>
+          <w:ilvl w:val="4"/>
+          <w:numId w:val="2"/>
+        </w:numPr>
+        <w:ind w:left="1134"/>
+        <w:rPr>
+          <w:b/>
+          <w:bCs/>
+          <w:sz w:val="24"/>
+          <w:szCs w:val="24"/>
+          <w:lang w:val="en-US"/>
+        </w:rPr>
+      </w:pPr>
+      <w:r>
+        <w:rPr>
+          <w:b/>
+          <w:bCs/>
+          <w:sz w:val="24"/>
+          <w:szCs w:val="24"/>
+          <w:lang w:val="en-US"/>
+        </w:rPr>
+        <w:t xml:space="preserve">Click on </w:t>
+      </w:r>
+      <w:r>
+        <w:rPr>
+          <w:b/>
+          <w:bCs/>
+          <w:sz w:val="24"/>
+          <w:szCs w:val="24"/>
+          <w:lang w:val="en-US"/>
+        </w:rPr>
+        <w:t>Documentation</w:t>
+      </w:r>
+      <w:r>
+        <w:rPr>
+          <w:b/>
+          <w:bCs/>
+          <w:sz w:val="24"/>
+          <w:szCs w:val="24"/>
+          <w:lang w:val="en-US"/>
+        </w:rPr>
+        <w:t xml:space="preserve"> link</w:t>
+      </w:r>
+    </w:p>
+    <w:p>
+      <w:pPr>
+        <w:pStyle w:val="ListParagraph"/>
+        <w:numPr>
+          <w:ilvl w:val="4"/>
+          <w:numId w:val="2"/>
+        </w:numPr>
+        <w:ind w:left="1134"/>
+        <w:rPr>
+          <w:sz w:val="24"/>
+          <w:szCs w:val="24"/>
+          <w:lang w:val="en-US"/>
+        </w:rPr>
+      </w:pPr>
+      <w:r>
+        <w:rPr>
+          <w:sz w:val="24"/>
+          <w:szCs w:val="24"/>
+          <w:lang w:val="en-US"/>
+        </w:rPr>
+        <w:t>Print title</w:t>
+      </w:r>
+      <w:r>
+        <w:rPr>
+          <w:sz w:val="24"/>
+          <w:szCs w:val="24"/>
+          <w:lang w:val="en-US"/>
+        </w:rPr>
+        <w:br/>
+      </w:r>
+    </w:p>
+    <w:p>
+      <w:pPr>
+        <w:pStyle w:val="ListParagraph"/>
+        <w:numPr>
+          <w:ilvl w:val="4"/>
+          <w:numId w:val="2"/>
+        </w:numPr>
+        <w:ind w:left="1134"/>
+        <w:rPr>
+          <w:sz w:val="24"/>
+          <w:szCs w:val="24"/>
+          <w:lang w:val="en-US"/>
+        </w:rPr>
+      </w:pPr>
+      <w:r>
+        <w:rPr>
+          <w:sz w:val="24"/>
+          <w:szCs w:val="24"/>
+          <w:lang w:val="en-US"/>
+        </w:rPr>
+        <w:t xml:space="preserve">Open </w:t>
+      </w:r>
+      <w:hyperlink r:id="rId27" w:history="1">
+        <w:r>
+          <w:rPr>
+            <w:rStyle w:val="Hyperlink"/>
+            <w:sz w:val="24"/>
+            <w:szCs w:val="24"/>
+            <w:lang w:val="en-US"/>
+          </w:rPr>
+          <w:t>https://www.selenium.dev/</w:t>
+        </w:r>
+      </w:hyperlink>
+    </w:p>
+    <w:p>
+      <w:pPr>
+        <w:pStyle w:val="ListParagraph"/>
+        <w:numPr>
+          <w:ilvl w:val="4"/>
+          <w:numId w:val="2"/>
+        </w:numPr>
+        <w:ind w:left="1134"/>
+        <w:rPr>
+          <w:sz w:val="24"/>
+          <w:szCs w:val="24"/>
+          <w:lang w:val="en-US"/>
+        </w:rPr>
+      </w:pPr>
+      <w:r>
+        <w:rPr>
+          <w:sz w:val="24"/>
+          <w:szCs w:val="24"/>
+          <w:lang w:val="en-US"/>
+        </w:rPr>
+        <w:t>Print title</w:t>
+      </w:r>
+    </w:p>
+    <w:p>
+      <w:pPr>
+        <w:pStyle w:val="ListParagraph"/>
+        <w:numPr>
+          <w:ilvl w:val="4"/>
+          <w:numId w:val="2"/>
+        </w:numPr>
+        <w:ind w:left="1134"/>
+        <w:rPr>
+          <w:b/>
+          <w:bCs/>
+          <w:sz w:val="24"/>
+          <w:szCs w:val="24"/>
+          <w:lang w:val="en-US"/>
+        </w:rPr>
+      </w:pPr>
+      <w:r>
+        <w:rPr>
+          <w:b/>
+          <w:bCs/>
+          <w:sz w:val="24"/>
+          <w:szCs w:val="24"/>
+          <w:lang w:val="en-US"/>
+        </w:rPr>
+        <w:t xml:space="preserve">Click on </w:t>
+      </w:r>
+      <w:r>
+        <w:rPr>
+          <w:b/>
+          <w:bCs/>
+          <w:sz w:val="24"/>
+          <w:szCs w:val="24"/>
+          <w:lang w:val="en-US"/>
+        </w:rPr>
+        <w:t>Projects</w:t>
+      </w:r>
+      <w:r>
+        <w:rPr>
+          <w:b/>
+          <w:bCs/>
+          <w:sz w:val="24"/>
+          <w:szCs w:val="24"/>
+          <w:lang w:val="en-US"/>
+        </w:rPr>
+        <w:t xml:space="preserve"> link</w:t>
+      </w:r>
+    </w:p>
+    <w:p>
+      <w:pPr>
+        <w:pStyle w:val="ListParagraph"/>
+        <w:numPr>
+          <w:ilvl w:val="4"/>
+          <w:numId w:val="2"/>
+        </w:numPr>
+        <w:ind w:left="1134"/>
+        <w:rPr>
+          <w:sz w:val="24"/>
+          <w:szCs w:val="24"/>
+          <w:lang w:val="en-US"/>
+        </w:rPr>
+      </w:pPr>
+      <w:r>
+        <w:rPr>
+          <w:sz w:val="24"/>
+          <w:szCs w:val="24"/>
+          <w:lang w:val="en-US"/>
+        </w:rPr>
+        <w:t>Print title</w:t>
+      </w:r>
+      <w:r>
+        <w:rPr>
+          <w:sz w:val="24"/>
+          <w:szCs w:val="24"/>
+          <w:lang w:val="en-US"/>
+        </w:rPr>
+        <w:br/>
+      </w:r>
+    </w:p>
+    <w:p>
+      <w:pPr>
+        <w:pStyle w:val="ListParagraph"/>
+        <w:numPr>
+          <w:ilvl w:val="4"/>
+          <w:numId w:val="2"/>
+        </w:numPr>
+        <w:ind w:left="1134"/>
+        <w:rPr>
+          <w:sz w:val="24"/>
+          <w:szCs w:val="24"/>
+          <w:lang w:val="en-US"/>
+        </w:rPr>
+      </w:pPr>
+      <w:r>
+        <w:rPr>
+          <w:sz w:val="24"/>
+          <w:szCs w:val="24"/>
+          <w:lang w:val="en-US"/>
+        </w:rPr>
+        <w:t xml:space="preserve">Open </w:t>
+      </w:r>
+      <w:hyperlink r:id="rId28" w:history="1">
+        <w:r>
+          <w:rPr>
+            <w:rStyle w:val="Hyperlink"/>
+            <w:sz w:val="24"/>
+            <w:szCs w:val="24"/>
+            <w:lang w:val="en-US"/>
+          </w:rPr>
+          <w:t>https://www.selenium.dev/</w:t>
+        </w:r>
+      </w:hyperlink>
+    </w:p>
+    <w:p>
+      <w:pPr>
+        <w:pStyle w:val="ListParagraph"/>
+        <w:numPr>
+          <w:ilvl w:val="4"/>
+          <w:numId w:val="2"/>
+        </w:numPr>
+        <w:ind w:left="1134"/>
+        <w:rPr>
+          <w:sz w:val="24"/>
+          <w:szCs w:val="24"/>
+          <w:lang w:val="en-US"/>
+        </w:rPr>
+      </w:pPr>
+      <w:r>
+        <w:rPr>
+          <w:sz w:val="24"/>
+          <w:szCs w:val="24"/>
+          <w:lang w:val="en-US"/>
+        </w:rPr>
+        <w:t>Print title</w:t>
+      </w:r>
+    </w:p>
+    <w:p>
+      <w:pPr>
+        <w:pStyle w:val="ListParagraph"/>
+        <w:numPr>
+          <w:ilvl w:val="4"/>
+          <w:numId w:val="2"/>
+        </w:numPr>
+        <w:ind w:left="1134"/>
+        <w:rPr>
+          <w:b/>
+          <w:bCs/>
+          <w:sz w:val="24"/>
+          <w:szCs w:val="24"/>
+          <w:lang w:val="en-US"/>
+        </w:rPr>
+      </w:pPr>
+      <w:r>
+        <w:rPr>
+          <w:b/>
+          <w:bCs/>
+          <w:sz w:val="24"/>
+          <w:szCs w:val="24"/>
+          <w:lang w:val="en-US"/>
+        </w:rPr>
+        <w:t xml:space="preserve">Click on </w:t>
+      </w:r>
+      <w:r>
+        <w:rPr>
+          <w:b/>
+          <w:bCs/>
+          <w:sz w:val="24"/>
+          <w:szCs w:val="24"/>
+          <w:lang w:val="en-US"/>
+        </w:rPr>
+        <w:t>Support</w:t>
+      </w:r>
+      <w:r>
+        <w:rPr>
+          <w:b/>
+          <w:bCs/>
+          <w:sz w:val="24"/>
+          <w:szCs w:val="24"/>
+          <w:lang w:val="en-US"/>
+        </w:rPr>
+        <w:t xml:space="preserve"> link</w:t>
+      </w:r>
+    </w:p>
+    <w:p>
+      <w:pPr>
+        <w:pStyle w:val="ListParagraph"/>
+        <w:numPr>
+          <w:ilvl w:val="4"/>
+          <w:numId w:val="2"/>
+        </w:numPr>
+        <w:ind w:left="1134"/>
+        <w:rPr>
+          <w:sz w:val="24"/>
+          <w:szCs w:val="24"/>
+          <w:lang w:val="en-US"/>
+        </w:rPr>
+      </w:pPr>
+      <w:r>
+        <w:rPr>
+          <w:sz w:val="24"/>
+          <w:szCs w:val="24"/>
+          <w:lang w:val="en-US"/>
+        </w:rPr>
+        <w:t>Print title</w:t>
+      </w:r>
       <w:bookmarkStart w:id="0" w:name="_GoBack"/>
       <w:bookmarkEnd w:id="0"/>
     </w:p>
@@ -4258,7 +4832,7 @@
         <w:ind w:left="2880" w:hanging="360"/>
       </w:pPr>
     </w:lvl>
-    <w:lvl w:ilvl="4" w:tplc="40090019" w:tentative="1">
+    <w:lvl w:ilvl="4" w:tplc="40090019">
       <w:start w:val="1"/>
       <w:numFmt w:val="lowerLetter"/>
       <w:lvlText w:val="%5."/>

</xml_diff>

<commit_message>
Date: 29 Mar 2026
</commit_message>
<xml_diff>
--- a/Assignments.docx
+++ b/Assignments.docx
@@ -4140,8 +4140,11 @@
           <w:numId w:val="3"/>
         </w:numPr>
         <w:rPr>
-          <w:sz w:val="24"/>
-          <w:szCs w:val="24"/>
+          <w:rStyle w:val="Hyperlink"/>
+          <w:color w:val="auto"/>
+          <w:sz w:val="24"/>
+          <w:szCs w:val="24"/>
+          <w:u w:val="none"/>
           <w:lang w:val="en-US"/>
         </w:rPr>
       </w:pPr>
@@ -4189,98 +4192,23 @@
     </w:p>
     <w:p>
       <w:pPr>
-        <w:rPr>
-          <w:sz w:val="24"/>
-          <w:szCs w:val="24"/>
-          <w:lang w:val="en-US"/>
-        </w:rPr>
-      </w:pPr>
-    </w:p>
-    <w:p>
-      <w:pPr>
-        <w:rPr>
-          <w:sz w:val="24"/>
-          <w:szCs w:val="24"/>
-          <w:lang w:val="en-US"/>
-        </w:rPr>
-      </w:pPr>
-    </w:p>
-    <w:p>
-      <w:pPr>
-        <w:rPr>
-          <w:sz w:val="24"/>
-          <w:szCs w:val="24"/>
-          <w:lang w:val="en-US"/>
-        </w:rPr>
-      </w:pPr>
-      <w:r>
-        <w:rPr>
-          <w:sz w:val="24"/>
-          <w:szCs w:val="24"/>
-          <w:lang w:val="en-US"/>
-        </w:rPr>
-        <w:br w:type="page"/>
-      </w:r>
-    </w:p>
-    <w:p>
-      <w:pPr>
-        <w:rPr>
-          <w:sz w:val="24"/>
-          <w:szCs w:val="24"/>
-          <w:lang w:val="en-US"/>
-        </w:rPr>
-      </w:pPr>
-      <w:r>
-        <w:rPr>
-          <w:sz w:val="24"/>
-          <w:szCs w:val="24"/>
-          <w:lang w:val="en-US"/>
-        </w:rPr>
-        <w:lastRenderedPageBreak/>
-        <w:t>TestNG Assignment</w:t>
-      </w:r>
-    </w:p>
-    <w:p>
-      <w:pPr>
-        <w:pStyle w:val="ListParagraph"/>
-        <w:numPr>
-          <w:ilvl w:val="3"/>
-          <w:numId w:val="2"/>
-        </w:numPr>
-        <w:ind w:left="426"/>
-        <w:rPr>
-          <w:sz w:val="24"/>
-          <w:szCs w:val="24"/>
-          <w:lang w:val="en-US"/>
-        </w:rPr>
-      </w:pPr>
-      <w:r>
-        <w:rPr>
-          <w:sz w:val="24"/>
-          <w:szCs w:val="24"/>
-          <w:lang w:val="en-US"/>
-        </w:rPr>
-        <w:t>Selenium Site Assignment</w:t>
-      </w:r>
-    </w:p>
-    <w:p>
-      <w:pPr>
-        <w:pStyle w:val="ListParagraph"/>
-        <w:numPr>
-          <w:ilvl w:val="4"/>
-          <w:numId w:val="2"/>
-        </w:numPr>
-        <w:ind w:left="1134"/>
-        <w:rPr>
-          <w:sz w:val="24"/>
-          <w:szCs w:val="24"/>
-          <w:lang w:val="en-US"/>
-        </w:rPr>
-      </w:pPr>
-      <w:r>
-        <w:rPr>
-          <w:sz w:val="24"/>
-          <w:szCs w:val="24"/>
+        <w:pStyle w:val="ListParagraph"/>
+        <w:numPr>
+          <w:ilvl w:val="0"/>
+          <w:numId w:val="3"/>
+        </w:numPr>
+        <w:rPr>
+          <w:sz w:val="24"/>
+          <w:szCs w:val="24"/>
+          <w:highlight w:val="yellow"/>
+          <w:lang w:val="en-US"/>
+        </w:rPr>
+      </w:pPr>
+      <w:r>
+        <w:rPr>
+          <w:sz w:val="24"/>
+          <w:szCs w:val="24"/>
+          <w:highlight w:val="yellow"/>
           <w:lang w:val="en-US"/>
         </w:rPr>
         <w:t xml:space="preserve">Open </w:t>
@@ -4291,9 +4219,10 @@
             <w:rStyle w:val="Hyperlink"/>
             <w:sz w:val="24"/>
             <w:szCs w:val="24"/>
+            <w:highlight w:val="yellow"/>
             <w:lang w:val="en-US"/>
           </w:rPr>
-          <w:t>https://www.selenium.dev/</w:t>
+          <w:t>https://opensource-demo.orangehrmlive.com/web/index.php/auth/login</w:t>
         </w:r>
       </w:hyperlink>
     </w:p>
@@ -4301,81 +4230,665 @@
       <w:pPr>
         <w:pStyle w:val="ListParagraph"/>
         <w:numPr>
-          <w:ilvl w:val="4"/>
+          <w:ilvl w:val="1"/>
+          <w:numId w:val="5"/>
+        </w:numPr>
+        <w:spacing w:line="254" w:lineRule="auto"/>
+        <w:rPr>
+          <w:sz w:val="24"/>
+          <w:szCs w:val="24"/>
+          <w:highlight w:val="yellow"/>
+          <w:lang w:val="en-US"/>
+        </w:rPr>
+      </w:pPr>
+      <w:r>
+        <w:rPr>
+          <w:sz w:val="24"/>
+          <w:szCs w:val="24"/>
+          <w:highlight w:val="yellow"/>
+          <w:lang w:val="en-US"/>
+        </w:rPr>
+        <w:t>Login with Admin (admin, admin123)</w:t>
+      </w:r>
+    </w:p>
+    <w:p>
+      <w:pPr>
+        <w:pStyle w:val="ListParagraph"/>
+        <w:numPr>
+          <w:ilvl w:val="1"/>
+          <w:numId w:val="5"/>
+        </w:numPr>
+        <w:spacing w:line="254" w:lineRule="auto"/>
+        <w:rPr>
+          <w:sz w:val="24"/>
+          <w:szCs w:val="24"/>
+          <w:highlight w:val="yellow"/>
+          <w:lang w:val="en-US"/>
+        </w:rPr>
+      </w:pPr>
+      <w:r>
+        <w:rPr>
+          <w:sz w:val="24"/>
+          <w:szCs w:val="24"/>
+          <w:highlight w:val="yellow"/>
+          <w:lang w:val="en-US"/>
+        </w:rPr>
+        <w:t>Click on PIM</w:t>
+      </w:r>
+    </w:p>
+    <w:p>
+      <w:pPr>
+        <w:pStyle w:val="ListParagraph"/>
+        <w:numPr>
+          <w:ilvl w:val="1"/>
+          <w:numId w:val="5"/>
+        </w:numPr>
+        <w:spacing w:line="254" w:lineRule="auto"/>
+        <w:rPr>
+          <w:sz w:val="24"/>
+          <w:szCs w:val="24"/>
+          <w:highlight w:val="yellow"/>
+          <w:lang w:val="en-US"/>
+        </w:rPr>
+      </w:pPr>
+      <w:r>
+        <w:rPr>
+          <w:sz w:val="24"/>
+          <w:szCs w:val="24"/>
+          <w:highlight w:val="yellow"/>
+          <w:lang w:val="en-US"/>
+        </w:rPr>
+        <w:t>Click on + Add button</w:t>
+      </w:r>
+    </w:p>
+    <w:p>
+      <w:pPr>
+        <w:pStyle w:val="ListParagraph"/>
+        <w:numPr>
+          <w:ilvl w:val="1"/>
+          <w:numId w:val="5"/>
+        </w:numPr>
+        <w:spacing w:line="254" w:lineRule="auto"/>
+        <w:rPr>
+          <w:sz w:val="24"/>
+          <w:szCs w:val="24"/>
+          <w:highlight w:val="yellow"/>
+          <w:lang w:val="en-US"/>
+        </w:rPr>
+      </w:pPr>
+      <w:r>
+        <w:rPr>
+          <w:sz w:val="24"/>
+          <w:szCs w:val="24"/>
+          <w:highlight w:val="yellow"/>
+          <w:lang w:val="en-US"/>
+        </w:rPr>
+        <w:t>Enter First Name</w:t>
+      </w:r>
+    </w:p>
+    <w:p>
+      <w:pPr>
+        <w:pStyle w:val="ListParagraph"/>
+        <w:numPr>
+          <w:ilvl w:val="1"/>
+          <w:numId w:val="5"/>
+        </w:numPr>
+        <w:spacing w:line="254" w:lineRule="auto"/>
+        <w:rPr>
+          <w:sz w:val="24"/>
+          <w:szCs w:val="24"/>
+          <w:highlight w:val="yellow"/>
+          <w:lang w:val="en-US"/>
+        </w:rPr>
+      </w:pPr>
+      <w:r>
+        <w:rPr>
+          <w:sz w:val="24"/>
+          <w:szCs w:val="24"/>
+          <w:highlight w:val="yellow"/>
+          <w:lang w:val="en-US"/>
+        </w:rPr>
+        <w:t>Enter Middle Name</w:t>
+      </w:r>
+    </w:p>
+    <w:p>
+      <w:pPr>
+        <w:pStyle w:val="ListParagraph"/>
+        <w:numPr>
+          <w:ilvl w:val="1"/>
+          <w:numId w:val="5"/>
+        </w:numPr>
+        <w:spacing w:line="254" w:lineRule="auto"/>
+        <w:rPr>
+          <w:sz w:val="24"/>
+          <w:szCs w:val="24"/>
+          <w:highlight w:val="yellow"/>
+          <w:lang w:val="en-US"/>
+        </w:rPr>
+      </w:pPr>
+      <w:r>
+        <w:rPr>
+          <w:sz w:val="24"/>
+          <w:szCs w:val="24"/>
+          <w:highlight w:val="yellow"/>
+          <w:lang w:val="en-US"/>
+        </w:rPr>
+        <w:t>Enter Last Name</w:t>
+      </w:r>
+    </w:p>
+    <w:p>
+      <w:pPr>
+        <w:pStyle w:val="ListParagraph"/>
+        <w:numPr>
+          <w:ilvl w:val="1"/>
+          <w:numId w:val="5"/>
+        </w:numPr>
+        <w:spacing w:line="254" w:lineRule="auto"/>
+        <w:rPr>
+          <w:sz w:val="24"/>
+          <w:szCs w:val="24"/>
+          <w:highlight w:val="yellow"/>
+          <w:lang w:val="en-US"/>
+        </w:rPr>
+      </w:pPr>
+      <w:r>
+        <w:rPr>
+          <w:sz w:val="24"/>
+          <w:szCs w:val="24"/>
+          <w:highlight w:val="yellow"/>
+          <w:lang w:val="en-US"/>
+        </w:rPr>
+        <w:t>Click on Create Login Details</w:t>
+      </w:r>
+    </w:p>
+    <w:p>
+      <w:pPr>
+        <w:pStyle w:val="ListParagraph"/>
+        <w:numPr>
+          <w:ilvl w:val="1"/>
+          <w:numId w:val="5"/>
+        </w:numPr>
+        <w:spacing w:line="254" w:lineRule="auto"/>
+        <w:rPr>
+          <w:sz w:val="24"/>
+          <w:szCs w:val="24"/>
+          <w:highlight w:val="yellow"/>
+          <w:lang w:val="en-US"/>
+        </w:rPr>
+      </w:pPr>
+      <w:r>
+        <w:rPr>
+          <w:sz w:val="24"/>
+          <w:szCs w:val="24"/>
+          <w:highlight w:val="yellow"/>
+          <w:lang w:val="en-US"/>
+        </w:rPr>
+        <w:t>Enter User Name</w:t>
+      </w:r>
+    </w:p>
+    <w:p>
+      <w:pPr>
+        <w:pStyle w:val="ListParagraph"/>
+        <w:numPr>
+          <w:ilvl w:val="1"/>
+          <w:numId w:val="5"/>
+        </w:numPr>
+        <w:spacing w:line="254" w:lineRule="auto"/>
+        <w:rPr>
+          <w:sz w:val="24"/>
+          <w:szCs w:val="24"/>
+          <w:highlight w:val="yellow"/>
+          <w:lang w:val="en-US"/>
+        </w:rPr>
+      </w:pPr>
+      <w:r>
+        <w:rPr>
+          <w:sz w:val="24"/>
+          <w:szCs w:val="24"/>
+          <w:highlight w:val="yellow"/>
+          <w:lang w:val="en-US"/>
+        </w:rPr>
+        <w:t>Enter Password</w:t>
+      </w:r>
+    </w:p>
+    <w:p>
+      <w:pPr>
+        <w:pStyle w:val="ListParagraph"/>
+        <w:numPr>
+          <w:ilvl w:val="1"/>
+          <w:numId w:val="5"/>
+        </w:numPr>
+        <w:spacing w:line="254" w:lineRule="auto"/>
+        <w:rPr>
+          <w:sz w:val="24"/>
+          <w:szCs w:val="24"/>
+          <w:highlight w:val="yellow"/>
+          <w:lang w:val="en-US"/>
+        </w:rPr>
+      </w:pPr>
+      <w:r>
+        <w:rPr>
+          <w:sz w:val="24"/>
+          <w:szCs w:val="24"/>
+          <w:highlight w:val="yellow"/>
+          <w:lang w:val="en-US"/>
+        </w:rPr>
+        <w:t>Enter Confirm Password</w:t>
+      </w:r>
+    </w:p>
+    <w:p>
+      <w:pPr>
+        <w:pStyle w:val="ListParagraph"/>
+        <w:numPr>
+          <w:ilvl w:val="1"/>
+          <w:numId w:val="5"/>
+        </w:numPr>
+        <w:spacing w:line="254" w:lineRule="auto"/>
+        <w:rPr>
+          <w:sz w:val="24"/>
+          <w:szCs w:val="24"/>
+          <w:highlight w:val="yellow"/>
+          <w:lang w:val="en-US"/>
+        </w:rPr>
+      </w:pPr>
+      <w:r>
+        <w:rPr>
+          <w:sz w:val="24"/>
+          <w:szCs w:val="24"/>
+          <w:highlight w:val="yellow"/>
+          <w:lang w:val="en-US"/>
+        </w:rPr>
+        <w:t>Click on Save Button</w:t>
+      </w:r>
+    </w:p>
+    <w:p>
+      <w:pPr>
+        <w:pStyle w:val="ListParagraph"/>
+        <w:numPr>
+          <w:ilvl w:val="1"/>
+          <w:numId w:val="5"/>
+        </w:numPr>
+        <w:spacing w:line="254" w:lineRule="auto"/>
+        <w:rPr>
+          <w:sz w:val="24"/>
+          <w:szCs w:val="24"/>
+          <w:highlight w:val="yellow"/>
+          <w:lang w:val="en-US"/>
+        </w:rPr>
+      </w:pPr>
+      <w:r>
+        <w:rPr>
+          <w:sz w:val="24"/>
+          <w:szCs w:val="24"/>
+          <w:highlight w:val="yellow"/>
+          <w:lang w:val="en-US"/>
+        </w:rPr>
+        <w:t>Logout</w:t>
+      </w:r>
+    </w:p>
+    <w:p>
+      <w:pPr>
+        <w:pStyle w:val="ListParagraph"/>
+        <w:numPr>
+          <w:ilvl w:val="1"/>
+          <w:numId w:val="5"/>
+        </w:numPr>
+        <w:spacing w:line="254" w:lineRule="auto"/>
+        <w:rPr>
+          <w:sz w:val="24"/>
+          <w:szCs w:val="24"/>
+          <w:highlight w:val="yellow"/>
+          <w:lang w:val="en-US"/>
+        </w:rPr>
+      </w:pPr>
+      <w:r>
+        <w:rPr>
+          <w:sz w:val="24"/>
+          <w:szCs w:val="24"/>
+          <w:highlight w:val="yellow"/>
+          <w:lang w:val="en-US"/>
+        </w:rPr>
+        <w:t xml:space="preserve">Login using data provided in step no h &amp; </w:t>
+      </w:r>
+      <w:proofErr w:type="spellStart"/>
+      <w:r>
+        <w:rPr>
+          <w:sz w:val="24"/>
+          <w:szCs w:val="24"/>
+          <w:highlight w:val="yellow"/>
+          <w:lang w:val="en-US"/>
+        </w:rPr>
+        <w:t>i</w:t>
+      </w:r>
+      <w:proofErr w:type="spellEnd"/>
+    </w:p>
+    <w:p>
+      <w:pPr>
+        <w:pStyle w:val="ListParagraph"/>
+        <w:numPr>
+          <w:ilvl w:val="1"/>
+          <w:numId w:val="5"/>
+        </w:numPr>
+        <w:spacing w:line="254" w:lineRule="auto"/>
+        <w:rPr>
+          <w:sz w:val="24"/>
+          <w:szCs w:val="24"/>
+          <w:highlight w:val="yellow"/>
+          <w:lang w:val="en-US"/>
+        </w:rPr>
+      </w:pPr>
+      <w:r>
+        <w:rPr>
+          <w:sz w:val="24"/>
+          <w:szCs w:val="24"/>
+          <w:highlight w:val="yellow"/>
+          <w:lang w:val="en-US"/>
+        </w:rPr>
+        <w:lastRenderedPageBreak/>
+        <w:t>Display name of employee on logout link</w:t>
+      </w:r>
+    </w:p>
+    <w:p>
+      <w:pPr>
+        <w:pStyle w:val="ListParagraph"/>
+        <w:numPr>
+          <w:ilvl w:val="1"/>
+          <w:numId w:val="5"/>
+        </w:numPr>
+        <w:spacing w:line="254" w:lineRule="auto"/>
+        <w:rPr>
+          <w:sz w:val="24"/>
+          <w:szCs w:val="24"/>
+          <w:highlight w:val="yellow"/>
+          <w:lang w:val="en-US"/>
+        </w:rPr>
+      </w:pPr>
+      <w:r>
+        <w:rPr>
+          <w:sz w:val="24"/>
+          <w:szCs w:val="24"/>
+          <w:highlight w:val="yellow"/>
+          <w:lang w:val="en-US"/>
+        </w:rPr>
+        <w:t>Click on My Info</w:t>
+      </w:r>
+    </w:p>
+    <w:p>
+      <w:pPr>
+        <w:pStyle w:val="ListParagraph"/>
+        <w:numPr>
+          <w:ilvl w:val="1"/>
+          <w:numId w:val="5"/>
+        </w:numPr>
+        <w:spacing w:line="254" w:lineRule="auto"/>
+        <w:rPr>
+          <w:sz w:val="24"/>
+          <w:szCs w:val="24"/>
+          <w:highlight w:val="yellow"/>
+          <w:lang w:val="en-US"/>
+        </w:rPr>
+      </w:pPr>
+      <w:r>
+        <w:rPr>
+          <w:sz w:val="24"/>
+          <w:szCs w:val="24"/>
+          <w:highlight w:val="yellow"/>
+          <w:lang w:val="en-US"/>
+        </w:rPr>
+        <w:t>Display the Employee ID</w:t>
+      </w:r>
+    </w:p>
+    <w:p>
+      <w:pPr>
+        <w:pStyle w:val="ListParagraph"/>
+        <w:numPr>
+          <w:ilvl w:val="1"/>
+          <w:numId w:val="5"/>
+        </w:numPr>
+        <w:spacing w:line="254" w:lineRule="auto"/>
+        <w:rPr>
+          <w:sz w:val="24"/>
+          <w:szCs w:val="24"/>
+          <w:highlight w:val="yellow"/>
+          <w:lang w:val="en-US"/>
+        </w:rPr>
+      </w:pPr>
+      <w:r>
+        <w:rPr>
+          <w:sz w:val="24"/>
+          <w:szCs w:val="24"/>
+          <w:highlight w:val="yellow"/>
+          <w:lang w:val="en-US"/>
+        </w:rPr>
+        <w:t>Logout</w:t>
+      </w:r>
+    </w:p>
+    <w:p>
+      <w:pPr>
+        <w:pStyle w:val="ListParagraph"/>
+        <w:numPr>
+          <w:ilvl w:val="1"/>
+          <w:numId w:val="5"/>
+        </w:numPr>
+        <w:spacing w:line="254" w:lineRule="auto"/>
+        <w:rPr>
+          <w:sz w:val="24"/>
+          <w:szCs w:val="24"/>
+          <w:highlight w:val="yellow"/>
+          <w:lang w:val="en-US"/>
+        </w:rPr>
+      </w:pPr>
+      <w:r>
+        <w:rPr>
+          <w:sz w:val="24"/>
+          <w:szCs w:val="24"/>
+          <w:highlight w:val="yellow"/>
+          <w:lang w:val="en-US"/>
+        </w:rPr>
+        <w:t>Login with admin</w:t>
+      </w:r>
+    </w:p>
+    <w:p>
+      <w:pPr>
+        <w:pStyle w:val="ListParagraph"/>
+        <w:numPr>
+          <w:ilvl w:val="1"/>
+          <w:numId w:val="5"/>
+        </w:numPr>
+        <w:spacing w:line="254" w:lineRule="auto"/>
+        <w:rPr>
+          <w:sz w:val="24"/>
+          <w:szCs w:val="24"/>
+          <w:highlight w:val="yellow"/>
+          <w:lang w:val="en-US"/>
+        </w:rPr>
+      </w:pPr>
+      <w:r>
+        <w:rPr>
+          <w:sz w:val="24"/>
+          <w:szCs w:val="24"/>
+          <w:highlight w:val="yellow"/>
+          <w:lang w:val="en-US"/>
+        </w:rPr>
+        <w:t>Click on Admin</w:t>
+      </w:r>
+    </w:p>
+    <w:p>
+      <w:pPr>
+        <w:pStyle w:val="ListParagraph"/>
+        <w:numPr>
+          <w:ilvl w:val="1"/>
+          <w:numId w:val="5"/>
+        </w:numPr>
+        <w:spacing w:line="254" w:lineRule="auto"/>
+        <w:rPr>
+          <w:sz w:val="24"/>
+          <w:szCs w:val="24"/>
+          <w:highlight w:val="yellow"/>
+          <w:lang w:val="en-US"/>
+        </w:rPr>
+      </w:pPr>
+      <w:r>
+        <w:rPr>
+          <w:sz w:val="24"/>
+          <w:szCs w:val="24"/>
+          <w:highlight w:val="yellow"/>
+          <w:lang w:val="en-US"/>
+        </w:rPr>
+        <w:t>Enter user name</w:t>
+      </w:r>
+    </w:p>
+    <w:p>
+      <w:pPr>
+        <w:pStyle w:val="ListParagraph"/>
+        <w:numPr>
+          <w:ilvl w:val="1"/>
+          <w:numId w:val="5"/>
+        </w:numPr>
+        <w:spacing w:line="254" w:lineRule="auto"/>
+        <w:rPr>
+          <w:sz w:val="24"/>
+          <w:szCs w:val="24"/>
+          <w:highlight w:val="yellow"/>
+          <w:lang w:val="en-US"/>
+        </w:rPr>
+      </w:pPr>
+      <w:r>
+        <w:rPr>
+          <w:sz w:val="24"/>
+          <w:szCs w:val="24"/>
+          <w:highlight w:val="yellow"/>
+          <w:lang w:val="en-US"/>
+        </w:rPr>
+        <w:t xml:space="preserve">Click on Search </w:t>
+      </w:r>
+    </w:p>
+    <w:p>
+      <w:pPr>
+        <w:pStyle w:val="ListParagraph"/>
+        <w:numPr>
+          <w:ilvl w:val="1"/>
+          <w:numId w:val="5"/>
+        </w:numPr>
+        <w:spacing w:line="254" w:lineRule="auto"/>
+        <w:rPr>
+          <w:sz w:val="24"/>
+          <w:szCs w:val="24"/>
+          <w:highlight w:val="yellow"/>
+          <w:lang w:val="en-US"/>
+        </w:rPr>
+      </w:pPr>
+      <w:r>
+        <w:rPr>
+          <w:sz w:val="24"/>
+          <w:szCs w:val="24"/>
+          <w:highlight w:val="yellow"/>
+          <w:lang w:val="en-US"/>
+        </w:rPr>
+        <w:t>Delete the record displayed</w:t>
+      </w:r>
+    </w:p>
+    <w:p>
+      <w:pPr>
+        <w:pStyle w:val="ListParagraph"/>
+        <w:numPr>
+          <w:ilvl w:val="1"/>
+          <w:numId w:val="5"/>
+        </w:numPr>
+        <w:spacing w:line="254" w:lineRule="auto"/>
+        <w:rPr>
+          <w:sz w:val="24"/>
+          <w:szCs w:val="24"/>
+          <w:highlight w:val="yellow"/>
+          <w:lang w:val="en-US"/>
+        </w:rPr>
+      </w:pPr>
+      <w:r>
+        <w:rPr>
+          <w:sz w:val="24"/>
+          <w:szCs w:val="24"/>
+          <w:highlight w:val="yellow"/>
+          <w:lang w:val="en-US"/>
+        </w:rPr>
+        <w:t>Logout</w:t>
+      </w:r>
+      <w:r>
+        <w:rPr>
+          <w:sz w:val="24"/>
+          <w:szCs w:val="24"/>
+          <w:highlight w:val="yellow"/>
+          <w:lang w:val="en-US"/>
+        </w:rPr>
+        <w:tab/>
+      </w:r>
+      <w:bookmarkStart w:id="0" w:name="_GoBack"/>
+      <w:bookmarkEnd w:id="0"/>
+    </w:p>
+    <w:p>
+      <w:pPr>
+        <w:rPr>
+          <w:sz w:val="24"/>
+          <w:szCs w:val="24"/>
+          <w:lang w:val="en-US"/>
+        </w:rPr>
+      </w:pPr>
+    </w:p>
+    <w:p>
+      <w:pPr>
+        <w:rPr>
+          <w:sz w:val="24"/>
+          <w:szCs w:val="24"/>
+          <w:lang w:val="en-US"/>
+        </w:rPr>
+      </w:pPr>
+      <w:r>
+        <w:rPr>
+          <w:sz w:val="24"/>
+          <w:szCs w:val="24"/>
+          <w:lang w:val="en-US"/>
+        </w:rPr>
+        <w:br w:type="page"/>
+      </w:r>
+    </w:p>
+    <w:p>
+      <w:pPr>
+        <w:rPr>
+          <w:sz w:val="24"/>
+          <w:szCs w:val="24"/>
+          <w:lang w:val="en-US"/>
+        </w:rPr>
+      </w:pPr>
+      <w:r>
+        <w:rPr>
+          <w:sz w:val="24"/>
+          <w:szCs w:val="24"/>
+          <w:lang w:val="en-US"/>
+        </w:rPr>
+        <w:lastRenderedPageBreak/>
+        <w:t>TestNG Assignment</w:t>
+      </w:r>
+    </w:p>
+    <w:p>
+      <w:pPr>
+        <w:pStyle w:val="ListParagraph"/>
+        <w:numPr>
+          <w:ilvl w:val="3"/>
           <w:numId w:val="2"/>
         </w:numPr>
-        <w:ind w:left="1134"/>
-        <w:rPr>
-          <w:sz w:val="24"/>
-          <w:szCs w:val="24"/>
-          <w:lang w:val="en-US"/>
-        </w:rPr>
-      </w:pPr>
-      <w:r>
-        <w:rPr>
-          <w:sz w:val="24"/>
-          <w:szCs w:val="24"/>
-          <w:lang w:val="en-US"/>
-        </w:rPr>
-        <w:t>Print title</w:t>
-      </w:r>
-    </w:p>
-    <w:p>
-      <w:pPr>
-        <w:pStyle w:val="ListParagraph"/>
-        <w:numPr>
-          <w:ilvl w:val="4"/>
-          <w:numId w:val="2"/>
-        </w:numPr>
-        <w:ind w:left="1134"/>
-        <w:rPr>
-          <w:b/>
-          <w:bCs/>
-          <w:sz w:val="24"/>
-          <w:szCs w:val="24"/>
-          <w:lang w:val="en-US"/>
-        </w:rPr>
-      </w:pPr>
-      <w:r>
-        <w:rPr>
-          <w:b/>
-          <w:bCs/>
-          <w:sz w:val="24"/>
-          <w:szCs w:val="24"/>
-          <w:lang w:val="en-US"/>
-        </w:rPr>
-        <w:t>Click on Downloads link</w:t>
-      </w:r>
-    </w:p>
-    <w:p>
-      <w:pPr>
-        <w:pStyle w:val="ListParagraph"/>
-        <w:numPr>
-          <w:ilvl w:val="4"/>
-          <w:numId w:val="2"/>
-        </w:numPr>
-        <w:ind w:left="1134"/>
-        <w:rPr>
-          <w:sz w:val="24"/>
-          <w:szCs w:val="24"/>
-          <w:lang w:val="en-US"/>
-        </w:rPr>
-      </w:pPr>
-      <w:r>
-        <w:rPr>
-          <w:sz w:val="24"/>
-          <w:szCs w:val="24"/>
-          <w:lang w:val="en-US"/>
-        </w:rPr>
-        <w:t>Print title</w:t>
-      </w:r>
-      <w:r>
-        <w:rPr>
-          <w:sz w:val="24"/>
-          <w:szCs w:val="24"/>
-          <w:lang w:val="en-US"/>
-        </w:rPr>
-        <w:br/>
+        <w:ind w:left="426"/>
+        <w:rPr>
+          <w:sz w:val="24"/>
+          <w:szCs w:val="24"/>
+          <w:lang w:val="en-US"/>
+        </w:rPr>
+      </w:pPr>
+      <w:r>
+        <w:rPr>
+          <w:sz w:val="24"/>
+          <w:szCs w:val="24"/>
+          <w:lang w:val="en-US"/>
+        </w:rPr>
+        <w:t>Selenium Site Assignment</w:t>
       </w:r>
     </w:p>
     <w:p>
@@ -4459,27 +4972,7 @@
           <w:szCs w:val="24"/>
           <w:lang w:val="en-US"/>
         </w:rPr>
-        <w:t xml:space="preserve">Click on </w:t>
-      </w:r>
-      <w:r>
-        <w:rPr>
-          <w:b/>
-          <w:bCs/>
-          <w:sz w:val="24"/>
-          <w:szCs w:val="24"/>
-          <w:lang w:val="en-US"/>
-        </w:rPr>
-        <w:t>Documentation</w:t>
-      </w:r>
-      <w:r>
-        <w:rPr>
-          <w:b/>
-          <w:bCs/>
-          <w:sz w:val="24"/>
-          <w:szCs w:val="24"/>
-          <w:lang w:val="en-US"/>
-        </w:rPr>
-        <w:t xml:space="preserve"> link</w:t>
+        <w:t>Click on Downloads link</w:t>
       </w:r>
     </w:p>
     <w:p>
@@ -4594,27 +5087,7 @@
           <w:szCs w:val="24"/>
           <w:lang w:val="en-US"/>
         </w:rPr>
-        <w:t xml:space="preserve">Click on </w:t>
-      </w:r>
-      <w:r>
-        <w:rPr>
-          <w:b/>
-          <w:bCs/>
-          <w:sz w:val="24"/>
-          <w:szCs w:val="24"/>
-          <w:lang w:val="en-US"/>
-        </w:rPr>
-        <w:t>Projects</w:t>
-      </w:r>
-      <w:r>
-        <w:rPr>
-          <w:b/>
-          <w:bCs/>
-          <w:sz w:val="24"/>
-          <w:szCs w:val="24"/>
-          <w:lang w:val="en-US"/>
-        </w:rPr>
-        <w:t xml:space="preserve"> link</w:t>
+        <w:t>Click on Documentation link</w:t>
       </w:r>
     </w:p>
     <w:p>
@@ -4729,9 +5202,105 @@
           <w:szCs w:val="24"/>
           <w:lang w:val="en-US"/>
         </w:rPr>
-        <w:t xml:space="preserve">Click on </w:t>
-      </w:r>
-      <w:r>
+        <w:t>Click on Projects link</w:t>
+      </w:r>
+    </w:p>
+    <w:p>
+      <w:pPr>
+        <w:pStyle w:val="ListParagraph"/>
+        <w:numPr>
+          <w:ilvl w:val="4"/>
+          <w:numId w:val="2"/>
+        </w:numPr>
+        <w:ind w:left="1134"/>
+        <w:rPr>
+          <w:sz w:val="24"/>
+          <w:szCs w:val="24"/>
+          <w:lang w:val="en-US"/>
+        </w:rPr>
+      </w:pPr>
+      <w:r>
+        <w:rPr>
+          <w:sz w:val="24"/>
+          <w:szCs w:val="24"/>
+          <w:lang w:val="en-US"/>
+        </w:rPr>
+        <w:t>Print title</w:t>
+      </w:r>
+      <w:r>
+        <w:rPr>
+          <w:sz w:val="24"/>
+          <w:szCs w:val="24"/>
+          <w:lang w:val="en-US"/>
+        </w:rPr>
+        <w:br/>
+      </w:r>
+    </w:p>
+    <w:p>
+      <w:pPr>
+        <w:pStyle w:val="ListParagraph"/>
+        <w:numPr>
+          <w:ilvl w:val="4"/>
+          <w:numId w:val="2"/>
+        </w:numPr>
+        <w:ind w:left="1134"/>
+        <w:rPr>
+          <w:sz w:val="24"/>
+          <w:szCs w:val="24"/>
+          <w:lang w:val="en-US"/>
+        </w:rPr>
+      </w:pPr>
+      <w:r>
+        <w:rPr>
+          <w:sz w:val="24"/>
+          <w:szCs w:val="24"/>
+          <w:lang w:val="en-US"/>
+        </w:rPr>
+        <w:t xml:space="preserve">Open </w:t>
+      </w:r>
+      <w:hyperlink r:id="rId29" w:history="1">
+        <w:r>
+          <w:rPr>
+            <w:rStyle w:val="Hyperlink"/>
+            <w:sz w:val="24"/>
+            <w:szCs w:val="24"/>
+            <w:lang w:val="en-US"/>
+          </w:rPr>
+          <w:t>https://www.selenium.dev/</w:t>
+        </w:r>
+      </w:hyperlink>
+    </w:p>
+    <w:p>
+      <w:pPr>
+        <w:pStyle w:val="ListParagraph"/>
+        <w:numPr>
+          <w:ilvl w:val="4"/>
+          <w:numId w:val="2"/>
+        </w:numPr>
+        <w:ind w:left="1134"/>
+        <w:rPr>
+          <w:sz w:val="24"/>
+          <w:szCs w:val="24"/>
+          <w:lang w:val="en-US"/>
+        </w:rPr>
+      </w:pPr>
+      <w:r>
+        <w:rPr>
+          <w:sz w:val="24"/>
+          <w:szCs w:val="24"/>
+          <w:lang w:val="en-US"/>
+        </w:rPr>
+        <w:t>Print title</w:t>
+      </w:r>
+    </w:p>
+    <w:p>
+      <w:pPr>
+        <w:pStyle w:val="ListParagraph"/>
+        <w:numPr>
+          <w:ilvl w:val="4"/>
+          <w:numId w:val="2"/>
+        </w:numPr>
+        <w:ind w:left="1134"/>
         <w:rPr>
           <w:b/>
           <w:bCs/>
@@ -4739,8 +5308,7 @@
           <w:szCs w:val="24"/>
           <w:lang w:val="en-US"/>
         </w:rPr>
-        <w:t>Support</w:t>
-      </w:r>
+      </w:pPr>
       <w:r>
         <w:rPr>
           <w:b/>
@@ -4749,7 +5317,7 @@
           <w:szCs w:val="24"/>
           <w:lang w:val="en-US"/>
         </w:rPr>
-        <w:t xml:space="preserve"> link</w:t>
+        <w:t>Click on Support link</w:t>
       </w:r>
     </w:p>
     <w:p>
@@ -4774,8 +5342,6 @@
         </w:rPr>
         <w:t>Print title</w:t>
       </w:r>
-      <w:bookmarkStart w:id="0" w:name="_GoBack"/>
-      <w:bookmarkEnd w:id="0"/>
     </w:p>
     <w:sectPr>
       <w:pgSz w:w="11906" w:h="16838"/>

</xml_diff>